<commit_message>
Reformulación de la memoria para ej 2.1
</commit_message>
<xml_diff>
--- a/Memoria PL1.docx
+++ b/Memoria PL1.docx
@@ -1,6 +1,6 @@
 
 <file path=word/document.xml><?xml version="1.0" encoding="utf-8"?>
-<w:document xmlns:wpc="http://schemas.microsoft.com/office/word/2010/wordprocessingCanvas" xmlns:cx="http://schemas.microsoft.com/office/drawing/2014/chartex" xmlns:cx1="http://schemas.microsoft.com/office/drawing/2015/9/8/chartex" xmlns:cx2="http://schemas.microsoft.com/office/drawing/2015/10/21/chartex" xmlns:cx3="http://schemas.microsoft.com/office/drawing/2016/5/9/chartex" xmlns:cx4="http://schemas.microsoft.com/office/drawing/2016/5/10/chartex" xmlns:cx5="http://schemas.microsoft.com/office/drawing/2016/5/11/chartex" xmlns:cx6="http://schemas.microsoft.com/office/drawing/2016/5/12/chartex" xmlns:cx7="http://schemas.microsoft.com/office/drawing/2016/5/13/chartex" xmlns:cx8="http://schemas.microsoft.com/office/drawing/2016/5/14/chartex" xmlns:mc="http://schemas.openxmlformats.org/markup-compatibility/2006" xmlns:aink="http://schemas.microsoft.com/office/drawing/2016/ink" xmlns:am3d="http://schemas.microsoft.com/office/drawing/2017/model3d" xmlns:o="urn:schemas-microsoft-com:office:office" xmlns:oel="http://schemas.microsoft.com/office/2019/extlst" xmlns:r="http://schemas.openxmlformats.org/officeDocument/2006/relationships" xmlns:m="http://schemas.openxmlformats.org/officeDocument/2006/math" xmlns:v="urn:schemas-microsoft-com:vml" xmlns:wp14="http://schemas.microsoft.com/office/word/2010/wordprocessingDrawing" xmlns:wp="http://schemas.openxmlformats.org/drawingml/2006/wordprocessingDrawing" xmlns:w10="urn:schemas-microsoft-com:office:word" xmlns:w="http://schemas.openxmlformats.org/wordprocessingml/2006/main" xmlns:w14="http://schemas.microsoft.com/office/word/2010/wordml" xmlns:w15="http://schemas.microsoft.com/office/word/2012/wordml" xmlns:w16cex="http://schemas.microsoft.com/office/word/2018/wordml/cex" xmlns:w16cid="http://schemas.microsoft.com/office/word/2016/wordml/cid" xmlns:w16="http://schemas.microsoft.com/office/word/2018/wordml" xmlns:w16sdtdh="http://schemas.microsoft.com/office/word/2020/wordml/sdtdatahash" xmlns:w16se="http://schemas.microsoft.com/office/word/2015/wordml/symex" xmlns:wpg="http://schemas.microsoft.com/office/word/2010/wordprocessingGroup" xmlns:wpi="http://schemas.microsoft.com/office/word/2010/wordprocessingInk" xmlns:wne="http://schemas.microsoft.com/office/word/2006/wordml" xmlns:wps="http://schemas.microsoft.com/office/word/2010/wordprocessingShape" mc:Ignorable="w14 w15 w16se w16cid w16 w16cex w16sdtdh wp14">
+<w:document xmlns:wpc="http://schemas.microsoft.com/office/word/2010/wordprocessingCanvas" xmlns:cx="http://schemas.microsoft.com/office/drawing/2014/chartex" xmlns:cx1="http://schemas.microsoft.com/office/drawing/2015/9/8/chartex" xmlns:cx2="http://schemas.microsoft.com/office/drawing/2015/10/21/chartex" xmlns:cx3="http://schemas.microsoft.com/office/drawing/2016/5/9/chartex" xmlns:cx4="http://schemas.microsoft.com/office/drawing/2016/5/10/chartex" xmlns:cx5="http://schemas.microsoft.com/office/drawing/2016/5/11/chartex" xmlns:cx6="http://schemas.microsoft.com/office/drawing/2016/5/12/chartex" xmlns:cx7="http://schemas.microsoft.com/office/drawing/2016/5/13/chartex" xmlns:cx8="http://schemas.microsoft.com/office/drawing/2016/5/14/chartex" xmlns:mc="http://schemas.openxmlformats.org/markup-compatibility/2006" xmlns:aink="http://schemas.microsoft.com/office/drawing/2016/ink" xmlns:am3d="http://schemas.microsoft.com/office/drawing/2017/model3d" xmlns:o="urn:schemas-microsoft-com:office:office" xmlns:oel="http://schemas.microsoft.com/office/2019/extlst" xmlns:r="http://schemas.openxmlformats.org/officeDocument/2006/relationships" xmlns:m="http://schemas.openxmlformats.org/officeDocument/2006/math" xmlns:v="urn:schemas-microsoft-com:vml" xmlns:wp14="http://schemas.microsoft.com/office/word/2010/wordprocessingDrawing" xmlns:wp="http://schemas.openxmlformats.org/drawingml/2006/wordprocessingDrawing" xmlns:w10="urn:schemas-microsoft-com:office:word" xmlns:w="http://schemas.openxmlformats.org/wordprocessingml/2006/main" xmlns:w14="http://schemas.microsoft.com/office/word/2010/wordml" xmlns:w15="http://schemas.microsoft.com/office/word/2012/wordml" xmlns:w16cex="http://schemas.microsoft.com/office/word/2018/wordml/cex" xmlns:w16cid="http://schemas.microsoft.com/office/word/2016/wordml/cid" xmlns:w16="http://schemas.microsoft.com/office/word/2018/wordml" xmlns:w16du="http://schemas.microsoft.com/office/word/2023/wordml/word16du" xmlns:w16sdtdh="http://schemas.microsoft.com/office/word/2020/wordml/sdtdatahash" xmlns:w16sdtfl="http://schemas.microsoft.com/office/word/2024/wordml/sdtformatlock" xmlns:w16se="http://schemas.microsoft.com/office/word/2015/wordml/symex" xmlns:wpg="http://schemas.microsoft.com/office/word/2010/wordprocessingGroup" xmlns:wpi="http://schemas.microsoft.com/office/word/2010/wordprocessingInk" xmlns:wne="http://schemas.microsoft.com/office/word/2006/wordml" xmlns:wps="http://schemas.microsoft.com/office/word/2010/wordprocessingShape" mc:Ignorable="w14 w15 w16se w16cid w16 w16cex w16sdtdh w16sdtfl w16du wp14">
   <w:body>
     <w:p>
       <w:pPr>
@@ -1072,19 +1072,7 @@
         <w:rPr>
           <w:rFonts w:ascii="Cambria" w:hAnsi="Cambria"/>
         </w:rPr>
-        <w:t xml:space="preserve"> está en la ubicación ?l</w:t>
-      </w:r>
-      <w:r>
-        <w:rPr>
-          <w:rFonts w:ascii="Cambria" w:hAnsi="Cambria"/>
-        </w:rPr>
-        <w:t xml:space="preserve">; </w:t>
-      </w:r>
-      <w:r>
-        <w:rPr>
-          <w:rFonts w:ascii="Cambria" w:hAnsi="Cambria"/>
-        </w:rPr>
-        <w:t xml:space="preserve">La </w:t>
+        <w:t xml:space="preserve"> está en la ubicación ?l; La </w:t>
       </w:r>
       <w:r>
         <w:rPr>
@@ -5297,7 +5285,21 @@
         <w:rPr>
           <w:rFonts w:ascii="Cambria" w:hAnsi="Cambria"/>
         </w:rPr>
-        <w:t>En este apartado se ha evaluado el comportamiento de los algoritmos GBFS y EHC combinados con distintas heurísticas (hMAX, hADD, hFF y Landmark) sobre el mayor problema que GBFS era capaz de resolver en menos de un minuto (tamaño 8). Los resultados muestran diferencias muy significativas tanto en tiempo de ejecución como en la longitud de los planes generados. En general, se observa que la elección de la heurística tiene un impacto mucho mayor en el rendimiento que la elección del algoritmo de búsqueda, especialmente cuando se emplea una heurística poco informativa como hMAX.</w:t>
+        <w:t>En este apartado se ha evaluado el comportamiento de los algoritmos GBFS y EHC combinados con distintas heurísticas (hMAX, hADD, hFF y Landmark) sobre el mayor problema que GBFS era capaz de resolver en menos de un minuto (</w:t>
+      </w:r>
+      <w:r>
+        <w:rPr>
+          <w:rFonts w:ascii="Cambria" w:hAnsi="Cambria"/>
+          <w:b/>
+          <w:bCs/>
+        </w:rPr>
+        <w:t>tamaño 8</w:t>
+      </w:r>
+      <w:r>
+        <w:rPr>
+          <w:rFonts w:ascii="Cambria" w:hAnsi="Cambria"/>
+        </w:rPr>
+        <w:t>). Los resultados muestran diferencias muy significativas tanto en tiempo de ejecución como en la longitud de los planes generados. En general, se observa que la elección de la heurística tiene un impacto mucho mayor en el rendimiento que la elección del algoritmo de búsqueda, especialmente cuando se emplea una heurística poco informativa como hMAX.</w:t>
       </w:r>
     </w:p>
     <w:p>
@@ -5782,6 +5784,24 @@
           <w:rFonts w:ascii="Cambria" w:hAnsi="Cambria"/>
         </w:rPr>
         <w:t>las heurísticas admisibles son hMAX y lmcut.</w:t>
+      </w:r>
+      <w:r>
+        <w:rPr>
+          <w:rFonts w:ascii="Cambria" w:hAnsi="Cambria"/>
+        </w:rPr>
+        <w:t xml:space="preserve"> Y Recordamos que el tamaño de problema a utilizar es 5 (</w:t>
+      </w:r>
+      <w:r>
+        <w:rPr>
+          <w:rFonts w:ascii="Cambria" w:hAnsi="Cambria"/>
+        </w:rPr>
+        <w:t>mayor tamaño que puede resolver el algoritmo A* con heurística hMAX</w:t>
+      </w:r>
+      <w:r>
+        <w:rPr>
+          <w:rFonts w:ascii="Cambria" w:hAnsi="Cambria"/>
+        </w:rPr>
+        <w:t xml:space="preserve"> en un min)</w:t>
       </w:r>
     </w:p>
     <w:tbl>
@@ -6146,7 +6166,6 @@
         <w:rPr>
           <w:rFonts w:ascii="Cambria" w:hAnsi="Cambria"/>
         </w:rPr>
-        <w:lastRenderedPageBreak/>
         <w:t>Ahora</w:t>
       </w:r>
       <w:r>
@@ -6288,7 +6307,19 @@
         <w:rPr>
           <w:rFonts w:ascii="Cambria" w:hAnsi="Cambria"/>
         </w:rPr>
-        <w:t>En este ejercicio se ha modificado el dominio original del servicio de emergencias con el objetivo de eliminar el modelo basado en brazos del dron y sustituirlo por un sistema de transporte mediante transportadores (carriers). En la versión anterior, el dron disponía de dos brazos y el planificador debía considerar explícitamente qué caja estaba en cada brazo. Esta representación generaba un crecimiento innecesario del espacio de estados, ya que configuraciones equivalentes desde el punto de vista lógico eran tratadas como estados distintos. Por ejemplo, intercambiar las cajas entre los dos brazos producía estados diferentes aunque funcionalmente fueran equivalentes.</w:t>
+        <w:t xml:space="preserve">En este ejercicio se ha modificado el dominio original del servicio de emergencias con el objetivo de eliminar el modelo basado en brazos del dron y sustituirlo por un sistema de transporte mediante transportadores (carriers). En la versión anterior, el dron disponía de dos brazos y el planificador debía considerar explícitamente qué caja estaba en cada brazo. Esta representación generaba un crecimiento innecesario del espacio de estados, ya que configuraciones equivalentes desde el punto de vista lógico eran tratadas como estados distintos. Por ejemplo, intercambiar las cajas entre los dos brazos producía estados </w:t>
+      </w:r>
+      <w:r>
+        <w:rPr>
+          <w:rFonts w:ascii="Cambria" w:hAnsi="Cambria"/>
+        </w:rPr>
+        <w:t>diferentes,</w:t>
+      </w:r>
+      <w:r>
+        <w:rPr>
+          <w:rFonts w:ascii="Cambria" w:hAnsi="Cambria"/>
+        </w:rPr>
+        <w:t xml:space="preserve"> aunque funcionalmente fueran equivalentes.</w:t>
       </w:r>
     </w:p>
     <w:p>
@@ -6420,21 +6451,105 @@
       <w:r>
         <w:rPr>
           <w:rFonts w:ascii="Cambria" w:hAnsi="Cambria"/>
-        </w:rPr>
-        <w:t>Las acciones clásicas de movimiento (fly), recogida (pick-up) y entrega (deliver) se han adaptado para funcionar coherentemente con el nuevo modelo.</w:t>
-      </w:r>
-    </w:p>
-    <w:p>
-      <w:pPr>
-        <w:rPr>
-          <w:rFonts w:ascii="Cambria" w:hAnsi="Cambria"/>
-        </w:rPr>
-      </w:pPr>
-      <w:r>
-        <w:rPr>
-          <w:rFonts w:ascii="Cambria" w:hAnsi="Cambria"/>
+          <w:b/>
+          <w:bCs/>
+        </w:rPr>
+        <w:t>pick-up-carrier</w:t>
+      </w:r>
+      <w:r>
+        <w:rPr>
+          <w:rFonts w:ascii="Cambria" w:hAnsi="Cambria"/>
+          <w:b/>
+          <w:bCs/>
+        </w:rPr>
+        <w:t xml:space="preserve">, </w:t>
+      </w:r>
+      <w:r>
+        <w:rPr>
+          <w:rFonts w:ascii="Cambria" w:hAnsi="Cambria"/>
+        </w:rPr>
+        <w:t xml:space="preserve">acción para </w:t>
+      </w:r>
+      <w:r>
+        <w:rPr>
+          <w:rFonts w:ascii="Cambria" w:hAnsi="Cambria"/>
+        </w:rPr>
+        <w:t>recoger</w:t>
+      </w:r>
+      <w:r>
+        <w:rPr>
+          <w:rFonts w:ascii="Cambria" w:hAnsi="Cambria"/>
+        </w:rPr>
+        <w:t xml:space="preserve"> el Carrier.</w:t>
+      </w:r>
+    </w:p>
+    <w:p>
+      <w:pPr>
+        <w:numPr>
+          <w:ilvl w:val="0"/>
+          <w:numId w:val="18"/>
+        </w:numPr>
+        <w:rPr>
+          <w:rFonts w:ascii="Cambria" w:hAnsi="Cambria"/>
+        </w:rPr>
+      </w:pPr>
+      <w:r>
+        <w:rPr>
+          <w:rFonts w:ascii="Cambria" w:hAnsi="Cambria"/>
+          <w:b/>
+          <w:bCs/>
+        </w:rPr>
+        <w:t xml:space="preserve">drop-carrier, </w:t>
+      </w:r>
+      <w:r>
+        <w:rPr>
+          <w:rFonts w:ascii="Cambria" w:hAnsi="Cambria"/>
+          <w:bCs/>
+        </w:rPr>
+        <w:t xml:space="preserve"> acción para dejar el transportador.</w:t>
+      </w:r>
+    </w:p>
+    <w:p>
+      <w:pPr>
+        <w:numPr>
+          <w:ilvl w:val="0"/>
+          <w:numId w:val="18"/>
+        </w:numPr>
+        <w:rPr>
+          <w:rFonts w:ascii="Cambria" w:hAnsi="Cambria"/>
+        </w:rPr>
+      </w:pPr>
+      <w:r>
+        <w:rPr>
+          <w:rFonts w:ascii="Cambria" w:hAnsi="Cambria"/>
+          <w:b/>
         </w:rPr>
         <w:lastRenderedPageBreak/>
+        <w:t xml:space="preserve">Fly-and-move-carrier, </w:t>
+      </w:r>
+      <w:r>
+        <w:rPr>
+          <w:rFonts w:ascii="Cambria" w:hAnsi="Cambria"/>
+        </w:rPr>
+        <w:t>acción alternativa a fly para mover el transportador a la</w:t>
+      </w:r>
+      <w:r>
+        <w:rPr>
+          <w:rFonts w:ascii="Cambria" w:hAnsi="Cambria"/>
+        </w:rPr>
+        <w:t xml:space="preserve"> vez que vuela el robot entre localizaciones.</w:t>
+      </w:r>
+    </w:p>
+    <w:p>
+      <w:pPr>
+        <w:rPr>
+          <w:rFonts w:ascii="Cambria" w:hAnsi="Cambria"/>
+        </w:rPr>
+      </w:pPr>
+      <w:r>
+        <w:rPr>
+          <w:rFonts w:ascii="Cambria" w:hAnsi="Cambria"/>
+        </w:rPr>
         <w:t>Este nuevo diseño reduce significativamente la redundancia en el espacio de estados, ya que el orden interno de las cajas dentro del transportador no se considera relevante. En consecuencia, el modelo es más eficiente y escalable que el basado en múltiples brazos, cumpliendo el objetivo fundamental del ejercicio: permitir transportar hasta cuatro cajas simultáneamente sin incrementar artificialmente el espacio de búsqueda.</w:t>
       </w:r>
     </w:p>
@@ -6535,7 +6650,173 @@
         <w:rPr>
           <w:rFonts w:ascii="Cambria" w:hAnsi="Cambria"/>
         </w:rPr>
-        <w:t>El resto de la estructura del problema se mantiene coherente con la Parte 1. Las cajas y transportadores comienzan en el depósito, los contenidos de las cajas se asignan aleatoriamente respetando la viabilidad de los objetivos, y las personas se sitúan en localizaciones distintas del depósito. Finalmente, el objetivo exige que cada persona reciba los contenidos asignados y que el dron regrese al depósito.</w:t>
+        <w:t>El estado inicial se construye garantizando coherencia con el dominio. En particular:</w:t>
+      </w:r>
+    </w:p>
+    <w:p>
+      <w:pPr>
+        <w:pStyle w:val="Prrafodelista"/>
+        <w:numPr>
+          <w:ilvl w:val="0"/>
+          <w:numId w:val="19"/>
+        </w:numPr>
+        <w:rPr>
+          <w:rFonts w:ascii="Cambria" w:hAnsi="Cambria"/>
+        </w:rPr>
+      </w:pPr>
+      <w:r>
+        <w:rPr>
+          <w:rFonts w:ascii="Cambria" w:hAnsi="Cambria"/>
+        </w:rPr>
+        <w:t>Todos los drones comienzan en el depósito y en estado libre (drone-free).</w:t>
+      </w:r>
+    </w:p>
+    <w:p>
+      <w:pPr>
+        <w:pStyle w:val="Prrafodelista"/>
+        <w:numPr>
+          <w:ilvl w:val="0"/>
+          <w:numId w:val="19"/>
+        </w:numPr>
+        <w:rPr>
+          <w:rFonts w:ascii="Cambria" w:hAnsi="Cambria"/>
+        </w:rPr>
+      </w:pPr>
+      <w:r>
+        <w:rPr>
+          <w:rFonts w:ascii="Cambria" w:hAnsi="Cambria"/>
+        </w:rPr>
+        <w:t>Todos los transportadores comienzan en el depósito con carga inicial n0.</w:t>
+      </w:r>
+    </w:p>
+    <w:p>
+      <w:pPr>
+        <w:pStyle w:val="Prrafodelista"/>
+        <w:numPr>
+          <w:ilvl w:val="0"/>
+          <w:numId w:val="19"/>
+        </w:numPr>
+        <w:rPr>
+          <w:rFonts w:ascii="Cambria" w:hAnsi="Cambria"/>
+        </w:rPr>
+      </w:pPr>
+      <w:r>
+        <w:rPr>
+          <w:rFonts w:ascii="Cambria" w:hAnsi="Cambria"/>
+        </w:rPr>
+        <w:t>La capacidad máxima se fija mediante el predicado (carrier-capacity carrierX n4).</w:t>
+      </w:r>
+    </w:p>
+    <w:p>
+      <w:pPr>
+        <w:pStyle w:val="Prrafodelista"/>
+        <w:numPr>
+          <w:ilvl w:val="0"/>
+          <w:numId w:val="19"/>
+        </w:numPr>
+        <w:rPr>
+          <w:rFonts w:ascii="Cambria" w:hAnsi="Cambria"/>
+        </w:rPr>
+      </w:pPr>
+      <w:r>
+        <w:rPr>
+          <w:rFonts w:ascii="Cambria" w:hAnsi="Cambria"/>
+        </w:rPr>
+        <w:t>Se genera la cadena (siguiente n0 n1), (siguiente n1 n2), etc., que permite simular incrementos de carga.</w:t>
+      </w:r>
+    </w:p>
+    <w:p>
+      <w:pPr>
+        <w:pStyle w:val="Prrafodelista"/>
+        <w:numPr>
+          <w:ilvl w:val="0"/>
+          <w:numId w:val="19"/>
+        </w:numPr>
+        <w:rPr>
+          <w:rFonts w:ascii="Cambria" w:hAnsi="Cambria"/>
+        </w:rPr>
+      </w:pPr>
+      <w:r>
+        <w:rPr>
+          <w:rFonts w:ascii="Cambria" w:hAnsi="Cambria"/>
+        </w:rPr>
+        <w:t>Todas las cajas comienzan en el depósito.</w:t>
+      </w:r>
+    </w:p>
+    <w:p>
+      <w:pPr>
+        <w:pStyle w:val="Prrafodelista"/>
+        <w:numPr>
+          <w:ilvl w:val="0"/>
+          <w:numId w:val="19"/>
+        </w:numPr>
+        <w:rPr>
+          <w:rFonts w:ascii="Cambria" w:hAnsi="Cambria"/>
+        </w:rPr>
+      </w:pPr>
+      <w:r>
+        <w:rPr>
+          <w:rFonts w:ascii="Cambria" w:hAnsi="Cambria"/>
+        </w:rPr>
+        <w:t>Las personas se distribuyen aleatoriamente en localizaciones distintas del depósito.</w:t>
+      </w:r>
+    </w:p>
+    <w:p>
+      <w:pPr>
+        <w:pStyle w:val="Prrafodelista"/>
+        <w:numPr>
+          <w:ilvl w:val="0"/>
+          <w:numId w:val="19"/>
+        </w:numPr>
+        <w:rPr>
+          <w:rFonts w:ascii="Cambria" w:hAnsi="Cambria"/>
+        </w:rPr>
+      </w:pPr>
+      <w:r>
+        <w:rPr>
+          <w:rFonts w:ascii="Cambria" w:hAnsi="Cambria"/>
+        </w:rPr>
+        <w:t>El contenido de las cajas se asigna de forma aleatoria, asegurando que el número de objetivos solicitados sea alcanzable.</w:t>
+      </w:r>
+    </w:p>
+    <w:p>
+      <w:pPr>
+        <w:rPr>
+          <w:rFonts w:ascii="Cambria" w:hAnsi="Cambria"/>
+        </w:rPr>
+      </w:pPr>
+    </w:p>
+    <w:p>
+      <w:pPr>
+        <w:rPr>
+          <w:rFonts w:ascii="Cambria" w:hAnsi="Cambria"/>
+        </w:rPr>
+      </w:pPr>
+      <w:r>
+        <w:rPr>
+          <w:rFonts w:ascii="Cambria" w:hAnsi="Cambria"/>
+        </w:rPr>
+        <w:t xml:space="preserve">El generador mantiene la misma lógica de la Parte 1 para distribuir necesidades entre las personas, garantizando que no se generen instancias irresolubles. Asimismo, el objetivo </w:t>
+      </w:r>
+      <w:r>
+        <w:rPr>
+          <w:rFonts w:ascii="Cambria" w:hAnsi="Cambria"/>
+        </w:rPr>
+        <w:lastRenderedPageBreak/>
+        <w:t>del problema exige que todos los drones regresen al depósito y que cada persona reciba el contenido requerido.</w:t>
+      </w:r>
+    </w:p>
+    <w:p>
+      <w:pPr>
+        <w:rPr>
+          <w:rFonts w:ascii="Cambria" w:hAnsi="Cambria"/>
+        </w:rPr>
+      </w:pPr>
+      <w:r>
+        <w:rPr>
+          <w:rFonts w:ascii="Cambria" w:hAnsi="Cambria"/>
+        </w:rPr>
+        <w:t>Una decisión de diseño relevante es que la capacidad del transportador se fija mediante la constante MAX_CAPACITY = 4, lo que permite cumplir el requisito del enunciado de poder transportar hasta cuatro cajas por carrier. Esta elección simplifica la generación de problemas y evita inconsistencias en la cadena numérica.</w:t>
       </w:r>
     </w:p>
     <w:p>
@@ -6584,7 +6865,6 @@
         <w:rPr>
           <w:rFonts w:ascii="Cambria" w:hAnsi="Cambria"/>
         </w:rPr>
-        <w:lastRenderedPageBreak/>
         <w:t>Punto 3: Verificación del dominio y problemas generados</w:t>
       </w:r>
     </w:p>
@@ -6598,7 +6878,19 @@
         <w:rPr>
           <w:rFonts w:ascii="Cambria" w:hAnsi="Cambria"/>
         </w:rPr>
-        <w:t>Una vez implementado el nuevo dominio y adaptado el generador de problemas, se procedió a verificar su correcto funcionamiento utilizando pyperplan. En primer lugar, se comprobó que tanto el dominio como los problemas generados eran sintácticamente válidos y podían ser procesados por el planificador sin errores de parsing ni de tipado.</w:t>
+        <w:t>Una vez implementado el nuevo dominio y adaptado el generador de problemas, se procedió a verificar su correcto funcionamiento utilizando pyperplan</w:t>
+      </w:r>
+      <w:r>
+        <w:rPr>
+          <w:rFonts w:ascii="Cambria" w:hAnsi="Cambria"/>
+        </w:rPr>
+        <w:t xml:space="preserve"> o ff</w:t>
+      </w:r>
+      <w:r>
+        <w:rPr>
+          <w:rFonts w:ascii="Cambria" w:hAnsi="Cambria"/>
+        </w:rPr>
+        <w:t>. En primer lugar, se comprobó que tanto el dominio como los problemas generados eran sintácticamente válidos y podían ser procesados por el planificador sin errores de parsing ni de tipado.</w:t>
       </w:r>
     </w:p>
     <w:p>
@@ -6624,43 +6916,114 @@
         <w:rPr>
           <w:rFonts w:ascii="Cambria" w:hAnsi="Cambria"/>
         </w:rPr>
+        <w:t xml:space="preserve">Debido a que aún no hemos establecido costes para las acciones, en la mayoría de ocasiones el planificador opta por realizar acciones simples de coger objetos y volar con ellos para entregarlos en vez de utilizar el Carrier, </w:t>
+      </w:r>
+      <w:r>
+        <w:rPr>
+          <w:rFonts w:ascii="Cambria" w:hAnsi="Cambria"/>
+        </w:rPr>
+        <w:t>ya que su utilización implica acciones adicionales (cargar y descargar) que aumentan la longitud del plan</w:t>
+      </w:r>
+      <w:r>
+        <w:rPr>
+          <w:rFonts w:ascii="Cambria" w:hAnsi="Cambria"/>
+        </w:rPr>
+        <w:t xml:space="preserve">. </w:t>
+      </w:r>
+      <w:r>
+        <w:rPr>
+          <w:rFonts w:ascii="Cambria" w:hAnsi="Cambria"/>
+        </w:rPr>
+        <w:t>No obstante, el dominio permite correctamente su utilización y mantiene coherencia lógica en todas las transiciones de estado.</w:t>
+      </w:r>
+      <w:r>
+        <w:rPr>
+          <w:rFonts w:ascii="Cambria" w:hAnsi="Cambria"/>
+        </w:rPr>
+        <w:t xml:space="preserve"> Para forzar que utilice las acciones propias del Carrier hemos eliminado solo para esta prueba la acción fly obligando al planificador a utilizar la acción </w:t>
+      </w:r>
+      <w:r>
+        <w:rPr>
+          <w:rFonts w:ascii="Cambria" w:hAnsi="Cambria"/>
+        </w:rPr>
+        <w:t>fly-and-move-carrier</w:t>
+      </w:r>
+      <w:r>
+        <w:rPr>
+          <w:rFonts w:ascii="Cambria" w:hAnsi="Cambria"/>
+        </w:rPr>
+        <w:t xml:space="preserve">. </w:t>
+      </w:r>
+    </w:p>
+    <w:p>
+      <w:pPr>
+        <w:rPr>
+          <w:rFonts w:ascii="Cambria" w:hAnsi="Cambria"/>
+        </w:rPr>
+      </w:pPr>
+      <w:r>
+        <w:rPr>
+          <w:rFonts w:ascii="Cambria" w:hAnsi="Cambria"/>
+        </w:rPr>
         <w:t xml:space="preserve">Por ejemplo: </w:t>
       </w:r>
       <w:r>
         <w:rPr>
           <w:rFonts w:ascii="Cambria" w:hAnsi="Cambria"/>
         </w:rPr>
-        <w:t>generando el siguiente problema python3 generate-problem2.py -d 1 -r 1 -l 3 -p 2 -c 4 -g 4</w:t>
-      </w:r>
-      <w:r>
-        <w:rPr>
-          <w:rFonts w:ascii="Cambria" w:hAnsi="Cambria"/>
-        </w:rPr>
-        <w:t xml:space="preserve"> y ejecutándolo de la siguiente forma: planutils run ff domain2.pddl emergency_carrier_d1_r1_l3_p2_c4_g4.pddl</w:t>
-      </w:r>
-      <w:r>
-        <w:rPr>
-          <w:rFonts w:ascii="Cambria" w:hAnsi="Cambria"/>
-        </w:rPr>
-        <w:t xml:space="preserve"> obtenemos el siguiente plan: </w:t>
-      </w:r>
-    </w:p>
-    <w:p>
-      <w:pPr>
-        <w:rPr>
-          <w:rFonts w:ascii="Cambria" w:hAnsi="Cambria"/>
-        </w:rPr>
-      </w:pPr>
-      <w:r>
-        <w:rPr>
-          <w:rFonts w:ascii="Cambria" w:hAnsi="Cambria"/>
-          <w:noProof/>
+        <w:t xml:space="preserve">generando el siguiente problema python3 generate-problem2.py -d 1 -r 1 -l </w:t>
+      </w:r>
+      <w:r>
+        <w:rPr>
+          <w:rFonts w:ascii="Cambria" w:hAnsi="Cambria"/>
+        </w:rPr>
+        <w:t xml:space="preserve">10 </w:t>
+      </w:r>
+      <w:r>
+        <w:rPr>
+          <w:rFonts w:ascii="Cambria" w:hAnsi="Cambria"/>
+        </w:rPr>
+        <w:t xml:space="preserve">-p </w:t>
+      </w:r>
+      <w:r>
+        <w:rPr>
+          <w:rFonts w:ascii="Cambria" w:hAnsi="Cambria"/>
+        </w:rPr>
+        <w:t>10</w:t>
+      </w:r>
+      <w:r>
+        <w:rPr>
+          <w:rFonts w:ascii="Cambria" w:hAnsi="Cambria"/>
+        </w:rPr>
+        <w:t xml:space="preserve"> -c 4 -g 4</w:t>
+      </w:r>
+      <w:r>
+        <w:rPr>
+          <w:rFonts w:ascii="Cambria" w:hAnsi="Cambria"/>
+        </w:rPr>
+        <w:t xml:space="preserve"> </w:t>
+      </w:r>
+      <w:r>
+        <w:rPr>
+          <w:rFonts w:ascii="Cambria" w:hAnsi="Cambria"/>
+        </w:rPr>
+        <w:t xml:space="preserve"> el cuál nos da un problema con los siguientes objetivos: </w:t>
+      </w:r>
+      <w:r>
+        <w:rPr>
+          <w:rFonts w:ascii="Cambria" w:hAnsi="Cambria"/>
+        </w:rPr>
+        <w:br/>
+      </w:r>
+      <w:r>
+        <w:rPr>
+          <w:rFonts w:ascii="Cambria" w:hAnsi="Cambria"/>
         </w:rPr>
         <w:drawing>
-          <wp:inline distT="0" distB="0" distL="0" distR="0" wp14:anchorId="3DA756FB" wp14:editId="6AF0C7B0">
-            <wp:extent cx="3695700" cy="2693597"/>
+          <wp:inline distT="0" distB="0" distL="0" distR="0" wp14:anchorId="181D641E" wp14:editId="718D5711">
+            <wp:extent cx="2536371" cy="1283652"/>
             <wp:effectExtent l="0" t="0" r="0" b="0"/>
-            <wp:docPr id="366748427" name="Imagen 1"/>
+            <wp:docPr id="71891344" name="Imagen 1"/>
             <wp:cNvGraphicFramePr>
               <a:graphicFrameLocks xmlns:a="http://schemas.openxmlformats.org/drawingml/2006/main" noChangeAspect="1"/>
             </wp:cNvGraphicFramePr>
@@ -6668,7 +7031,7 @@
               <a:graphicData uri="http://schemas.openxmlformats.org/drawingml/2006/picture">
                 <pic:pic xmlns:pic="http://schemas.openxmlformats.org/drawingml/2006/picture">
                   <pic:nvPicPr>
-                    <pic:cNvPr id="366748427" name=""/>
+                    <pic:cNvPr id="71891344" name=""/>
                     <pic:cNvPicPr/>
                   </pic:nvPicPr>
                   <pic:blipFill>
@@ -6680,7 +7043,7 @@
                   <pic:spPr>
                     <a:xfrm>
                       <a:off x="0" y="0"/>
-                      <a:ext cx="3698439" cy="2695593"/>
+                      <a:ext cx="2541189" cy="1286091"/>
                     </a:xfrm>
                     <a:prstGeom prst="rect">
                       <a:avLst/>
@@ -6703,33 +7066,104 @@
         <w:rPr>
           <w:rFonts w:ascii="Cambria" w:hAnsi="Cambria"/>
         </w:rPr>
-        <w:t>Lo que nos garantiza su correcto funcionamiento.</w:t>
-      </w:r>
-    </w:p>
-    <w:p>
-      <w:pPr>
-        <w:rPr>
-          <w:rFonts w:ascii="Cambria" w:hAnsi="Cambria"/>
-        </w:rPr>
-      </w:pPr>
-      <w:r>
-        <w:rPr>
-          <w:rFonts w:ascii="Cambria" w:hAnsi="Cambria"/>
-        </w:rPr>
-        <w:t>Asimismo, se verificó que las nuevas acciones relacionadas con el transportador estaban correctamente definidas. Las acciones put-in-carrier y take-from-carrier modificaban adecuadamente el estado del contador numérico del transportador, representado mediante objetos de tipo num y el predicado siguiente. Además, se comprobó que no era posible introducir más cajas de las permitidas por la capacidad máxima, ya que al alcanzar el valor máximo no existía una relación siguiente adicional que permitiera incrementar la carga.</w:t>
-      </w:r>
-    </w:p>
-    <w:p>
-      <w:pPr>
-        <w:rPr>
-          <w:rFonts w:ascii="Cambria" w:hAnsi="Cambria"/>
-        </w:rPr>
-      </w:pPr>
-      <w:r>
-        <w:rPr>
-          <w:rFonts w:ascii="Cambria" w:hAnsi="Cambria"/>
-        </w:rPr>
-        <w:t>Es importante destacar que, al no haberse introducido aún costes de acción, el planificador no siempre hace uso del transportador en los planes generados, ya que su utilización implica acciones adicionales (cargar y descargar) que aumentan la longitud del plan. No obstante, el dominio permite correctamente su utilización y mantiene coherencia lógica en todas las transiciones de estado.</w:t>
+        <w:t>y ejecutándolo de la siguiente forma: planutils run ff domain2.pddl emergency_carrier_d1_r1_l</w:t>
+      </w:r>
+      <w:r>
+        <w:rPr>
+          <w:rFonts w:ascii="Cambria" w:hAnsi="Cambria"/>
+        </w:rPr>
+        <w:t>10</w:t>
+      </w:r>
+      <w:r>
+        <w:rPr>
+          <w:rFonts w:ascii="Cambria" w:hAnsi="Cambria"/>
+        </w:rPr>
+        <w:t>_p</w:t>
+      </w:r>
+      <w:r>
+        <w:rPr>
+          <w:rFonts w:ascii="Cambria" w:hAnsi="Cambria"/>
+        </w:rPr>
+        <w:t>10</w:t>
+      </w:r>
+      <w:r>
+        <w:rPr>
+          <w:rFonts w:ascii="Cambria" w:hAnsi="Cambria"/>
+        </w:rPr>
+        <w:t>_c4_g4.pddl</w:t>
+      </w:r>
+      <w:r>
+        <w:rPr>
+          <w:rFonts w:ascii="Cambria" w:hAnsi="Cambria"/>
+        </w:rPr>
+        <w:t xml:space="preserve"> obtenemos el siguiente plan: </w:t>
+      </w:r>
+    </w:p>
+    <w:p>
+      <w:pPr>
+        <w:rPr>
+          <w:rFonts w:ascii="Cambria" w:hAnsi="Cambria"/>
+        </w:rPr>
+      </w:pPr>
+      <w:r>
+        <w:rPr>
+          <w:rFonts w:ascii="Cambria" w:hAnsi="Cambria"/>
+        </w:rPr>
+        <w:lastRenderedPageBreak/>
+        <w:drawing>
+          <wp:inline distT="0" distB="0" distL="0" distR="0" wp14:anchorId="164BC30B" wp14:editId="119D634E">
+            <wp:extent cx="4142014" cy="3231416"/>
+            <wp:effectExtent l="0" t="0" r="0" b="7620"/>
+            <wp:docPr id="736505015" name="Imagen 1"/>
+            <wp:cNvGraphicFramePr>
+              <a:graphicFrameLocks xmlns:a="http://schemas.openxmlformats.org/drawingml/2006/main" noChangeAspect="1"/>
+            </wp:cNvGraphicFramePr>
+            <a:graphic xmlns:a="http://schemas.openxmlformats.org/drawingml/2006/main">
+              <a:graphicData uri="http://schemas.openxmlformats.org/drawingml/2006/picture">
+                <pic:pic xmlns:pic="http://schemas.openxmlformats.org/drawingml/2006/picture">
+                  <pic:nvPicPr>
+                    <pic:cNvPr id="736505015" name=""/>
+                    <pic:cNvPicPr/>
+                  </pic:nvPicPr>
+                  <pic:blipFill>
+                    <a:blip r:embed="rId9"/>
+                    <a:stretch>
+                      <a:fillRect/>
+                    </a:stretch>
+                  </pic:blipFill>
+                  <pic:spPr>
+                    <a:xfrm>
+                      <a:off x="0" y="0"/>
+                      <a:ext cx="4148211" cy="3236251"/>
+                    </a:xfrm>
+                    <a:prstGeom prst="rect">
+                      <a:avLst/>
+                    </a:prstGeom>
+                  </pic:spPr>
+                </pic:pic>
+              </a:graphicData>
+            </a:graphic>
+          </wp:inline>
+        </w:drawing>
+      </w:r>
+    </w:p>
+    <w:p>
+      <w:pPr>
+        <w:rPr>
+          <w:rFonts w:ascii="Cambria" w:hAnsi="Cambria"/>
+        </w:rPr>
+      </w:pPr>
+      <w:r>
+        <w:rPr>
+          <w:rFonts w:ascii="Cambria" w:hAnsi="Cambria"/>
+        </w:rPr>
+        <w:t>Esta prueba nos</w:t>
+      </w:r>
+      <w:r>
+        <w:rPr>
+          <w:rFonts w:ascii="Cambria" w:hAnsi="Cambria"/>
+        </w:rPr>
+        <w:t xml:space="preserve"> garantiza su correcto funcionamiento.</w:t>
       </w:r>
     </w:p>
     <w:p>
@@ -6747,11 +7181,1202 @@
     </w:p>
     <w:p>
       <w:pPr>
-        <w:rPr>
-          <w:rFonts w:ascii="Cambria" w:hAnsi="Cambria"/>
-        </w:rPr>
-      </w:pPr>
-    </w:p>
+        <w:pStyle w:val="Ttulo3"/>
+        <w:jc w:val="center"/>
+        <w:rPr>
+          <w:rFonts w:ascii="Cambria" w:hAnsi="Cambria"/>
+        </w:rPr>
+      </w:pPr>
+      <w:r>
+        <w:rPr>
+          <w:rFonts w:ascii="Cambria" w:hAnsi="Cambria"/>
+        </w:rPr>
+        <w:t xml:space="preserve">Punto </w:t>
+      </w:r>
+      <w:r>
+        <w:rPr>
+          <w:rFonts w:ascii="Cambria" w:hAnsi="Cambria"/>
+        </w:rPr>
+        <w:t>4</w:t>
+      </w:r>
+      <w:r>
+        <w:rPr>
+          <w:rFonts w:ascii="Cambria" w:hAnsi="Cambria"/>
+        </w:rPr>
+        <w:t xml:space="preserve">: </w:t>
+      </w:r>
+      <w:r>
+        <w:rPr>
+          <w:rFonts w:ascii="Cambria" w:hAnsi="Cambria"/>
+        </w:rPr>
+        <w:t>Repetición de apartados 1.3.2 y 1.3.3</w:t>
+      </w:r>
+    </w:p>
+    <w:p>
+      <w:pPr>
+        <w:rPr>
+          <w:rFonts w:ascii="Cambria" w:hAnsi="Cambria"/>
+          <w:b/>
+          <w:bCs/>
+          <w:color w:val="EE0000"/>
+          <w:sz w:val="24"/>
+          <w:szCs w:val="24"/>
+        </w:rPr>
+      </w:pPr>
+      <w:r>
+        <w:rPr>
+          <w:rFonts w:ascii="Cambria" w:hAnsi="Cambria"/>
+          <w:b/>
+          <w:bCs/>
+          <w:sz w:val="24"/>
+          <w:szCs w:val="24"/>
+        </w:rPr>
+        <w:t>Apartado 1.3.2</w:t>
+      </w:r>
+      <w:r>
+        <w:rPr>
+          <w:rFonts w:ascii="Cambria" w:hAnsi="Cambria"/>
+          <w:b/>
+          <w:bCs/>
+          <w:sz w:val="24"/>
+          <w:szCs w:val="24"/>
+        </w:rPr>
+        <w:t xml:space="preserve"> – </w:t>
+      </w:r>
+      <w:r>
+        <w:rPr>
+          <w:rFonts w:ascii="Cambria" w:hAnsi="Cambria"/>
+          <w:b/>
+          <w:bCs/>
+          <w:color w:val="EE0000"/>
+          <w:sz w:val="24"/>
+          <w:szCs w:val="24"/>
+        </w:rPr>
+        <w:t>EN DESARROLLO</w:t>
+      </w:r>
+    </w:p>
+    <w:tbl>
+      <w:tblPr>
+        <w:tblStyle w:val="Tablaconcuadrcula"/>
+        <w:tblW w:w="0" w:type="auto"/>
+        <w:tblLook w:val="04A0" w:firstRow="1" w:lastRow="0" w:firstColumn="1" w:lastColumn="0" w:noHBand="0" w:noVBand="1"/>
+      </w:tblPr>
+      <w:tblGrid>
+        <w:gridCol w:w="2113"/>
+        <w:gridCol w:w="2114"/>
+        <w:gridCol w:w="2116"/>
+        <w:gridCol w:w="2115"/>
+      </w:tblGrid>
+      <w:tr>
+        <w:tc>
+          <w:tcPr>
+            <w:tcW w:w="2113" w:type="dxa"/>
+            <w:tcBorders>
+              <w:top w:val="single" w:sz="18" w:space="0" w:color="auto"/>
+              <w:left w:val="single" w:sz="18" w:space="0" w:color="auto"/>
+              <w:bottom w:val="single" w:sz="18" w:space="0" w:color="auto"/>
+            </w:tcBorders>
+          </w:tcPr>
+          <w:p>
+            <w:pPr>
+              <w:rPr>
+                <w:rFonts w:ascii="Cambria" w:hAnsi="Cambria"/>
+                <w:b/>
+                <w:bCs/>
+              </w:rPr>
+            </w:pPr>
+            <w:r>
+              <w:rPr>
+                <w:rFonts w:ascii="Cambria" w:hAnsi="Cambria"/>
+                <w:b/>
+                <w:bCs/>
+              </w:rPr>
+              <w:t xml:space="preserve">Algoritmo </w:t>
+            </w:r>
+          </w:p>
+        </w:tc>
+        <w:tc>
+          <w:tcPr>
+            <w:tcW w:w="2114" w:type="dxa"/>
+            <w:tcBorders>
+              <w:top w:val="single" w:sz="18" w:space="0" w:color="auto"/>
+              <w:bottom w:val="single" w:sz="18" w:space="0" w:color="auto"/>
+            </w:tcBorders>
+          </w:tcPr>
+          <w:p>
+            <w:pPr>
+              <w:rPr>
+                <w:rFonts w:ascii="Cambria" w:hAnsi="Cambria"/>
+                <w:b/>
+                <w:bCs/>
+              </w:rPr>
+            </w:pPr>
+            <w:r>
+              <w:rPr>
+                <w:rFonts w:ascii="Cambria" w:hAnsi="Cambria"/>
+                <w:b/>
+                <w:bCs/>
+              </w:rPr>
+              <w:t>Heurística</w:t>
+            </w:r>
+          </w:p>
+        </w:tc>
+        <w:tc>
+          <w:tcPr>
+            <w:tcW w:w="2116" w:type="dxa"/>
+            <w:tcBorders>
+              <w:top w:val="single" w:sz="18" w:space="0" w:color="auto"/>
+              <w:bottom w:val="single" w:sz="18" w:space="0" w:color="auto"/>
+            </w:tcBorders>
+          </w:tcPr>
+          <w:p>
+            <w:pPr>
+              <w:rPr>
+                <w:rFonts w:ascii="Cambria" w:hAnsi="Cambria"/>
+                <w:b/>
+                <w:bCs/>
+              </w:rPr>
+            </w:pPr>
+            <w:r>
+              <w:rPr>
+                <w:rFonts w:ascii="Cambria" w:hAnsi="Cambria"/>
+                <w:b/>
+                <w:bCs/>
+              </w:rPr>
+              <w:t>Tiempo (s)</w:t>
+            </w:r>
+          </w:p>
+        </w:tc>
+        <w:tc>
+          <w:tcPr>
+            <w:tcW w:w="2115" w:type="dxa"/>
+            <w:tcBorders>
+              <w:top w:val="single" w:sz="18" w:space="0" w:color="auto"/>
+              <w:bottom w:val="single" w:sz="18" w:space="0" w:color="auto"/>
+              <w:right w:val="single" w:sz="18" w:space="0" w:color="auto"/>
+            </w:tcBorders>
+          </w:tcPr>
+          <w:p>
+            <w:pPr>
+              <w:rPr>
+                <w:rFonts w:ascii="Cambria" w:hAnsi="Cambria"/>
+                <w:b/>
+                <w:bCs/>
+              </w:rPr>
+            </w:pPr>
+            <w:r>
+              <w:rPr>
+                <w:rFonts w:ascii="Cambria" w:hAnsi="Cambria"/>
+                <w:b/>
+                <w:bCs/>
+              </w:rPr>
+              <w:t>Longitud Plan</w:t>
+            </w:r>
+          </w:p>
+        </w:tc>
+      </w:tr>
+      <w:tr>
+        <w:tc>
+          <w:tcPr>
+            <w:tcW w:w="2113" w:type="dxa"/>
+            <w:tcBorders>
+              <w:top w:val="single" w:sz="18" w:space="0" w:color="auto"/>
+              <w:left w:val="single" w:sz="18" w:space="0" w:color="auto"/>
+            </w:tcBorders>
+          </w:tcPr>
+          <w:p>
+            <w:pPr>
+              <w:rPr>
+                <w:rFonts w:ascii="Cambria" w:hAnsi="Cambria"/>
+              </w:rPr>
+            </w:pPr>
+            <w:r>
+              <w:rPr>
+                <w:rFonts w:ascii="Cambria" w:hAnsi="Cambria"/>
+              </w:rPr>
+              <w:t>GBFS</w:t>
+            </w:r>
+          </w:p>
+        </w:tc>
+        <w:tc>
+          <w:tcPr>
+            <w:tcW w:w="2114" w:type="dxa"/>
+            <w:tcBorders>
+              <w:top w:val="single" w:sz="18" w:space="0" w:color="auto"/>
+            </w:tcBorders>
+          </w:tcPr>
+          <w:p>
+            <w:pPr>
+              <w:rPr>
+                <w:rFonts w:ascii="Cambria" w:hAnsi="Cambria"/>
+              </w:rPr>
+            </w:pPr>
+            <w:r>
+              <w:rPr>
+                <w:rFonts w:ascii="Cambria" w:hAnsi="Cambria"/>
+              </w:rPr>
+              <w:t>hMAX</w:t>
+            </w:r>
+          </w:p>
+        </w:tc>
+        <w:tc>
+          <w:tcPr>
+            <w:tcW w:w="2116" w:type="dxa"/>
+            <w:tcBorders>
+              <w:top w:val="single" w:sz="18" w:space="0" w:color="auto"/>
+            </w:tcBorders>
+          </w:tcPr>
+          <w:p>
+            <w:pPr>
+              <w:rPr>
+                <w:rFonts w:ascii="Cambria" w:hAnsi="Cambria"/>
+              </w:rPr>
+            </w:pPr>
+            <w:r>
+              <w:rPr>
+                <w:rFonts w:ascii="Cambria" w:hAnsi="Cambria"/>
+              </w:rPr>
+              <w:t>14.278s</w:t>
+            </w:r>
+          </w:p>
+        </w:tc>
+        <w:tc>
+          <w:tcPr>
+            <w:tcW w:w="2115" w:type="dxa"/>
+            <w:tcBorders>
+              <w:top w:val="single" w:sz="18" w:space="0" w:color="auto"/>
+              <w:right w:val="single" w:sz="18" w:space="0" w:color="auto"/>
+            </w:tcBorders>
+          </w:tcPr>
+          <w:p>
+            <w:pPr>
+              <w:rPr>
+                <w:rFonts w:ascii="Cambria" w:hAnsi="Cambria"/>
+              </w:rPr>
+            </w:pPr>
+            <w:r>
+              <w:rPr>
+                <w:rFonts w:ascii="Cambria" w:hAnsi="Cambria"/>
+              </w:rPr>
+              <w:t>20</w:t>
+            </w:r>
+          </w:p>
+        </w:tc>
+      </w:tr>
+      <w:tr>
+        <w:tc>
+          <w:tcPr>
+            <w:tcW w:w="2113" w:type="dxa"/>
+            <w:tcBorders>
+              <w:left w:val="single" w:sz="18" w:space="0" w:color="auto"/>
+            </w:tcBorders>
+          </w:tcPr>
+          <w:p>
+            <w:pPr>
+              <w:rPr>
+                <w:rFonts w:ascii="Cambria" w:hAnsi="Cambria"/>
+              </w:rPr>
+            </w:pPr>
+            <w:r>
+              <w:rPr>
+                <w:rFonts w:ascii="Cambria" w:hAnsi="Cambria"/>
+              </w:rPr>
+              <w:t>GBFS</w:t>
+            </w:r>
+          </w:p>
+        </w:tc>
+        <w:tc>
+          <w:tcPr>
+            <w:tcW w:w="2114" w:type="dxa"/>
+          </w:tcPr>
+          <w:p>
+            <w:pPr>
+              <w:rPr>
+                <w:rFonts w:ascii="Cambria" w:hAnsi="Cambria"/>
+              </w:rPr>
+            </w:pPr>
+            <w:r>
+              <w:rPr>
+                <w:rFonts w:ascii="Cambria" w:hAnsi="Cambria"/>
+              </w:rPr>
+              <w:t>hADD</w:t>
+            </w:r>
+          </w:p>
+        </w:tc>
+        <w:tc>
+          <w:tcPr>
+            <w:tcW w:w="2116" w:type="dxa"/>
+          </w:tcPr>
+          <w:p>
+            <w:pPr>
+              <w:rPr>
+                <w:rFonts w:ascii="Cambria" w:hAnsi="Cambria"/>
+              </w:rPr>
+            </w:pPr>
+            <w:r>
+              <w:rPr>
+                <w:rFonts w:ascii="Cambria" w:hAnsi="Cambria"/>
+              </w:rPr>
+              <w:t>0.608s</w:t>
+            </w:r>
+          </w:p>
+        </w:tc>
+        <w:tc>
+          <w:tcPr>
+            <w:tcW w:w="2115" w:type="dxa"/>
+            <w:tcBorders>
+              <w:right w:val="single" w:sz="18" w:space="0" w:color="auto"/>
+            </w:tcBorders>
+          </w:tcPr>
+          <w:p>
+            <w:pPr>
+              <w:rPr>
+                <w:rFonts w:ascii="Cambria" w:hAnsi="Cambria"/>
+              </w:rPr>
+            </w:pPr>
+            <w:r>
+              <w:rPr>
+                <w:rFonts w:ascii="Cambria" w:hAnsi="Cambria"/>
+              </w:rPr>
+              <w:t>20</w:t>
+            </w:r>
+          </w:p>
+        </w:tc>
+      </w:tr>
+      <w:tr>
+        <w:tc>
+          <w:tcPr>
+            <w:tcW w:w="2113" w:type="dxa"/>
+            <w:tcBorders>
+              <w:left w:val="single" w:sz="18" w:space="0" w:color="auto"/>
+            </w:tcBorders>
+          </w:tcPr>
+          <w:p>
+            <w:pPr>
+              <w:rPr>
+                <w:rFonts w:ascii="Cambria" w:hAnsi="Cambria"/>
+              </w:rPr>
+            </w:pPr>
+            <w:r>
+              <w:rPr>
+                <w:rFonts w:ascii="Cambria" w:hAnsi="Cambria"/>
+              </w:rPr>
+              <w:t>GBFS</w:t>
+            </w:r>
+          </w:p>
+        </w:tc>
+        <w:tc>
+          <w:tcPr>
+            <w:tcW w:w="2114" w:type="dxa"/>
+          </w:tcPr>
+          <w:p>
+            <w:pPr>
+              <w:rPr>
+                <w:rFonts w:ascii="Cambria" w:hAnsi="Cambria"/>
+              </w:rPr>
+            </w:pPr>
+            <w:r>
+              <w:rPr>
+                <w:rFonts w:ascii="Cambria" w:hAnsi="Cambria"/>
+              </w:rPr>
+              <w:t>hFF</w:t>
+            </w:r>
+          </w:p>
+        </w:tc>
+        <w:tc>
+          <w:tcPr>
+            <w:tcW w:w="2116" w:type="dxa"/>
+          </w:tcPr>
+          <w:p>
+            <w:pPr>
+              <w:rPr>
+                <w:rFonts w:ascii="Cambria" w:hAnsi="Cambria"/>
+              </w:rPr>
+            </w:pPr>
+            <w:r>
+              <w:rPr>
+                <w:rFonts w:ascii="Cambria" w:hAnsi="Cambria"/>
+              </w:rPr>
+              <w:t>0.324s</w:t>
+            </w:r>
+          </w:p>
+        </w:tc>
+        <w:tc>
+          <w:tcPr>
+            <w:tcW w:w="2115" w:type="dxa"/>
+            <w:tcBorders>
+              <w:right w:val="single" w:sz="18" w:space="0" w:color="auto"/>
+            </w:tcBorders>
+          </w:tcPr>
+          <w:p>
+            <w:pPr>
+              <w:rPr>
+                <w:rFonts w:ascii="Cambria" w:hAnsi="Cambria"/>
+              </w:rPr>
+            </w:pPr>
+            <w:r>
+              <w:rPr>
+                <w:rFonts w:ascii="Cambria" w:hAnsi="Cambria"/>
+              </w:rPr>
+              <w:t>20</w:t>
+            </w:r>
+          </w:p>
+        </w:tc>
+      </w:tr>
+      <w:tr>
+        <w:tc>
+          <w:tcPr>
+            <w:tcW w:w="2113" w:type="dxa"/>
+            <w:tcBorders>
+              <w:left w:val="single" w:sz="18" w:space="0" w:color="auto"/>
+            </w:tcBorders>
+          </w:tcPr>
+          <w:p>
+            <w:pPr>
+              <w:rPr>
+                <w:rFonts w:ascii="Cambria" w:hAnsi="Cambria"/>
+              </w:rPr>
+            </w:pPr>
+            <w:r>
+              <w:rPr>
+                <w:rFonts w:ascii="Cambria" w:hAnsi="Cambria"/>
+              </w:rPr>
+              <w:t>GBFS</w:t>
+            </w:r>
+          </w:p>
+        </w:tc>
+        <w:tc>
+          <w:tcPr>
+            <w:tcW w:w="2114" w:type="dxa"/>
+          </w:tcPr>
+          <w:p>
+            <w:pPr>
+              <w:rPr>
+                <w:rFonts w:ascii="Cambria" w:hAnsi="Cambria"/>
+              </w:rPr>
+            </w:pPr>
+            <w:r>
+              <w:rPr>
+                <w:rFonts w:ascii="Cambria" w:hAnsi="Cambria"/>
+              </w:rPr>
+              <w:t>Landmark</w:t>
+            </w:r>
+          </w:p>
+        </w:tc>
+        <w:tc>
+          <w:tcPr>
+            <w:tcW w:w="2116" w:type="dxa"/>
+          </w:tcPr>
+          <w:p>
+            <w:pPr>
+              <w:rPr>
+                <w:rFonts w:ascii="Cambria" w:hAnsi="Cambria"/>
+              </w:rPr>
+            </w:pPr>
+            <w:r>
+              <w:rPr>
+                <w:rFonts w:ascii="Cambria" w:hAnsi="Cambria"/>
+              </w:rPr>
+              <w:t>0.180s</w:t>
+            </w:r>
+          </w:p>
+        </w:tc>
+        <w:tc>
+          <w:tcPr>
+            <w:tcW w:w="2115" w:type="dxa"/>
+            <w:tcBorders>
+              <w:right w:val="single" w:sz="18" w:space="0" w:color="auto"/>
+            </w:tcBorders>
+          </w:tcPr>
+          <w:p>
+            <w:pPr>
+              <w:rPr>
+                <w:rFonts w:ascii="Cambria" w:hAnsi="Cambria"/>
+              </w:rPr>
+            </w:pPr>
+            <w:r>
+              <w:rPr>
+                <w:rFonts w:ascii="Cambria" w:hAnsi="Cambria"/>
+              </w:rPr>
+              <w:t>20</w:t>
+            </w:r>
+          </w:p>
+        </w:tc>
+      </w:tr>
+      <w:tr>
+        <w:tc>
+          <w:tcPr>
+            <w:tcW w:w="2113" w:type="dxa"/>
+            <w:tcBorders>
+              <w:left w:val="single" w:sz="18" w:space="0" w:color="auto"/>
+            </w:tcBorders>
+          </w:tcPr>
+          <w:p>
+            <w:pPr>
+              <w:rPr>
+                <w:rFonts w:ascii="Cambria" w:hAnsi="Cambria"/>
+              </w:rPr>
+            </w:pPr>
+            <w:r>
+              <w:rPr>
+                <w:rFonts w:ascii="Cambria" w:hAnsi="Cambria"/>
+              </w:rPr>
+              <w:t>EHC</w:t>
+            </w:r>
+          </w:p>
+        </w:tc>
+        <w:tc>
+          <w:tcPr>
+            <w:tcW w:w="2114" w:type="dxa"/>
+          </w:tcPr>
+          <w:p>
+            <w:pPr>
+              <w:rPr>
+                <w:rFonts w:ascii="Cambria" w:hAnsi="Cambria"/>
+              </w:rPr>
+            </w:pPr>
+            <w:r>
+              <w:rPr>
+                <w:rFonts w:ascii="Cambria" w:hAnsi="Cambria"/>
+              </w:rPr>
+              <w:t>hMAX</w:t>
+            </w:r>
+          </w:p>
+        </w:tc>
+        <w:tc>
+          <w:tcPr>
+            <w:tcW w:w="2116" w:type="dxa"/>
+          </w:tcPr>
+          <w:p>
+            <w:pPr>
+              <w:rPr>
+                <w:rFonts w:ascii="Cambria" w:hAnsi="Cambria"/>
+              </w:rPr>
+            </w:pPr>
+            <w:r>
+              <w:rPr>
+                <w:rFonts w:ascii="Cambria" w:hAnsi="Cambria"/>
+              </w:rPr>
+              <w:t>51m40.273s</w:t>
+            </w:r>
+          </w:p>
+        </w:tc>
+        <w:tc>
+          <w:tcPr>
+            <w:tcW w:w="2115" w:type="dxa"/>
+            <w:tcBorders>
+              <w:right w:val="single" w:sz="18" w:space="0" w:color="auto"/>
+            </w:tcBorders>
+          </w:tcPr>
+          <w:p>
+            <w:pPr>
+              <w:rPr>
+                <w:rFonts w:ascii="Cambria" w:hAnsi="Cambria"/>
+              </w:rPr>
+            </w:pPr>
+            <w:r>
+              <w:rPr>
+                <w:rFonts w:ascii="Cambria" w:hAnsi="Cambria"/>
+              </w:rPr>
+              <w:t>Killed (no se ha llegado a completar)</w:t>
+            </w:r>
+          </w:p>
+        </w:tc>
+      </w:tr>
+      <w:tr>
+        <w:tc>
+          <w:tcPr>
+            <w:tcW w:w="2113" w:type="dxa"/>
+            <w:tcBorders>
+              <w:left w:val="single" w:sz="18" w:space="0" w:color="auto"/>
+            </w:tcBorders>
+          </w:tcPr>
+          <w:p>
+            <w:pPr>
+              <w:rPr>
+                <w:rFonts w:ascii="Cambria" w:hAnsi="Cambria"/>
+              </w:rPr>
+            </w:pPr>
+            <w:r>
+              <w:rPr>
+                <w:rFonts w:ascii="Cambria" w:hAnsi="Cambria"/>
+              </w:rPr>
+              <w:t>EHC</w:t>
+            </w:r>
+          </w:p>
+        </w:tc>
+        <w:tc>
+          <w:tcPr>
+            <w:tcW w:w="2114" w:type="dxa"/>
+          </w:tcPr>
+          <w:p>
+            <w:pPr>
+              <w:rPr>
+                <w:rFonts w:ascii="Cambria" w:hAnsi="Cambria"/>
+              </w:rPr>
+            </w:pPr>
+            <w:r>
+              <w:rPr>
+                <w:rFonts w:ascii="Cambria" w:hAnsi="Cambria"/>
+              </w:rPr>
+              <w:t>hADD</w:t>
+            </w:r>
+          </w:p>
+        </w:tc>
+        <w:tc>
+          <w:tcPr>
+            <w:tcW w:w="2116" w:type="dxa"/>
+          </w:tcPr>
+          <w:p>
+            <w:pPr>
+              <w:rPr>
+                <w:rFonts w:ascii="Cambria" w:hAnsi="Cambria"/>
+              </w:rPr>
+            </w:pPr>
+            <w:r>
+              <w:rPr>
+                <w:rFonts w:ascii="Cambria" w:hAnsi="Cambria"/>
+              </w:rPr>
+              <w:t>1.236s</w:t>
+            </w:r>
+          </w:p>
+        </w:tc>
+        <w:tc>
+          <w:tcPr>
+            <w:tcW w:w="2115" w:type="dxa"/>
+            <w:tcBorders>
+              <w:right w:val="single" w:sz="18" w:space="0" w:color="auto"/>
+            </w:tcBorders>
+          </w:tcPr>
+          <w:p>
+            <w:pPr>
+              <w:rPr>
+                <w:rFonts w:ascii="Cambria" w:hAnsi="Cambria"/>
+              </w:rPr>
+            </w:pPr>
+            <w:r>
+              <w:rPr>
+                <w:rFonts w:ascii="Cambria" w:hAnsi="Cambria"/>
+              </w:rPr>
+              <w:t>30</w:t>
+            </w:r>
+          </w:p>
+        </w:tc>
+      </w:tr>
+      <w:tr>
+        <w:tc>
+          <w:tcPr>
+            <w:tcW w:w="2113" w:type="dxa"/>
+            <w:tcBorders>
+              <w:left w:val="single" w:sz="18" w:space="0" w:color="auto"/>
+            </w:tcBorders>
+          </w:tcPr>
+          <w:p>
+            <w:pPr>
+              <w:rPr>
+                <w:rFonts w:ascii="Cambria" w:hAnsi="Cambria"/>
+              </w:rPr>
+            </w:pPr>
+            <w:r>
+              <w:rPr>
+                <w:rFonts w:ascii="Cambria" w:hAnsi="Cambria"/>
+              </w:rPr>
+              <w:t>EHC</w:t>
+            </w:r>
+          </w:p>
+        </w:tc>
+        <w:tc>
+          <w:tcPr>
+            <w:tcW w:w="2114" w:type="dxa"/>
+          </w:tcPr>
+          <w:p>
+            <w:pPr>
+              <w:rPr>
+                <w:rFonts w:ascii="Cambria" w:hAnsi="Cambria"/>
+              </w:rPr>
+            </w:pPr>
+            <w:r>
+              <w:rPr>
+                <w:rFonts w:ascii="Cambria" w:hAnsi="Cambria"/>
+              </w:rPr>
+              <w:t>hFF</w:t>
+            </w:r>
+          </w:p>
+        </w:tc>
+        <w:tc>
+          <w:tcPr>
+            <w:tcW w:w="2116" w:type="dxa"/>
+          </w:tcPr>
+          <w:p>
+            <w:pPr>
+              <w:rPr>
+                <w:rFonts w:ascii="Cambria" w:hAnsi="Cambria"/>
+              </w:rPr>
+            </w:pPr>
+            <w:r>
+              <w:rPr>
+                <w:rFonts w:ascii="Cambria" w:hAnsi="Cambria"/>
+              </w:rPr>
+              <w:t>0.892s</w:t>
+            </w:r>
+          </w:p>
+        </w:tc>
+        <w:tc>
+          <w:tcPr>
+            <w:tcW w:w="2115" w:type="dxa"/>
+            <w:tcBorders>
+              <w:right w:val="single" w:sz="18" w:space="0" w:color="auto"/>
+            </w:tcBorders>
+          </w:tcPr>
+          <w:p>
+            <w:pPr>
+              <w:rPr>
+                <w:rFonts w:ascii="Cambria" w:hAnsi="Cambria"/>
+              </w:rPr>
+            </w:pPr>
+            <w:r>
+              <w:rPr>
+                <w:rFonts w:ascii="Cambria" w:hAnsi="Cambria"/>
+              </w:rPr>
+              <w:t>28</w:t>
+            </w:r>
+          </w:p>
+        </w:tc>
+      </w:tr>
+      <w:tr>
+        <w:tc>
+          <w:tcPr>
+            <w:tcW w:w="2113" w:type="dxa"/>
+            <w:tcBorders>
+              <w:left w:val="single" w:sz="18" w:space="0" w:color="auto"/>
+              <w:bottom w:val="single" w:sz="18" w:space="0" w:color="auto"/>
+            </w:tcBorders>
+          </w:tcPr>
+          <w:p>
+            <w:pPr>
+              <w:rPr>
+                <w:rFonts w:ascii="Cambria" w:hAnsi="Cambria"/>
+              </w:rPr>
+            </w:pPr>
+            <w:r>
+              <w:rPr>
+                <w:rFonts w:ascii="Cambria" w:hAnsi="Cambria"/>
+              </w:rPr>
+              <w:t>EHC</w:t>
+            </w:r>
+          </w:p>
+        </w:tc>
+        <w:tc>
+          <w:tcPr>
+            <w:tcW w:w="2114" w:type="dxa"/>
+            <w:tcBorders>
+              <w:bottom w:val="single" w:sz="18" w:space="0" w:color="auto"/>
+            </w:tcBorders>
+          </w:tcPr>
+          <w:p>
+            <w:pPr>
+              <w:rPr>
+                <w:rFonts w:ascii="Cambria" w:hAnsi="Cambria"/>
+              </w:rPr>
+            </w:pPr>
+            <w:r>
+              <w:rPr>
+                <w:rFonts w:ascii="Cambria" w:hAnsi="Cambria"/>
+              </w:rPr>
+              <w:t>Landmark</w:t>
+            </w:r>
+          </w:p>
+        </w:tc>
+        <w:tc>
+          <w:tcPr>
+            <w:tcW w:w="2116" w:type="dxa"/>
+            <w:tcBorders>
+              <w:bottom w:val="single" w:sz="18" w:space="0" w:color="auto"/>
+            </w:tcBorders>
+          </w:tcPr>
+          <w:p>
+            <w:pPr>
+              <w:rPr>
+                <w:rFonts w:ascii="Cambria" w:hAnsi="Cambria"/>
+              </w:rPr>
+            </w:pPr>
+            <w:r>
+              <w:rPr>
+                <w:rFonts w:ascii="Cambria" w:hAnsi="Cambria"/>
+              </w:rPr>
+              <w:t>0.526s</w:t>
+            </w:r>
+          </w:p>
+        </w:tc>
+        <w:tc>
+          <w:tcPr>
+            <w:tcW w:w="2115" w:type="dxa"/>
+            <w:tcBorders>
+              <w:bottom w:val="single" w:sz="18" w:space="0" w:color="auto"/>
+              <w:right w:val="single" w:sz="18" w:space="0" w:color="auto"/>
+            </w:tcBorders>
+          </w:tcPr>
+          <w:p>
+            <w:pPr>
+              <w:rPr>
+                <w:rFonts w:ascii="Cambria" w:hAnsi="Cambria"/>
+              </w:rPr>
+            </w:pPr>
+            <w:r>
+              <w:rPr>
+                <w:rFonts w:ascii="Cambria" w:hAnsi="Cambria"/>
+              </w:rPr>
+              <w:t>38</w:t>
+            </w:r>
+          </w:p>
+        </w:tc>
+      </w:tr>
+    </w:tbl>
+    <w:p>
+      <w:pPr>
+        <w:rPr>
+          <w:rFonts w:ascii="Cambria" w:hAnsi="Cambria"/>
+        </w:rPr>
+      </w:pPr>
+    </w:p>
+    <w:p>
+      <w:pPr>
+        <w:rPr>
+          <w:rFonts w:ascii="Cambria" w:hAnsi="Cambria"/>
+        </w:rPr>
+      </w:pPr>
+    </w:p>
+    <w:tbl>
+      <w:tblPr>
+        <w:tblStyle w:val="Tablaconcuadrcula"/>
+        <w:tblW w:w="0" w:type="auto"/>
+        <w:tblBorders>
+          <w:top w:val="single" w:sz="18" w:space="0" w:color="auto"/>
+          <w:left w:val="single" w:sz="18" w:space="0" w:color="auto"/>
+          <w:bottom w:val="single" w:sz="18" w:space="0" w:color="auto"/>
+          <w:right w:val="single" w:sz="18" w:space="0" w:color="auto"/>
+        </w:tblBorders>
+        <w:tblLook w:val="04A0" w:firstRow="1" w:lastRow="0" w:firstColumn="1" w:lastColumn="0" w:noHBand="0" w:noVBand="1"/>
+      </w:tblPr>
+      <w:tblGrid>
+        <w:gridCol w:w="2818"/>
+        <w:gridCol w:w="2820"/>
+        <w:gridCol w:w="2820"/>
+      </w:tblGrid>
+      <w:tr>
+        <w:tc>
+          <w:tcPr>
+            <w:tcW w:w="2831" w:type="dxa"/>
+            <w:tcBorders>
+              <w:top w:val="single" w:sz="18" w:space="0" w:color="auto"/>
+              <w:bottom w:val="single" w:sz="18" w:space="0" w:color="auto"/>
+            </w:tcBorders>
+          </w:tcPr>
+          <w:p>
+            <w:pPr>
+              <w:rPr>
+                <w:rFonts w:ascii="Cambria" w:hAnsi="Cambria"/>
+                <w:b/>
+                <w:bCs/>
+              </w:rPr>
+            </w:pPr>
+            <w:r>
+              <w:rPr>
+                <w:rFonts w:ascii="Cambria" w:hAnsi="Cambria"/>
+                <w:b/>
+                <w:bCs/>
+              </w:rPr>
+              <w:t xml:space="preserve">Algoritmo </w:t>
+            </w:r>
+          </w:p>
+        </w:tc>
+        <w:tc>
+          <w:tcPr>
+            <w:tcW w:w="2831" w:type="dxa"/>
+            <w:tcBorders>
+              <w:top w:val="single" w:sz="18" w:space="0" w:color="auto"/>
+              <w:bottom w:val="single" w:sz="18" w:space="0" w:color="auto"/>
+            </w:tcBorders>
+          </w:tcPr>
+          <w:p>
+            <w:pPr>
+              <w:rPr>
+                <w:rFonts w:ascii="Cambria" w:hAnsi="Cambria"/>
+                <w:b/>
+                <w:bCs/>
+              </w:rPr>
+            </w:pPr>
+            <w:r>
+              <w:rPr>
+                <w:rFonts w:ascii="Cambria" w:hAnsi="Cambria"/>
+                <w:b/>
+                <w:bCs/>
+              </w:rPr>
+              <w:t>Tiempo (s)</w:t>
+            </w:r>
+          </w:p>
+        </w:tc>
+        <w:tc>
+          <w:tcPr>
+            <w:tcW w:w="2832" w:type="dxa"/>
+            <w:tcBorders>
+              <w:top w:val="single" w:sz="18" w:space="0" w:color="auto"/>
+              <w:bottom w:val="single" w:sz="18" w:space="0" w:color="auto"/>
+            </w:tcBorders>
+          </w:tcPr>
+          <w:p>
+            <w:pPr>
+              <w:rPr>
+                <w:rFonts w:ascii="Cambria" w:hAnsi="Cambria"/>
+                <w:b/>
+                <w:bCs/>
+              </w:rPr>
+            </w:pPr>
+            <w:r>
+              <w:rPr>
+                <w:rFonts w:ascii="Cambria" w:hAnsi="Cambria"/>
+                <w:b/>
+                <w:bCs/>
+              </w:rPr>
+              <w:t>Longitud Plan</w:t>
+            </w:r>
+          </w:p>
+        </w:tc>
+      </w:tr>
+      <w:tr>
+        <w:tc>
+          <w:tcPr>
+            <w:tcW w:w="2831" w:type="dxa"/>
+            <w:tcBorders>
+              <w:top w:val="single" w:sz="18" w:space="0" w:color="auto"/>
+            </w:tcBorders>
+          </w:tcPr>
+          <w:p>
+            <w:pPr>
+              <w:rPr>
+                <w:rFonts w:ascii="Cambria" w:hAnsi="Cambria"/>
+              </w:rPr>
+            </w:pPr>
+            <w:r>
+              <w:rPr>
+                <w:rFonts w:ascii="Cambria" w:hAnsi="Cambria"/>
+              </w:rPr>
+              <w:t>BFS</w:t>
+            </w:r>
+          </w:p>
+        </w:tc>
+        <w:tc>
+          <w:tcPr>
+            <w:tcW w:w="2831" w:type="dxa"/>
+            <w:tcBorders>
+              <w:top w:val="single" w:sz="18" w:space="0" w:color="auto"/>
+            </w:tcBorders>
+          </w:tcPr>
+          <w:p>
+            <w:pPr>
+              <w:rPr>
+                <w:rFonts w:ascii="Cambria" w:hAnsi="Cambria"/>
+              </w:rPr>
+            </w:pPr>
+            <w:r>
+              <w:rPr>
+                <w:rFonts w:ascii="Cambria" w:hAnsi="Cambria"/>
+              </w:rPr>
+              <w:t>0.583s</w:t>
+            </w:r>
+          </w:p>
+        </w:tc>
+        <w:tc>
+          <w:tcPr>
+            <w:tcW w:w="2832" w:type="dxa"/>
+            <w:tcBorders>
+              <w:top w:val="single" w:sz="18" w:space="0" w:color="auto"/>
+            </w:tcBorders>
+          </w:tcPr>
+          <w:p>
+            <w:pPr>
+              <w:rPr>
+                <w:rFonts w:ascii="Cambria" w:hAnsi="Cambria"/>
+              </w:rPr>
+            </w:pPr>
+            <w:r>
+              <w:rPr>
+                <w:rFonts w:ascii="Cambria" w:hAnsi="Cambria"/>
+              </w:rPr>
+              <w:t>17</w:t>
+            </w:r>
+          </w:p>
+        </w:tc>
+      </w:tr>
+      <w:tr>
+        <w:tc>
+          <w:tcPr>
+            <w:tcW w:w="2831" w:type="dxa"/>
+          </w:tcPr>
+          <w:p>
+            <w:pPr>
+              <w:rPr>
+                <w:rFonts w:ascii="Cambria" w:hAnsi="Cambria"/>
+              </w:rPr>
+            </w:pPr>
+            <w:r>
+              <w:rPr>
+                <w:rFonts w:ascii="Cambria" w:hAnsi="Cambria"/>
+              </w:rPr>
+              <w:t>IDS</w:t>
+            </w:r>
+          </w:p>
+        </w:tc>
+        <w:tc>
+          <w:tcPr>
+            <w:tcW w:w="2831" w:type="dxa"/>
+          </w:tcPr>
+          <w:p>
+            <w:pPr>
+              <w:rPr>
+                <w:rFonts w:ascii="Cambria" w:hAnsi="Cambria"/>
+              </w:rPr>
+            </w:pPr>
+            <w:r>
+              <w:rPr>
+                <w:rFonts w:ascii="Cambria" w:hAnsi="Cambria"/>
+              </w:rPr>
+              <w:t>68m57.772s</w:t>
+            </w:r>
+          </w:p>
+        </w:tc>
+        <w:tc>
+          <w:tcPr>
+            <w:tcW w:w="2832" w:type="dxa"/>
+          </w:tcPr>
+          <w:p>
+            <w:pPr>
+              <w:rPr>
+                <w:rFonts w:ascii="Cambria" w:hAnsi="Cambria"/>
+              </w:rPr>
+            </w:pPr>
+            <w:r>
+              <w:rPr>
+                <w:rFonts w:ascii="Cambria" w:hAnsi="Cambria"/>
+              </w:rPr>
+              <w:t>Killed (no se ha llegado a completar)</w:t>
+            </w:r>
+          </w:p>
+        </w:tc>
+      </w:tr>
+      <w:tr>
+        <w:tc>
+          <w:tcPr>
+            <w:tcW w:w="2831" w:type="dxa"/>
+          </w:tcPr>
+          <w:p>
+            <w:pPr>
+              <w:rPr>
+                <w:rFonts w:ascii="Cambria" w:hAnsi="Cambria"/>
+              </w:rPr>
+            </w:pPr>
+            <w:r>
+              <w:rPr>
+                <w:rFonts w:ascii="Cambria" w:hAnsi="Cambria"/>
+              </w:rPr>
+              <w:t>A* + hMAX</w:t>
+            </w:r>
+          </w:p>
+        </w:tc>
+        <w:tc>
+          <w:tcPr>
+            <w:tcW w:w="2831" w:type="dxa"/>
+          </w:tcPr>
+          <w:p>
+            <w:pPr>
+              <w:rPr>
+                <w:rFonts w:ascii="Cambria" w:hAnsi="Cambria"/>
+              </w:rPr>
+            </w:pPr>
+            <w:r>
+              <w:rPr>
+                <w:rFonts w:ascii="Cambria" w:hAnsi="Cambria"/>
+              </w:rPr>
+              <w:t>8.672s</w:t>
+            </w:r>
+          </w:p>
+        </w:tc>
+        <w:tc>
+          <w:tcPr>
+            <w:tcW w:w="2832" w:type="dxa"/>
+          </w:tcPr>
+          <w:p>
+            <w:pPr>
+              <w:rPr>
+                <w:rFonts w:ascii="Cambria" w:hAnsi="Cambria"/>
+              </w:rPr>
+            </w:pPr>
+            <w:r>
+              <w:rPr>
+                <w:rFonts w:ascii="Cambria" w:hAnsi="Cambria"/>
+              </w:rPr>
+              <w:t>17</w:t>
+            </w:r>
+          </w:p>
+        </w:tc>
+      </w:tr>
+      <w:tr>
+        <w:tc>
+          <w:tcPr>
+            <w:tcW w:w="2831" w:type="dxa"/>
+          </w:tcPr>
+          <w:p>
+            <w:pPr>
+              <w:rPr>
+                <w:rFonts w:ascii="Cambria" w:hAnsi="Cambria"/>
+              </w:rPr>
+            </w:pPr>
+            <w:r>
+              <w:rPr>
+                <w:rFonts w:ascii="Cambria" w:hAnsi="Cambria"/>
+              </w:rPr>
+              <w:t>A* + lmcut</w:t>
+            </w:r>
+          </w:p>
+        </w:tc>
+        <w:tc>
+          <w:tcPr>
+            <w:tcW w:w="2831" w:type="dxa"/>
+          </w:tcPr>
+          <w:p>
+            <w:pPr>
+              <w:rPr>
+                <w:rFonts w:ascii="Cambria" w:hAnsi="Cambria"/>
+              </w:rPr>
+            </w:pPr>
+            <w:r>
+              <w:rPr>
+                <w:rFonts w:ascii="Cambria" w:hAnsi="Cambria"/>
+              </w:rPr>
+              <w:t>35.282s</w:t>
+            </w:r>
+          </w:p>
+        </w:tc>
+        <w:tc>
+          <w:tcPr>
+            <w:tcW w:w="2832" w:type="dxa"/>
+          </w:tcPr>
+          <w:p>
+            <w:pPr>
+              <w:rPr>
+                <w:rFonts w:ascii="Cambria" w:hAnsi="Cambria"/>
+              </w:rPr>
+            </w:pPr>
+            <w:r>
+              <w:rPr>
+                <w:rFonts w:ascii="Cambria" w:hAnsi="Cambria"/>
+              </w:rPr>
+              <w:t>17</w:t>
+            </w:r>
+          </w:p>
+        </w:tc>
+      </w:tr>
+    </w:tbl>
     <w:p>
       <w:pPr>
         <w:rPr>
@@ -6783,7 +8408,7 @@
 </file>
 
 <file path=word/numbering.xml><?xml version="1.0" encoding="utf-8"?>
-<w:numbering xmlns:wpc="http://schemas.microsoft.com/office/word/2010/wordprocessingCanvas" xmlns:cx="http://schemas.microsoft.com/office/drawing/2014/chartex" xmlns:cx1="http://schemas.microsoft.com/office/drawing/2015/9/8/chartex" xmlns:cx2="http://schemas.microsoft.com/office/drawing/2015/10/21/chartex" xmlns:cx3="http://schemas.microsoft.com/office/drawing/2016/5/9/chartex" xmlns:cx4="http://schemas.microsoft.com/office/drawing/2016/5/10/chartex" xmlns:cx5="http://schemas.microsoft.com/office/drawing/2016/5/11/chartex" xmlns:cx6="http://schemas.microsoft.com/office/drawing/2016/5/12/chartex" xmlns:cx7="http://schemas.microsoft.com/office/drawing/2016/5/13/chartex" xmlns:cx8="http://schemas.microsoft.com/office/drawing/2016/5/14/chartex" xmlns:mc="http://schemas.openxmlformats.org/markup-compatibility/2006" xmlns:aink="http://schemas.microsoft.com/office/drawing/2016/ink" xmlns:am3d="http://schemas.microsoft.com/office/drawing/2017/model3d" xmlns:o="urn:schemas-microsoft-com:office:office" xmlns:oel="http://schemas.microsoft.com/office/2019/extlst" xmlns:r="http://schemas.openxmlformats.org/officeDocument/2006/relationships" xmlns:m="http://schemas.openxmlformats.org/officeDocument/2006/math" xmlns:v="urn:schemas-microsoft-com:vml" xmlns:wp14="http://schemas.microsoft.com/office/word/2010/wordprocessingDrawing" xmlns:wp="http://schemas.openxmlformats.org/drawingml/2006/wordprocessingDrawing" xmlns:w10="urn:schemas-microsoft-com:office:word" xmlns:w="http://schemas.openxmlformats.org/wordprocessingml/2006/main" xmlns:w14="http://schemas.microsoft.com/office/word/2010/wordml" xmlns:w15="http://schemas.microsoft.com/office/word/2012/wordml" xmlns:w16cex="http://schemas.microsoft.com/office/word/2018/wordml/cex" xmlns:w16cid="http://schemas.microsoft.com/office/word/2016/wordml/cid" xmlns:w16="http://schemas.microsoft.com/office/word/2018/wordml" xmlns:w16sdtdh="http://schemas.microsoft.com/office/word/2020/wordml/sdtdatahash" xmlns:w16se="http://schemas.microsoft.com/office/word/2015/wordml/symex" xmlns:wpg="http://schemas.microsoft.com/office/word/2010/wordprocessingGroup" xmlns:wpi="http://schemas.microsoft.com/office/word/2010/wordprocessingInk" xmlns:wne="http://schemas.microsoft.com/office/word/2006/wordml" xmlns:wps="http://schemas.microsoft.com/office/word/2010/wordprocessingShape" mc:Ignorable="w14 w15 w16se w16cid w16 w16cex w16sdtdh wp14">
+<w:numbering xmlns:wpc="http://schemas.microsoft.com/office/word/2010/wordprocessingCanvas" xmlns:cx="http://schemas.microsoft.com/office/drawing/2014/chartex" xmlns:cx1="http://schemas.microsoft.com/office/drawing/2015/9/8/chartex" xmlns:cx2="http://schemas.microsoft.com/office/drawing/2015/10/21/chartex" xmlns:cx3="http://schemas.microsoft.com/office/drawing/2016/5/9/chartex" xmlns:cx4="http://schemas.microsoft.com/office/drawing/2016/5/10/chartex" xmlns:cx5="http://schemas.microsoft.com/office/drawing/2016/5/11/chartex" xmlns:cx6="http://schemas.microsoft.com/office/drawing/2016/5/12/chartex" xmlns:cx7="http://schemas.microsoft.com/office/drawing/2016/5/13/chartex" xmlns:cx8="http://schemas.microsoft.com/office/drawing/2016/5/14/chartex" xmlns:mc="http://schemas.openxmlformats.org/markup-compatibility/2006" xmlns:aink="http://schemas.microsoft.com/office/drawing/2016/ink" xmlns:am3d="http://schemas.microsoft.com/office/drawing/2017/model3d" xmlns:o="urn:schemas-microsoft-com:office:office" xmlns:oel="http://schemas.microsoft.com/office/2019/extlst" xmlns:r="http://schemas.openxmlformats.org/officeDocument/2006/relationships" xmlns:m="http://schemas.openxmlformats.org/officeDocument/2006/math" xmlns:v="urn:schemas-microsoft-com:vml" xmlns:wp14="http://schemas.microsoft.com/office/word/2010/wordprocessingDrawing" xmlns:wp="http://schemas.openxmlformats.org/drawingml/2006/wordprocessingDrawing" xmlns:w10="urn:schemas-microsoft-com:office:word" xmlns:w="http://schemas.openxmlformats.org/wordprocessingml/2006/main" xmlns:w14="http://schemas.microsoft.com/office/word/2010/wordml" xmlns:w15="http://schemas.microsoft.com/office/word/2012/wordml" xmlns:w16cex="http://schemas.microsoft.com/office/word/2018/wordml/cex" xmlns:w16cid="http://schemas.microsoft.com/office/word/2016/wordml/cid" xmlns:w16="http://schemas.microsoft.com/office/word/2018/wordml" xmlns:w16du="http://schemas.microsoft.com/office/word/2023/wordml/word16du" xmlns:w16sdtdh="http://schemas.microsoft.com/office/word/2020/wordml/sdtdatahash" xmlns:w16sdtfl="http://schemas.microsoft.com/office/word/2024/wordml/sdtformatlock" xmlns:w16se="http://schemas.microsoft.com/office/word/2015/wordml/symex" xmlns:wpg="http://schemas.microsoft.com/office/word/2010/wordprocessingGroup" xmlns:wpi="http://schemas.microsoft.com/office/word/2010/wordprocessingInk" xmlns:wne="http://schemas.microsoft.com/office/word/2006/wordml" xmlns:wps="http://schemas.microsoft.com/office/word/2010/wordprocessingShape" mc:Ignorable="w14 w15 w16se w16cid w16 w16cex w16sdtdh w16sdtfl w16du wp14">
   <w:abstractNum w:abstractNumId="0" w15:restartNumberingAfterBreak="0">
     <w:nsid w:val="056B05C5"/>
     <w:multiLevelType w:val="multilevel"/>
@@ -8537,6 +10162,119 @@
     </w:lvl>
   </w:abstractNum>
   <w:abstractNum w:abstractNumId="12" w15:restartNumberingAfterBreak="0">
+    <w:nsid w:val="67B12C4F"/>
+    <w:multiLevelType w:val="hybridMultilevel"/>
+    <w:tmpl w:val="000AD632"/>
+    <w:lvl w:ilvl="0" w:tplc="0C0A0001">
+      <w:start w:val="1"/>
+      <w:numFmt w:val="bullet"/>
+      <w:lvlText w:val=""/>
+      <w:lvlJc w:val="left"/>
+      <w:pPr>
+        <w:ind w:left="720" w:hanging="360"/>
+      </w:pPr>
+      <w:rPr>
+        <w:rFonts w:ascii="Symbol" w:hAnsi="Symbol" w:hint="default"/>
+      </w:rPr>
+    </w:lvl>
+    <w:lvl w:ilvl="1" w:tplc="0C0A0003" w:tentative="1">
+      <w:start w:val="1"/>
+      <w:numFmt w:val="bullet"/>
+      <w:lvlText w:val="o"/>
+      <w:lvlJc w:val="left"/>
+      <w:pPr>
+        <w:ind w:left="1440" w:hanging="360"/>
+      </w:pPr>
+      <w:rPr>
+        <w:rFonts w:ascii="Courier New" w:hAnsi="Courier New" w:cs="Courier New" w:hint="default"/>
+      </w:rPr>
+    </w:lvl>
+    <w:lvl w:ilvl="2" w:tplc="0C0A0005" w:tentative="1">
+      <w:start w:val="1"/>
+      <w:numFmt w:val="bullet"/>
+      <w:lvlText w:val=""/>
+      <w:lvlJc w:val="left"/>
+      <w:pPr>
+        <w:ind w:left="2160" w:hanging="360"/>
+      </w:pPr>
+      <w:rPr>
+        <w:rFonts w:ascii="Wingdings" w:hAnsi="Wingdings" w:hint="default"/>
+      </w:rPr>
+    </w:lvl>
+    <w:lvl w:ilvl="3" w:tplc="0C0A0001" w:tentative="1">
+      <w:start w:val="1"/>
+      <w:numFmt w:val="bullet"/>
+      <w:lvlText w:val=""/>
+      <w:lvlJc w:val="left"/>
+      <w:pPr>
+        <w:ind w:left="2880" w:hanging="360"/>
+      </w:pPr>
+      <w:rPr>
+        <w:rFonts w:ascii="Symbol" w:hAnsi="Symbol" w:hint="default"/>
+      </w:rPr>
+    </w:lvl>
+    <w:lvl w:ilvl="4" w:tplc="0C0A0003" w:tentative="1">
+      <w:start w:val="1"/>
+      <w:numFmt w:val="bullet"/>
+      <w:lvlText w:val="o"/>
+      <w:lvlJc w:val="left"/>
+      <w:pPr>
+        <w:ind w:left="3600" w:hanging="360"/>
+      </w:pPr>
+      <w:rPr>
+        <w:rFonts w:ascii="Courier New" w:hAnsi="Courier New" w:cs="Courier New" w:hint="default"/>
+      </w:rPr>
+    </w:lvl>
+    <w:lvl w:ilvl="5" w:tplc="0C0A0005" w:tentative="1">
+      <w:start w:val="1"/>
+      <w:numFmt w:val="bullet"/>
+      <w:lvlText w:val=""/>
+      <w:lvlJc w:val="left"/>
+      <w:pPr>
+        <w:ind w:left="4320" w:hanging="360"/>
+      </w:pPr>
+      <w:rPr>
+        <w:rFonts w:ascii="Wingdings" w:hAnsi="Wingdings" w:hint="default"/>
+      </w:rPr>
+    </w:lvl>
+    <w:lvl w:ilvl="6" w:tplc="0C0A0001" w:tentative="1">
+      <w:start w:val="1"/>
+      <w:numFmt w:val="bullet"/>
+      <w:lvlText w:val=""/>
+      <w:lvlJc w:val="left"/>
+      <w:pPr>
+        <w:ind w:left="5040" w:hanging="360"/>
+      </w:pPr>
+      <w:rPr>
+        <w:rFonts w:ascii="Symbol" w:hAnsi="Symbol" w:hint="default"/>
+      </w:rPr>
+    </w:lvl>
+    <w:lvl w:ilvl="7" w:tplc="0C0A0003" w:tentative="1">
+      <w:start w:val="1"/>
+      <w:numFmt w:val="bullet"/>
+      <w:lvlText w:val="o"/>
+      <w:lvlJc w:val="left"/>
+      <w:pPr>
+        <w:ind w:left="5760" w:hanging="360"/>
+      </w:pPr>
+      <w:rPr>
+        <w:rFonts w:ascii="Courier New" w:hAnsi="Courier New" w:cs="Courier New" w:hint="default"/>
+      </w:rPr>
+    </w:lvl>
+    <w:lvl w:ilvl="8" w:tplc="0C0A0005" w:tentative="1">
+      <w:start w:val="1"/>
+      <w:numFmt w:val="bullet"/>
+      <w:lvlText w:val=""/>
+      <w:lvlJc w:val="left"/>
+      <w:pPr>
+        <w:ind w:left="6480" w:hanging="360"/>
+      </w:pPr>
+      <w:rPr>
+        <w:rFonts w:ascii="Wingdings" w:hAnsi="Wingdings" w:hint="default"/>
+      </w:rPr>
+    </w:lvl>
+  </w:abstractNum>
+  <w:abstractNum w:abstractNumId="13" w15:restartNumberingAfterBreak="0">
     <w:nsid w:val="69C33A03"/>
     <w:multiLevelType w:val="multilevel"/>
     <w:tmpl w:val="75BAEA7C"/>
@@ -8685,7 +10423,7 @@
       </w:rPr>
     </w:lvl>
   </w:abstractNum>
-  <w:abstractNum w:abstractNumId="13" w15:restartNumberingAfterBreak="0">
+  <w:abstractNum w:abstractNumId="14" w15:restartNumberingAfterBreak="0">
     <w:nsid w:val="6D884B74"/>
     <w:multiLevelType w:val="multilevel"/>
     <w:tmpl w:val="E3D4EFBC"/>
@@ -8834,7 +10572,7 @@
       </w:rPr>
     </w:lvl>
   </w:abstractNum>
-  <w:abstractNum w:abstractNumId="14" w15:restartNumberingAfterBreak="0">
+  <w:abstractNum w:abstractNumId="15" w15:restartNumberingAfterBreak="0">
     <w:nsid w:val="755055C6"/>
     <w:multiLevelType w:val="multilevel"/>
     <w:tmpl w:val="0F569F9E"/>
@@ -8983,7 +10721,7 @@
       </w:rPr>
     </w:lvl>
   </w:abstractNum>
-  <w:abstractNum w:abstractNumId="15" w15:restartNumberingAfterBreak="0">
+  <w:abstractNum w:abstractNumId="16" w15:restartNumberingAfterBreak="0">
     <w:nsid w:val="76CB24F9"/>
     <w:multiLevelType w:val="multilevel"/>
     <w:tmpl w:val="23409176"/>
@@ -9132,7 +10870,7 @@
       </w:rPr>
     </w:lvl>
   </w:abstractNum>
-  <w:abstractNum w:abstractNumId="16" w15:restartNumberingAfterBreak="0">
+  <w:abstractNum w:abstractNumId="17" w15:restartNumberingAfterBreak="0">
     <w:nsid w:val="79447753"/>
     <w:multiLevelType w:val="multilevel"/>
     <w:tmpl w:val="DFE2A3A4"/>
@@ -9281,7 +11019,7 @@
       </w:rPr>
     </w:lvl>
   </w:abstractNum>
-  <w:abstractNum w:abstractNumId="17" w15:restartNumberingAfterBreak="0">
+  <w:abstractNum w:abstractNumId="18" w15:restartNumberingAfterBreak="0">
     <w:nsid w:val="7D6B5522"/>
     <w:multiLevelType w:val="multilevel"/>
     <w:tmpl w:val="7F00B336"/>
@@ -9443,13 +11181,13 @@
     <w:abstractNumId w:val="6"/>
   </w:num>
   <w:num w:numId="5" w16cid:durableId="1630546859">
-    <w:abstractNumId w:val="17"/>
+    <w:abstractNumId w:val="18"/>
   </w:num>
   <w:num w:numId="6" w16cid:durableId="1203055017">
-    <w:abstractNumId w:val="13"/>
+    <w:abstractNumId w:val="14"/>
   </w:num>
   <w:num w:numId="7" w16cid:durableId="582763765">
-    <w:abstractNumId w:val="12"/>
+    <w:abstractNumId w:val="13"/>
   </w:num>
   <w:num w:numId="8" w16cid:durableId="61565167">
     <w:abstractNumId w:val="4"/>
@@ -9461,7 +11199,7 @@
     <w:abstractNumId w:val="10"/>
   </w:num>
   <w:num w:numId="11" w16cid:durableId="613172834">
-    <w:abstractNumId w:val="16"/>
+    <w:abstractNumId w:val="17"/>
   </w:num>
   <w:num w:numId="12" w16cid:durableId="592469996">
     <w:abstractNumId w:val="9"/>
@@ -9476,19 +11214,22 @@
     <w:abstractNumId w:val="2"/>
   </w:num>
   <w:num w:numId="16" w16cid:durableId="2126389504">
-    <w:abstractNumId w:val="15"/>
+    <w:abstractNumId w:val="16"/>
   </w:num>
   <w:num w:numId="17" w16cid:durableId="980767849">
-    <w:abstractNumId w:val="14"/>
+    <w:abstractNumId w:val="15"/>
   </w:num>
   <w:num w:numId="18" w16cid:durableId="348916697">
     <w:abstractNumId w:val="8"/>
+  </w:num>
+  <w:num w:numId="19" w16cid:durableId="359362830">
+    <w:abstractNumId w:val="12"/>
   </w:num>
 </w:numbering>
 </file>
 
 <file path=word/styles.xml><?xml version="1.0" encoding="utf-8"?>
-<w:styles xmlns:mc="http://schemas.openxmlformats.org/markup-compatibility/2006" xmlns:r="http://schemas.openxmlformats.org/officeDocument/2006/relationships" xmlns:w="http://schemas.openxmlformats.org/wordprocessingml/2006/main" xmlns:w14="http://schemas.microsoft.com/office/word/2010/wordml" xmlns:w15="http://schemas.microsoft.com/office/word/2012/wordml" xmlns:w16cex="http://schemas.microsoft.com/office/word/2018/wordml/cex" xmlns:w16cid="http://schemas.microsoft.com/office/word/2016/wordml/cid" xmlns:w16="http://schemas.microsoft.com/office/word/2018/wordml" xmlns:w16sdtdh="http://schemas.microsoft.com/office/word/2020/wordml/sdtdatahash" xmlns:w16se="http://schemas.microsoft.com/office/word/2015/wordml/symex" mc:Ignorable="w14 w15 w16se w16cid w16 w16cex w16sdtdh">
+<w:styles xmlns:mc="http://schemas.openxmlformats.org/markup-compatibility/2006" xmlns:r="http://schemas.openxmlformats.org/officeDocument/2006/relationships" xmlns:w="http://schemas.openxmlformats.org/wordprocessingml/2006/main" xmlns:w14="http://schemas.microsoft.com/office/word/2010/wordml" xmlns:w15="http://schemas.microsoft.com/office/word/2012/wordml" xmlns:w16cex="http://schemas.microsoft.com/office/word/2018/wordml/cex" xmlns:w16cid="http://schemas.microsoft.com/office/word/2016/wordml/cid" xmlns:w16="http://schemas.microsoft.com/office/word/2018/wordml" xmlns:w16du="http://schemas.microsoft.com/office/word/2023/wordml/word16du" xmlns:w16sdtdh="http://schemas.microsoft.com/office/word/2020/wordml/sdtdatahash" xmlns:w16sdtfl="http://schemas.microsoft.com/office/word/2024/wordml/sdtformatlock" xmlns:w16se="http://schemas.microsoft.com/office/word/2015/wordml/symex" mc:Ignorable="w14 w15 w16se w16cid w16 w16cex w16sdtdh w16sdtfl w16du">
   <w:docDefaults>
     <w:rPrDefault>
       <w:rPr>
@@ -9887,6 +11628,7 @@
   <w:style w:type="paragraph" w:default="1" w:styleId="Normal">
     <w:name w:val="Normal"/>
     <w:qFormat/>
+    <w:rsid w:val="00F44731"/>
   </w:style>
   <w:style w:type="paragraph" w:styleId="Ttulo1">
     <w:name w:val="heading 1"/>

</xml_diff>

<commit_message>
Ejercicio 2.2 Puntos 1-4
</commit_message>
<xml_diff>
--- a/Memoria PL1.docx
+++ b/Memoria PL1.docx
@@ -1,6 +1,6 @@
 
 <file path=word/document.xml><?xml version="1.0" encoding="utf-8"?>
-<w:document xmlns:wpc="http://schemas.microsoft.com/office/word/2010/wordprocessingCanvas" xmlns:cx="http://schemas.microsoft.com/office/drawing/2014/chartex" xmlns:cx1="http://schemas.microsoft.com/office/drawing/2015/9/8/chartex" xmlns:cx2="http://schemas.microsoft.com/office/drawing/2015/10/21/chartex" xmlns:cx3="http://schemas.microsoft.com/office/drawing/2016/5/9/chartex" xmlns:cx4="http://schemas.microsoft.com/office/drawing/2016/5/10/chartex" xmlns:cx5="http://schemas.microsoft.com/office/drawing/2016/5/11/chartex" xmlns:cx6="http://schemas.microsoft.com/office/drawing/2016/5/12/chartex" xmlns:cx7="http://schemas.microsoft.com/office/drawing/2016/5/13/chartex" xmlns:cx8="http://schemas.microsoft.com/office/drawing/2016/5/14/chartex" xmlns:mc="http://schemas.openxmlformats.org/markup-compatibility/2006" xmlns:aink="http://schemas.microsoft.com/office/drawing/2016/ink" xmlns:am3d="http://schemas.microsoft.com/office/drawing/2017/model3d" xmlns:o="urn:schemas-microsoft-com:office:office" xmlns:oel="http://schemas.microsoft.com/office/2019/extlst" xmlns:r="http://schemas.openxmlformats.org/officeDocument/2006/relationships" xmlns:m="http://schemas.openxmlformats.org/officeDocument/2006/math" xmlns:v="urn:schemas-microsoft-com:vml" xmlns:wp14="http://schemas.microsoft.com/office/word/2010/wordprocessingDrawing" xmlns:wp="http://schemas.openxmlformats.org/drawingml/2006/wordprocessingDrawing" xmlns:w10="urn:schemas-microsoft-com:office:word" xmlns:w="http://schemas.openxmlformats.org/wordprocessingml/2006/main" xmlns:w14="http://schemas.microsoft.com/office/word/2010/wordml" xmlns:w15="http://schemas.microsoft.com/office/word/2012/wordml" xmlns:w16cex="http://schemas.microsoft.com/office/word/2018/wordml/cex" xmlns:w16cid="http://schemas.microsoft.com/office/word/2016/wordml/cid" xmlns:w16="http://schemas.microsoft.com/office/word/2018/wordml" xmlns:w16sdtdh="http://schemas.microsoft.com/office/word/2020/wordml/sdtdatahash" xmlns:w16se="http://schemas.microsoft.com/office/word/2015/wordml/symex" xmlns:wpg="http://schemas.microsoft.com/office/word/2010/wordprocessingGroup" xmlns:wpi="http://schemas.microsoft.com/office/word/2010/wordprocessingInk" xmlns:wne="http://schemas.microsoft.com/office/word/2006/wordml" xmlns:wps="http://schemas.microsoft.com/office/word/2010/wordprocessingShape" mc:Ignorable="w14 w15 w16se w16cid w16 w16cex w16sdtdh wp14">
+<w:document xmlns:wpc="http://schemas.microsoft.com/office/word/2010/wordprocessingCanvas" xmlns:cx="http://schemas.microsoft.com/office/drawing/2014/chartex" xmlns:cx1="http://schemas.microsoft.com/office/drawing/2015/9/8/chartex" xmlns:cx2="http://schemas.microsoft.com/office/drawing/2015/10/21/chartex" xmlns:cx3="http://schemas.microsoft.com/office/drawing/2016/5/9/chartex" xmlns:cx4="http://schemas.microsoft.com/office/drawing/2016/5/10/chartex" xmlns:cx5="http://schemas.microsoft.com/office/drawing/2016/5/11/chartex" xmlns:cx6="http://schemas.microsoft.com/office/drawing/2016/5/12/chartex" xmlns:cx7="http://schemas.microsoft.com/office/drawing/2016/5/13/chartex" xmlns:cx8="http://schemas.microsoft.com/office/drawing/2016/5/14/chartex" xmlns:mc="http://schemas.openxmlformats.org/markup-compatibility/2006" xmlns:aink="http://schemas.microsoft.com/office/drawing/2016/ink" xmlns:am3d="http://schemas.microsoft.com/office/drawing/2017/model3d" xmlns:o="urn:schemas-microsoft-com:office:office" xmlns:oel="http://schemas.microsoft.com/office/2019/extlst" xmlns:r="http://schemas.openxmlformats.org/officeDocument/2006/relationships" xmlns:m="http://schemas.openxmlformats.org/officeDocument/2006/math" xmlns:v="urn:schemas-microsoft-com:vml" xmlns:wp14="http://schemas.microsoft.com/office/word/2010/wordprocessingDrawing" xmlns:wp="http://schemas.openxmlformats.org/drawingml/2006/wordprocessingDrawing" xmlns:w10="urn:schemas-microsoft-com:office:word" xmlns:w="http://schemas.openxmlformats.org/wordprocessingml/2006/main" xmlns:w14="http://schemas.microsoft.com/office/word/2010/wordml" xmlns:w15="http://schemas.microsoft.com/office/word/2012/wordml" xmlns:w16cex="http://schemas.microsoft.com/office/word/2018/wordml/cex" xmlns:w16cid="http://schemas.microsoft.com/office/word/2016/wordml/cid" xmlns:w16="http://schemas.microsoft.com/office/word/2018/wordml" xmlns:w16du="http://schemas.microsoft.com/office/word/2023/wordml/word16du" xmlns:w16sdtdh="http://schemas.microsoft.com/office/word/2020/wordml/sdtdatahash" xmlns:w16sdtfl="http://schemas.microsoft.com/office/word/2024/wordml/sdtformatlock" xmlns:w16se="http://schemas.microsoft.com/office/word/2015/wordml/symex" xmlns:wpg="http://schemas.microsoft.com/office/word/2010/wordprocessingGroup" xmlns:wpi="http://schemas.microsoft.com/office/word/2010/wordprocessingInk" xmlns:wne="http://schemas.microsoft.com/office/word/2006/wordml" xmlns:wps="http://schemas.microsoft.com/office/word/2010/wordprocessingShape" mc:Ignorable="w14 w15 w16se w16cid w16 w16cex w16sdtdh w16sdtfl w16du wp14">
   <w:body>
     <w:p>
       <w:pPr>
@@ -548,7 +548,21 @@
         <w:rPr>
           <w:rFonts w:ascii="Cambria" w:hAnsi="Cambria"/>
         </w:rPr>
-        <w:t xml:space="preserve"> (nivel STRIPS con :typing) que representa un sistema de </w:t>
+        <w:t xml:space="preserve"> (nivel STRIPS con :</w:t>
+      </w:r>
+      <w:proofErr w:type="spellStart"/>
+      <w:r>
+        <w:rPr>
+          <w:rFonts w:ascii="Cambria" w:hAnsi="Cambria"/>
+        </w:rPr>
+        <w:t>typing</w:t>
+      </w:r>
+      <w:proofErr w:type="spellEnd"/>
+      <w:r>
+        <w:rPr>
+          <w:rFonts w:ascii="Cambria" w:hAnsi="Cambria"/>
+        </w:rPr>
+        <w:t xml:space="preserve">) que representa un sistema de </w:t>
       </w:r>
       <w:r>
         <w:rPr>
@@ -659,7 +673,21 @@
         <w:rPr>
           <w:rFonts w:ascii="Cambria" w:hAnsi="Cambria"/>
         </w:rPr>
-        <w:t xml:space="preserve">so de :typing, no </w:t>
+        <w:t>so de :</w:t>
+      </w:r>
+      <w:proofErr w:type="spellStart"/>
+      <w:r>
+        <w:rPr>
+          <w:rFonts w:ascii="Cambria" w:hAnsi="Cambria"/>
+        </w:rPr>
+        <w:t>typing</w:t>
+      </w:r>
+      <w:proofErr w:type="spellEnd"/>
+      <w:r>
+        <w:rPr>
+          <w:rFonts w:ascii="Cambria" w:hAnsi="Cambria"/>
+        </w:rPr>
+        <w:t xml:space="preserve">, no </w:t>
       </w:r>
       <w:r>
         <w:rPr>
@@ -760,11 +788,19 @@
           <w:rFonts w:ascii="Cambria" w:hAnsi="Cambria"/>
         </w:rPr>
       </w:pPr>
-      <w:r>
-        <w:rPr>
-          <w:rFonts w:ascii="Cambria" w:hAnsi="Cambria"/>
-        </w:rPr>
-        <w:t>drone: representa los drones disponibles.</w:t>
+      <w:proofErr w:type="spellStart"/>
+      <w:r>
+        <w:rPr>
+          <w:rFonts w:ascii="Cambria" w:hAnsi="Cambria"/>
+        </w:rPr>
+        <w:t>drone</w:t>
+      </w:r>
+      <w:proofErr w:type="spellEnd"/>
+      <w:r>
+        <w:rPr>
+          <w:rFonts w:ascii="Cambria" w:hAnsi="Cambria"/>
+        </w:rPr>
+        <w:t>: representa los drones disponibles.</w:t>
       </w:r>
     </w:p>
     <w:p>
@@ -777,11 +813,19 @@
           <w:rFonts w:ascii="Cambria" w:hAnsi="Cambria"/>
         </w:rPr>
       </w:pPr>
-      <w:r>
-        <w:rPr>
-          <w:rFonts w:ascii="Cambria" w:hAnsi="Cambria"/>
-        </w:rPr>
-        <w:t>person: personas heridas.</w:t>
+      <w:proofErr w:type="spellStart"/>
+      <w:r>
+        <w:rPr>
+          <w:rFonts w:ascii="Cambria" w:hAnsi="Cambria"/>
+        </w:rPr>
+        <w:t>person</w:t>
+      </w:r>
+      <w:proofErr w:type="spellEnd"/>
+      <w:r>
+        <w:rPr>
+          <w:rFonts w:ascii="Cambria" w:hAnsi="Cambria"/>
+        </w:rPr>
+        <w:t>: personas heridas.</w:t>
       </w:r>
     </w:p>
     <w:p>
@@ -794,11 +838,19 @@
           <w:rFonts w:ascii="Cambria" w:hAnsi="Cambria"/>
         </w:rPr>
       </w:pPr>
-      <w:r>
-        <w:rPr>
-          <w:rFonts w:ascii="Cambria" w:hAnsi="Cambria"/>
-        </w:rPr>
-        <w:t>crate: cajas transportables.</w:t>
+      <w:proofErr w:type="spellStart"/>
+      <w:r>
+        <w:rPr>
+          <w:rFonts w:ascii="Cambria" w:hAnsi="Cambria"/>
+        </w:rPr>
+        <w:t>crate</w:t>
+      </w:r>
+      <w:proofErr w:type="spellEnd"/>
+      <w:r>
+        <w:rPr>
+          <w:rFonts w:ascii="Cambria" w:hAnsi="Cambria"/>
+        </w:rPr>
+        <w:t>: cajas transportables.</w:t>
       </w:r>
     </w:p>
     <w:p>
@@ -811,11 +863,19 @@
           <w:rFonts w:ascii="Cambria" w:hAnsi="Cambria"/>
         </w:rPr>
       </w:pPr>
-      <w:r>
-        <w:rPr>
-          <w:rFonts w:ascii="Cambria" w:hAnsi="Cambria"/>
-        </w:rPr>
-        <w:t>location: localizaciones del problema.</w:t>
+      <w:proofErr w:type="spellStart"/>
+      <w:r>
+        <w:rPr>
+          <w:rFonts w:ascii="Cambria" w:hAnsi="Cambria"/>
+        </w:rPr>
+        <w:t>location</w:t>
+      </w:r>
+      <w:proofErr w:type="spellEnd"/>
+      <w:r>
+        <w:rPr>
+          <w:rFonts w:ascii="Cambria" w:hAnsi="Cambria"/>
+        </w:rPr>
+        <w:t>: localizaciones del problema.</w:t>
       </w:r>
     </w:p>
     <w:p>
@@ -828,11 +888,19 @@
           <w:rFonts w:ascii="Cambria" w:hAnsi="Cambria"/>
         </w:rPr>
       </w:pPr>
-      <w:r>
-        <w:rPr>
-          <w:rFonts w:ascii="Cambria" w:hAnsi="Cambria"/>
-        </w:rPr>
-        <w:t>content: tipo de contenido de las cajas (comida, medicina, etc.).</w:t>
+      <w:proofErr w:type="spellStart"/>
+      <w:r>
+        <w:rPr>
+          <w:rFonts w:ascii="Cambria" w:hAnsi="Cambria"/>
+        </w:rPr>
+        <w:t>content</w:t>
+      </w:r>
+      <w:proofErr w:type="spellEnd"/>
+      <w:r>
+        <w:rPr>
+          <w:rFonts w:ascii="Cambria" w:hAnsi="Cambria"/>
+        </w:rPr>
+        <w:t>: tipo de contenido de las cajas (comida, medicina, etc.).</w:t>
       </w:r>
     </w:p>
     <w:p>
@@ -845,12 +913,14 @@
           <w:rFonts w:ascii="Cambria" w:hAnsi="Cambria"/>
         </w:rPr>
       </w:pPr>
+      <w:proofErr w:type="spellStart"/>
       <w:r>
         <w:rPr>
           <w:rFonts w:ascii="Cambria" w:hAnsi="Cambria"/>
         </w:rPr>
         <w:t>arm</w:t>
       </w:r>
+      <w:proofErr w:type="spellEnd"/>
       <w:r>
         <w:rPr>
           <w:rFonts w:ascii="Cambria" w:hAnsi="Cambria"/>
@@ -882,7 +952,21 @@
         <w:rPr>
           <w:rFonts w:ascii="Cambria" w:hAnsi="Cambria"/>
         </w:rPr>
-        <w:t>La inclusión del tipo arm permite modelar correctamente la restricción de que el dron dispone de dos brazos y puede transportar como máximo dos cajas simultáneamente.</w:t>
+        <w:t xml:space="preserve">La inclusión del tipo </w:t>
+      </w:r>
+      <w:proofErr w:type="spellStart"/>
+      <w:r>
+        <w:rPr>
+          <w:rFonts w:ascii="Cambria" w:hAnsi="Cambria"/>
+        </w:rPr>
+        <w:t>arm</w:t>
+      </w:r>
+      <w:proofErr w:type="spellEnd"/>
+      <w:r>
+        <w:rPr>
+          <w:rFonts w:ascii="Cambria" w:hAnsi="Cambria"/>
+        </w:rPr>
+        <w:t xml:space="preserve"> permite modelar correctamente la restricción de que el dron dispone de dos brazos y puede transportar como máximo dos cajas simultáneamente.</w:t>
       </w:r>
     </w:p>
     <w:p>
@@ -974,7 +1058,55 @@
           <w:rFonts w:ascii="Cambria" w:hAnsi="Cambria"/>
           <w:lang w:val="en-US"/>
         </w:rPr>
-        <w:t>(at-drone ?d ?l), (at-person ?p ?l), (at-crate ?c ?l)</w:t>
+        <w:t>(at-</w:t>
+      </w:r>
+      <w:proofErr w:type="gramStart"/>
+      <w:r>
+        <w:rPr>
+          <w:rFonts w:ascii="Cambria" w:hAnsi="Cambria"/>
+          <w:lang w:val="en-US"/>
+        </w:rPr>
+        <w:t>drone ?d ?l</w:t>
+      </w:r>
+      <w:proofErr w:type="gramEnd"/>
+      <w:r>
+        <w:rPr>
+          <w:rFonts w:ascii="Cambria" w:hAnsi="Cambria"/>
+          <w:lang w:val="en-US"/>
+        </w:rPr>
+        <w:t>), (at-</w:t>
+      </w:r>
+      <w:proofErr w:type="gramStart"/>
+      <w:r>
+        <w:rPr>
+          <w:rFonts w:ascii="Cambria" w:hAnsi="Cambria"/>
+          <w:lang w:val="en-US"/>
+        </w:rPr>
+        <w:t>person ?p ?l</w:t>
+      </w:r>
+      <w:proofErr w:type="gramEnd"/>
+      <w:r>
+        <w:rPr>
+          <w:rFonts w:ascii="Cambria" w:hAnsi="Cambria"/>
+          <w:lang w:val="en-US"/>
+        </w:rPr>
+        <w:t>), (at-</w:t>
+      </w:r>
+      <w:proofErr w:type="gramStart"/>
+      <w:r>
+        <w:rPr>
+          <w:rFonts w:ascii="Cambria" w:hAnsi="Cambria"/>
+          <w:lang w:val="en-US"/>
+        </w:rPr>
+        <w:t>crate ?c ?l</w:t>
+      </w:r>
+      <w:proofErr w:type="gramEnd"/>
+      <w:r>
+        <w:rPr>
+          <w:rFonts w:ascii="Cambria" w:hAnsi="Cambria"/>
+          <w:lang w:val="en-US"/>
+        </w:rPr>
+        <w:t>)</w:t>
       </w:r>
     </w:p>
     <w:p>
@@ -990,6 +1122,7 @@
       <w:r>
         <w:t xml:space="preserve"> </w:t>
       </w:r>
+      <w:proofErr w:type="gramStart"/>
       <w:r>
         <w:rPr>
           <w:rFonts w:ascii="Cambria" w:hAnsi="Cambria"/>
@@ -1044,7 +1177,16 @@
           <w:b/>
           <w:bCs/>
         </w:rPr>
-        <w:t>?l</w:t>
+        <w:t>?</w:t>
+      </w:r>
+      <w:proofErr w:type="gramEnd"/>
+      <w:r>
+        <w:rPr>
+          <w:rFonts w:ascii="Cambria" w:hAnsi="Cambria"/>
+          <w:b/>
+          <w:bCs/>
+        </w:rPr>
+        <w:t>l</w:t>
       </w:r>
       <w:r>
         <w:rPr>
@@ -1054,6 +1196,7 @@
         </w:rPr>
         <w:t xml:space="preserve">; </w:t>
       </w:r>
+      <w:proofErr w:type="gramStart"/>
       <w:r>
         <w:rPr>
           <w:rFonts w:ascii="Cambria" w:hAnsi="Cambria"/>
@@ -1072,7 +1215,21 @@
         <w:rPr>
           <w:rFonts w:ascii="Cambria" w:hAnsi="Cambria"/>
         </w:rPr>
-        <w:t xml:space="preserve"> está en la ubicación ?l; La </w:t>
+        <w:t xml:space="preserve"> está en la ubicación ?</w:t>
+      </w:r>
+      <w:proofErr w:type="gramEnd"/>
+      <w:r>
+        <w:rPr>
+          <w:rFonts w:ascii="Cambria" w:hAnsi="Cambria"/>
+        </w:rPr>
+        <w:t xml:space="preserve">l; </w:t>
+      </w:r>
+      <w:proofErr w:type="gramStart"/>
+      <w:r>
+        <w:rPr>
+          <w:rFonts w:ascii="Cambria" w:hAnsi="Cambria"/>
+        </w:rPr>
+        <w:t xml:space="preserve">La </w:t>
       </w:r>
       <w:r>
         <w:rPr>
@@ -1102,7 +1259,16 @@
           <w:b/>
           <w:bCs/>
         </w:rPr>
-        <w:t xml:space="preserve"> ?l</w:t>
+        <w:t xml:space="preserve"> ?</w:t>
+      </w:r>
+      <w:proofErr w:type="gramEnd"/>
+      <w:r>
+        <w:rPr>
+          <w:rFonts w:ascii="Cambria" w:hAnsi="Cambria"/>
+          <w:b/>
+          <w:bCs/>
+        </w:rPr>
+        <w:t>l</w:t>
       </w:r>
       <w:r>
         <w:rPr>
@@ -1166,14 +1332,47 @@
         <w:jc w:val="both"/>
         <w:rPr>
           <w:rFonts w:ascii="Cambria" w:hAnsi="Cambria"/>
-        </w:rPr>
-      </w:pPr>
-      <w:r>
-        <w:rPr>
-          <w:rFonts w:ascii="Cambria" w:hAnsi="Cambria"/>
           <w:lang w:val="en-US"/>
         </w:rPr>
-        <w:t>(crate-has ?c - crate ?t - content)</w:t>
+      </w:pPr>
+      <w:r>
+        <w:rPr>
+          <w:rFonts w:ascii="Cambria" w:hAnsi="Cambria"/>
+          <w:lang w:val="en-US"/>
+        </w:rPr>
+        <w:t>(crate-</w:t>
+      </w:r>
+      <w:proofErr w:type="gramStart"/>
+      <w:r>
+        <w:rPr>
+          <w:rFonts w:ascii="Cambria" w:hAnsi="Cambria"/>
+          <w:lang w:val="en-US"/>
+        </w:rPr>
+        <w:t>has ?c</w:t>
+      </w:r>
+      <w:proofErr w:type="gramEnd"/>
+      <w:r>
+        <w:rPr>
+          <w:rFonts w:ascii="Cambria" w:hAnsi="Cambria"/>
+          <w:lang w:val="en-US"/>
+        </w:rPr>
+        <w:t xml:space="preserve"> - </w:t>
+      </w:r>
+      <w:proofErr w:type="gramStart"/>
+      <w:r>
+        <w:rPr>
+          <w:rFonts w:ascii="Cambria" w:hAnsi="Cambria"/>
+          <w:lang w:val="en-US"/>
+        </w:rPr>
+        <w:t>crate ?t</w:t>
+      </w:r>
+      <w:proofErr w:type="gramEnd"/>
+      <w:r>
+        <w:rPr>
+          <w:rFonts w:ascii="Cambria" w:hAnsi="Cambria"/>
+          <w:lang w:val="en-US"/>
+        </w:rPr>
+        <w:t xml:space="preserve"> - content)</w:t>
       </w:r>
     </w:p>
     <w:p>
@@ -1189,17 +1388,33 @@
         </w:rPr>
         <w:t>Esta decisión permite que el dominio sea completamente genérico respecto al tipo de contenidos. Si se desea añadir nuevos tipos (</w:t>
       </w:r>
+      <w:proofErr w:type="spellStart"/>
       <w:r>
         <w:rPr>
           <w:rFonts w:ascii="Cambria" w:hAnsi="Cambria"/>
         </w:rPr>
         <w:t>p.e</w:t>
       </w:r>
-      <w:r>
-        <w:rPr>
-          <w:rFonts w:ascii="Cambria" w:hAnsi="Cambria"/>
-        </w:rPr>
-        <w:t xml:space="preserve"> agua, mantas, etc.), basta con añadir nuevos objetos de tipo content en el problema, sin necesidad de modificar el dominio.</w:t>
+      <w:proofErr w:type="spellEnd"/>
+      <w:r>
+        <w:rPr>
+          <w:rFonts w:ascii="Cambria" w:hAnsi="Cambria"/>
+        </w:rPr>
+        <w:t xml:space="preserve"> agua, mantas, etc.), basta con añadir nuevos objetos de tipo </w:t>
+      </w:r>
+      <w:proofErr w:type="spellStart"/>
+      <w:r>
+        <w:rPr>
+          <w:rFonts w:ascii="Cambria" w:hAnsi="Cambria"/>
+        </w:rPr>
+        <w:t>content</w:t>
+      </w:r>
+      <w:proofErr w:type="spellEnd"/>
+      <w:r>
+        <w:rPr>
+          <w:rFonts w:ascii="Cambria" w:hAnsi="Cambria"/>
+        </w:rPr>
+        <w:t xml:space="preserve"> en el problema, sin necesidad de modificar el dominio.</w:t>
       </w:r>
     </w:p>
     <w:p>
@@ -1213,7 +1428,35 @@
         <w:rPr>
           <w:rFonts w:ascii="Cambria" w:hAnsi="Cambria"/>
         </w:rPr>
-        <w:t>Esto cumple explícitamente la restricción del enunciado de no utilizar predicados específicos como (caja-comida ?c) o (caja-medicina ?c).</w:t>
+        <w:t>Esto cumple explícitamente la restricción del enunciado de no utilizar predicados específicos como (</w:t>
+      </w:r>
+      <w:proofErr w:type="gramStart"/>
+      <w:r>
+        <w:rPr>
+          <w:rFonts w:ascii="Cambria" w:hAnsi="Cambria"/>
+        </w:rPr>
+        <w:t>caja-comida ?</w:t>
+      </w:r>
+      <w:proofErr w:type="gramEnd"/>
+      <w:r>
+        <w:rPr>
+          <w:rFonts w:ascii="Cambria" w:hAnsi="Cambria"/>
+        </w:rPr>
+        <w:t>c) o (</w:t>
+      </w:r>
+      <w:proofErr w:type="gramStart"/>
+      <w:r>
+        <w:rPr>
+          <w:rFonts w:ascii="Cambria" w:hAnsi="Cambria"/>
+        </w:rPr>
+        <w:t>caja-medicina ?</w:t>
+      </w:r>
+      <w:proofErr w:type="gramEnd"/>
+      <w:r>
+        <w:rPr>
+          <w:rFonts w:ascii="Cambria" w:hAnsi="Cambria"/>
+        </w:rPr>
+        <w:t>c).</w:t>
       </w:r>
     </w:p>
     <w:p>
@@ -1261,7 +1504,29 @@
         <w:rPr>
           <w:rFonts w:ascii="Cambria" w:hAnsi="Cambria"/>
         </w:rPr>
-        <w:t>(arm-of ?a ?d) → indica a qué dron pertenece cada brazo.</w:t>
+        <w:t>(</w:t>
+      </w:r>
+      <w:proofErr w:type="spellStart"/>
+      <w:proofErr w:type="gramStart"/>
+      <w:r>
+        <w:rPr>
+          <w:rFonts w:ascii="Cambria" w:hAnsi="Cambria"/>
+        </w:rPr>
+        <w:t>arm-of</w:t>
+      </w:r>
+      <w:proofErr w:type="spellEnd"/>
+      <w:r>
+        <w:rPr>
+          <w:rFonts w:ascii="Cambria" w:hAnsi="Cambria"/>
+        </w:rPr>
+        <w:t xml:space="preserve"> ?</w:t>
+      </w:r>
+      <w:proofErr w:type="gramEnd"/>
+      <w:r>
+        <w:rPr>
+          <w:rFonts w:ascii="Cambria" w:hAnsi="Cambria"/>
+        </w:rPr>
+        <w:t>a ?d) → indica a qué dron pertenece cada brazo.</w:t>
       </w:r>
     </w:p>
     <w:p>
@@ -1278,7 +1543,21 @@
         <w:rPr>
           <w:rFonts w:ascii="Cambria" w:hAnsi="Cambria"/>
         </w:rPr>
-        <w:t>(free ?a) → indica si el brazo está libre.</w:t>
+        <w:t>(</w:t>
+      </w:r>
+      <w:proofErr w:type="gramStart"/>
+      <w:r>
+        <w:rPr>
+          <w:rFonts w:ascii="Cambria" w:hAnsi="Cambria"/>
+        </w:rPr>
+        <w:t>free ?</w:t>
+      </w:r>
+      <w:proofErr w:type="gramEnd"/>
+      <w:r>
+        <w:rPr>
+          <w:rFonts w:ascii="Cambria" w:hAnsi="Cambria"/>
+        </w:rPr>
+        <w:t>a) → indica si el brazo está libre.</w:t>
       </w:r>
     </w:p>
     <w:p>
@@ -1295,7 +1574,21 @@
         <w:rPr>
           <w:rFonts w:ascii="Cambria" w:hAnsi="Cambria"/>
         </w:rPr>
-        <w:t>(holding ?a ?c) → indica que un brazo está sujetando una caja.</w:t>
+        <w:t>(</w:t>
+      </w:r>
+      <w:proofErr w:type="gramStart"/>
+      <w:r>
+        <w:rPr>
+          <w:rFonts w:ascii="Cambria" w:hAnsi="Cambria"/>
+        </w:rPr>
+        <w:t>holding ?</w:t>
+      </w:r>
+      <w:proofErr w:type="gramEnd"/>
+      <w:r>
+        <w:rPr>
+          <w:rFonts w:ascii="Cambria" w:hAnsi="Cambria"/>
+        </w:rPr>
+        <w:t>a ?c) → indica que un brazo está sujetando una caja.</w:t>
       </w:r>
     </w:p>
     <w:p>
@@ -1482,8 +1775,18 @@
           <w:b/>
           <w:bCs/>
         </w:rPr>
-        <w:t>Acción fly</w:t>
-      </w:r>
+        <w:t xml:space="preserve">Acción </w:t>
+      </w:r>
+      <w:proofErr w:type="spellStart"/>
+      <w:r>
+        <w:rPr>
+          <w:rFonts w:ascii="Cambria" w:hAnsi="Cambria"/>
+          <w:b/>
+          <w:bCs/>
+        </w:rPr>
+        <w:t>fly</w:t>
+      </w:r>
+      <w:proofErr w:type="spellEnd"/>
       <w:r>
         <w:rPr>
           <w:rFonts w:ascii="Cambria" w:hAnsi="Cambria"/>
@@ -1821,8 +2124,18 @@
           <w:b/>
           <w:bCs/>
         </w:rPr>
-        <w:t>Acción deliver</w:t>
-      </w:r>
+        <w:t xml:space="preserve">Acción </w:t>
+      </w:r>
+      <w:proofErr w:type="spellStart"/>
+      <w:r>
+        <w:rPr>
+          <w:rFonts w:ascii="Cambria" w:hAnsi="Cambria"/>
+          <w:b/>
+          <w:bCs/>
+        </w:rPr>
+        <w:t>deliver</w:t>
+      </w:r>
+      <w:proofErr w:type="spellEnd"/>
       <w:r>
         <w:rPr>
           <w:rFonts w:ascii="Cambria" w:hAnsi="Cambria"/>
@@ -1908,7 +2221,21 @@
         <w:rPr>
           <w:rFonts w:ascii="Cambria" w:hAnsi="Cambria"/>
         </w:rPr>
-        <w:t xml:space="preserve"> Por otro lado sus </w:t>
+        <w:t xml:space="preserve"> Por otro </w:t>
+      </w:r>
+      <w:proofErr w:type="gramStart"/>
+      <w:r>
+        <w:rPr>
+          <w:rFonts w:ascii="Cambria" w:hAnsi="Cambria"/>
+        </w:rPr>
+        <w:t>lado</w:t>
+      </w:r>
+      <w:proofErr w:type="gramEnd"/>
+      <w:r>
+        <w:rPr>
+          <w:rFonts w:ascii="Cambria" w:hAnsi="Cambria"/>
+        </w:rPr>
+        <w:t xml:space="preserve"> sus </w:t>
       </w:r>
       <w:r>
         <w:rPr>
@@ -2343,7 +2670,21 @@
         <w:rPr>
           <w:rFonts w:ascii="Cambria" w:hAnsi="Cambria"/>
         </w:rPr>
-        <w:t>compatible con planificadores clásicos como FF y pyperplan.</w:t>
+        <w:t xml:space="preserve">compatible con planificadores clásicos como FF y </w:t>
+      </w:r>
+      <w:proofErr w:type="spellStart"/>
+      <w:r>
+        <w:rPr>
+          <w:rFonts w:ascii="Cambria" w:hAnsi="Cambria"/>
+        </w:rPr>
+        <w:t>pyperplan</w:t>
+      </w:r>
+      <w:proofErr w:type="spellEnd"/>
+      <w:r>
+        <w:rPr>
+          <w:rFonts w:ascii="Cambria" w:hAnsi="Cambria"/>
+        </w:rPr>
+        <w:t>.</w:t>
       </w:r>
     </w:p>
     <w:p>
@@ -2419,7 +2760,35 @@
         <w:rPr>
           <w:rFonts w:ascii="Cambria" w:hAnsi="Cambria"/>
         </w:rPr>
-        <w:t>El programa recibe estos parámetros mediante argumentos de línea de comandos y construye dinámicamente todos los objetos necesarios del dominio. En primer lugar, genera las listas de drones, personas, cajas y localizaciones, incluyendo siempre una localización especial denominada depot. Asimismo, para cada dron se crean automáticamente dos objetos de tipo arm, que representan sus brazos, garantizando así el cumplimiento de la restricción física del dominio.</w:t>
+        <w:t xml:space="preserve">El programa recibe estos parámetros mediante argumentos de línea de comandos y construye dinámicamente todos los objetos necesarios del dominio. En primer lugar, genera las listas de drones, personas, cajas y localizaciones, incluyendo siempre una localización especial denominada </w:t>
+      </w:r>
+      <w:proofErr w:type="spellStart"/>
+      <w:r>
+        <w:rPr>
+          <w:rFonts w:ascii="Cambria" w:hAnsi="Cambria"/>
+        </w:rPr>
+        <w:t>depot</w:t>
+      </w:r>
+      <w:proofErr w:type="spellEnd"/>
+      <w:r>
+        <w:rPr>
+          <w:rFonts w:ascii="Cambria" w:hAnsi="Cambria"/>
+        </w:rPr>
+        <w:t xml:space="preserve">. Asimismo, para cada dron se crean automáticamente dos objetos de tipo </w:t>
+      </w:r>
+      <w:proofErr w:type="spellStart"/>
+      <w:r>
+        <w:rPr>
+          <w:rFonts w:ascii="Cambria" w:hAnsi="Cambria"/>
+        </w:rPr>
+        <w:t>arm</w:t>
+      </w:r>
+      <w:proofErr w:type="spellEnd"/>
+      <w:r>
+        <w:rPr>
+          <w:rFonts w:ascii="Cambria" w:hAnsi="Cambria"/>
+        </w:rPr>
+        <w:t>, que representan sus brazos, garantizando así el cumplimiento de la restricción física del dominio.</w:t>
       </w:r>
     </w:p>
     <w:p>
@@ -2433,7 +2802,21 @@
         <w:rPr>
           <w:rFonts w:ascii="Cambria" w:hAnsi="Cambria"/>
         </w:rPr>
-        <w:t>Posteriormente, el generador asigna contenidos a las cajas. Para ello, distribuye aleatoriamente las cajas entre los distintos tipos de contenido definidos (por ejemplo, food y medicine), asegurando que exista al menos una caja de cada tipo y que el número total de metas solicitadas sea alcanzable con los recursos disponibles. Esta comprobación evita generar problemas irresolubles.</w:t>
+        <w:t xml:space="preserve">Posteriormente, el generador asigna contenidos a las cajas. Para ello, distribuye aleatoriamente las cajas entre los distintos tipos de contenido definidos (por ejemplo, </w:t>
+      </w:r>
+      <w:proofErr w:type="spellStart"/>
+      <w:r>
+        <w:rPr>
+          <w:rFonts w:ascii="Cambria" w:hAnsi="Cambria"/>
+        </w:rPr>
+        <w:t>food</w:t>
+      </w:r>
+      <w:proofErr w:type="spellEnd"/>
+      <w:r>
+        <w:rPr>
+          <w:rFonts w:ascii="Cambria" w:hAnsi="Cambria"/>
+        </w:rPr>
+        <w:t xml:space="preserve"> y medicine), asegurando que exista al menos una caja de cada tipo y que el número total de metas solicitadas sea alcanzable con los recursos disponibles. Esta comprobación evita generar problemas irresolubles.</w:t>
       </w:r>
     </w:p>
     <w:p>
@@ -3759,7 +4142,21 @@
         <w:rPr>
           <w:rFonts w:ascii="Cambria" w:hAnsi="Cambria"/>
         </w:rPr>
-        <w:t>El planificador FF es un planificador heurístico de tipo satisficing, es decir, está diseñado para encontrar soluciones de manera eficiente sin garantizar que estas sean óptimas</w:t>
+        <w:t xml:space="preserve">El planificador FF es un planificador heurístico de tipo </w:t>
+      </w:r>
+      <w:proofErr w:type="spellStart"/>
+      <w:r>
+        <w:rPr>
+          <w:rFonts w:ascii="Cambria" w:hAnsi="Cambria"/>
+        </w:rPr>
+        <w:t>satisficing</w:t>
+      </w:r>
+      <w:proofErr w:type="spellEnd"/>
+      <w:r>
+        <w:rPr>
+          <w:rFonts w:ascii="Cambria" w:hAnsi="Cambria"/>
+        </w:rPr>
+        <w:t>, es decir, está diseñado para encontrar soluciones de manera eficiente sin garantizar que estas sean óptimas</w:t>
       </w:r>
       <w:r>
         <w:rPr>
@@ -3786,7 +4183,35 @@
           <w:rFonts w:ascii="Cambria" w:hAnsi="Cambria"/>
         </w:rPr>
         <w:lastRenderedPageBreak/>
-        <w:t xml:space="preserve">El núcleo del funcionamiento de FF se basa en una heurística relajada. En concreto, construye una versión relajada del problema eliminando los efectos negativos de las acciones (ignore delete list). Esto significa que, al estimar la distancia al objetivo, el planificador asume que los hechos nunca se eliminan del estado. Esta relajación simplifica enormemente el problema y permite calcular rápidamente una estimación heurística informativa. Sin embargo, </w:t>
+        <w:t xml:space="preserve">El núcleo del funcionamiento de FF se basa en una heurística relajada. En concreto, construye una versión relajada del problema eliminando los efectos negativos de las acciones (ignore </w:t>
+      </w:r>
+      <w:proofErr w:type="spellStart"/>
+      <w:r>
+        <w:rPr>
+          <w:rFonts w:ascii="Cambria" w:hAnsi="Cambria"/>
+        </w:rPr>
+        <w:t>delete</w:t>
+      </w:r>
+      <w:proofErr w:type="spellEnd"/>
+      <w:r>
+        <w:rPr>
+          <w:rFonts w:ascii="Cambria" w:hAnsi="Cambria"/>
+        </w:rPr>
+        <w:t xml:space="preserve"> </w:t>
+      </w:r>
+      <w:proofErr w:type="spellStart"/>
+      <w:r>
+        <w:rPr>
+          <w:rFonts w:ascii="Cambria" w:hAnsi="Cambria"/>
+        </w:rPr>
+        <w:t>list</w:t>
+      </w:r>
+      <w:proofErr w:type="spellEnd"/>
+      <w:r>
+        <w:rPr>
+          <w:rFonts w:ascii="Cambria" w:hAnsi="Cambria"/>
+        </w:rPr>
+        <w:t xml:space="preserve">). Esto significa que, al estimar la distancia al objetivo, el planificador asume que los hechos nunca se eliminan del estado. Esta relajación simplifica enormemente el problema y permite calcular rápidamente una estimación heurística informativa. Sin embargo, </w:t>
       </w:r>
       <w:r>
         <w:rPr>
@@ -4394,8 +4819,16 @@
               <w:rPr>
                 <w:rFonts w:ascii="Cambria" w:hAnsi="Cambria"/>
               </w:rPr>
-              <w:t>A* + hMAX</w:t>
-            </w:r>
+              <w:t xml:space="preserve">A* + </w:t>
+            </w:r>
+            <w:proofErr w:type="spellStart"/>
+            <w:r>
+              <w:rPr>
+                <w:rFonts w:ascii="Cambria" w:hAnsi="Cambria"/>
+              </w:rPr>
+              <w:t>hMAX</w:t>
+            </w:r>
+            <w:proofErr w:type="spellEnd"/>
           </w:p>
         </w:tc>
         <w:tc>
@@ -4498,8 +4931,16 @@
               <w:rPr>
                 <w:rFonts w:ascii="Cambria" w:hAnsi="Cambria"/>
               </w:rPr>
-              <w:t>GBFS + hMAX</w:t>
-            </w:r>
+              <w:t xml:space="preserve">GBFS + </w:t>
+            </w:r>
+            <w:proofErr w:type="spellStart"/>
+            <w:r>
+              <w:rPr>
+                <w:rFonts w:ascii="Cambria" w:hAnsi="Cambria"/>
+              </w:rPr>
+              <w:t>hMAX</w:t>
+            </w:r>
+            <w:proofErr w:type="spellEnd"/>
           </w:p>
         </w:tc>
         <w:tc>
@@ -4764,7 +5205,21 @@
         <w:rPr>
           <w:rFonts w:ascii="Cambria" w:hAnsi="Cambria"/>
         </w:rPr>
-        <w:t>En cuanto a los algoritmos informados, se observa que A* con heurística hMAX mejora el rendimiento respecto a IDS, pero no supera a BFS en tamaño máximo alcanzado. Esto puede parecer</w:t>
+        <w:t xml:space="preserve">En cuanto a los algoritmos informados, se observa que A* con heurística </w:t>
+      </w:r>
+      <w:proofErr w:type="spellStart"/>
+      <w:r>
+        <w:rPr>
+          <w:rFonts w:ascii="Cambria" w:hAnsi="Cambria"/>
+        </w:rPr>
+        <w:t>hMAX</w:t>
+      </w:r>
+      <w:proofErr w:type="spellEnd"/>
+      <w:r>
+        <w:rPr>
+          <w:rFonts w:ascii="Cambria" w:hAnsi="Cambria"/>
+        </w:rPr>
+        <w:t xml:space="preserve"> mejora el rendimiento respecto a IDS, pero no supera a BFS en tamaño máximo alcanzado. Esto puede parecer</w:t>
       </w:r>
       <w:r>
         <w:rPr>
@@ -4784,8 +5239,18 @@
           <w:b/>
           <w:bCs/>
         </w:rPr>
-        <w:t>heurística hMAX</w:t>
-      </w:r>
+        <w:t xml:space="preserve">heurística </w:t>
+      </w:r>
+      <w:proofErr w:type="spellStart"/>
+      <w:r>
+        <w:rPr>
+          <w:rFonts w:ascii="Cambria" w:hAnsi="Cambria"/>
+          <w:b/>
+          <w:bCs/>
+        </w:rPr>
+        <w:t>hMAX</w:t>
+      </w:r>
+      <w:proofErr w:type="spellEnd"/>
       <w:r>
         <w:rPr>
           <w:rFonts w:ascii="Cambria" w:hAnsi="Cambria"/>
@@ -4902,6 +5367,7 @@
         </w:rPr>
         <w:t xml:space="preserve"> con </w:t>
       </w:r>
+      <w:proofErr w:type="spellStart"/>
       <w:r>
         <w:rPr>
           <w:rFonts w:ascii="Cambria" w:hAnsi="Cambria"/>
@@ -4910,11 +5376,26 @@
         </w:rPr>
         <w:t>hMAX</w:t>
       </w:r>
-      <w:r>
-        <w:rPr>
-          <w:rFonts w:ascii="Cambria" w:hAnsi="Cambria"/>
-        </w:rPr>
-        <w:t xml:space="preserve">. Esto es coherente con su naturaleza satisficing: prioriza expandir el nodo que parece más prometedor según la heurística, sin preocuparse por garantizar optimalidad. Al no mantener una frontera ordenada por coste acumulado como A*, reduce considerablemente el número de nodos explorados y puede avanzar más profundamente en el espacio de búsqueda. Sin embargo, el </w:t>
+      <w:proofErr w:type="spellEnd"/>
+      <w:r>
+        <w:rPr>
+          <w:rFonts w:ascii="Cambria" w:hAnsi="Cambria"/>
+        </w:rPr>
+        <w:t xml:space="preserve">. Esto es coherente con su naturaleza </w:t>
+      </w:r>
+      <w:proofErr w:type="spellStart"/>
+      <w:r>
+        <w:rPr>
+          <w:rFonts w:ascii="Cambria" w:hAnsi="Cambria"/>
+        </w:rPr>
+        <w:t>satisficing</w:t>
+      </w:r>
+      <w:proofErr w:type="spellEnd"/>
+      <w:r>
+        <w:rPr>
+          <w:rFonts w:ascii="Cambria" w:hAnsi="Cambria"/>
+        </w:rPr>
+        <w:t xml:space="preserve">: prioriza expandir el nodo que parece más prometedor según la heurística, sin preocuparse por garantizar optimalidad. Al no mantener una frontera ordenada por coste acumulado como A*, reduce considerablemente el número de nodos explorados y puede avanzar más profundamente en el espacio de búsqueda. Sin embargo, el </w:t>
       </w:r>
       <w:r>
         <w:rPr>
@@ -4948,13 +5429,41 @@
         <w:rPr>
           <w:rFonts w:ascii="Cambria" w:hAnsi="Cambria"/>
         </w:rPr>
-        <w:t xml:space="preserve"> trade-off</w:t>
-      </w:r>
-      <w:r>
-        <w:rPr>
-          <w:rFonts w:ascii="Cambria" w:hAnsi="Cambria"/>
-        </w:rPr>
-        <w:t xml:space="preserve"> entre optimalidad y escalabilidad. Los algoritmos óptimos (BFS, IDS y A*) garantizan soluciones mínimas pero escalan peor en dominios con crecimiento combinatorio elevado. Por el contrario, GBFS sacrifica optimalidad a cambio de una mayor capacidad para resolver instancias de mayor tamaño dentro del límite temporal.</w:t>
+        <w:t xml:space="preserve"> </w:t>
+      </w:r>
+      <w:proofErr w:type="spellStart"/>
+      <w:r>
+        <w:rPr>
+          <w:rFonts w:ascii="Cambria" w:hAnsi="Cambria"/>
+        </w:rPr>
+        <w:t>trade</w:t>
+      </w:r>
+      <w:proofErr w:type="spellEnd"/>
+      <w:r>
+        <w:rPr>
+          <w:rFonts w:ascii="Cambria" w:hAnsi="Cambria"/>
+        </w:rPr>
+        <w:t>-off</w:t>
+      </w:r>
+      <w:r>
+        <w:rPr>
+          <w:rFonts w:ascii="Cambria" w:hAnsi="Cambria"/>
+        </w:rPr>
+        <w:t xml:space="preserve"> entre optimalidad y escalabilidad. Los algoritmos óptimos (BFS, IDS y A*) garantizan soluciones </w:t>
+      </w:r>
+      <w:proofErr w:type="gramStart"/>
+      <w:r>
+        <w:rPr>
+          <w:rFonts w:ascii="Cambria" w:hAnsi="Cambria"/>
+        </w:rPr>
+        <w:t>mínimas</w:t>
+      </w:r>
+      <w:proofErr w:type="gramEnd"/>
+      <w:r>
+        <w:rPr>
+          <w:rFonts w:ascii="Cambria" w:hAnsi="Cambria"/>
+        </w:rPr>
+        <w:t xml:space="preserve"> pero escalan peor en dominios con crecimiento combinatorio elevado. Por el contrario, GBFS sacrifica optimalidad a cambio de una mayor capacidad para resolver instancias de mayor tamaño dentro del límite temporal.</w:t>
       </w:r>
     </w:p>
     <w:p>
@@ -5020,8 +5529,16 @@
         <w:rPr>
           <w:rFonts w:ascii="Cambria" w:hAnsi="Cambria"/>
         </w:rPr>
-        <w:t>: Heurísticas para planificadores satisficing</w:t>
-      </w:r>
+        <w:t xml:space="preserve">: Heurísticas para planificadores </w:t>
+      </w:r>
+      <w:proofErr w:type="spellStart"/>
+      <w:r>
+        <w:rPr>
+          <w:rFonts w:ascii="Cambria" w:hAnsi="Cambria"/>
+        </w:rPr>
+        <w:t>satisficing</w:t>
+      </w:r>
+      <w:proofErr w:type="spellEnd"/>
     </w:p>
     <w:p/>
     <w:tbl>
@@ -5180,12 +5697,14 @@
                 <w:rFonts w:ascii="Cambria" w:hAnsi="Cambria"/>
               </w:rPr>
             </w:pPr>
+            <w:proofErr w:type="spellStart"/>
             <w:r>
               <w:rPr>
                 <w:rFonts w:ascii="Cambria" w:hAnsi="Cambria"/>
               </w:rPr>
               <w:t>hMAX</w:t>
             </w:r>
+            <w:proofErr w:type="spellEnd"/>
           </w:p>
         </w:tc>
         <w:tc>
@@ -5264,12 +5783,14 @@
                 <w:rFonts w:ascii="Cambria" w:hAnsi="Cambria"/>
               </w:rPr>
             </w:pPr>
+            <w:proofErr w:type="spellStart"/>
             <w:r>
               <w:rPr>
                 <w:rFonts w:ascii="Cambria" w:hAnsi="Cambria"/>
               </w:rPr>
               <w:t>hADD</w:t>
             </w:r>
+            <w:proofErr w:type="spellEnd"/>
           </w:p>
         </w:tc>
         <w:tc>
@@ -5344,12 +5865,14 @@
                 <w:rFonts w:ascii="Cambria" w:hAnsi="Cambria"/>
               </w:rPr>
             </w:pPr>
+            <w:proofErr w:type="spellStart"/>
             <w:r>
               <w:rPr>
                 <w:rFonts w:ascii="Cambria" w:hAnsi="Cambria"/>
               </w:rPr>
               <w:t>hFF</w:t>
             </w:r>
+            <w:proofErr w:type="spellEnd"/>
           </w:p>
         </w:tc>
         <w:tc>
@@ -5504,12 +6027,14 @@
                 <w:rFonts w:ascii="Cambria" w:hAnsi="Cambria"/>
               </w:rPr>
             </w:pPr>
+            <w:proofErr w:type="spellStart"/>
             <w:r>
               <w:rPr>
                 <w:rFonts w:ascii="Cambria" w:hAnsi="Cambria"/>
               </w:rPr>
               <w:t>hMAX</w:t>
             </w:r>
+            <w:proofErr w:type="spellEnd"/>
           </w:p>
         </w:tc>
         <w:tc>
@@ -5543,12 +6068,14 @@
                 <w:rFonts w:ascii="Cambria" w:hAnsi="Cambria"/>
               </w:rPr>
             </w:pPr>
+            <w:proofErr w:type="spellStart"/>
             <w:r>
               <w:rPr>
                 <w:rFonts w:ascii="Cambria" w:hAnsi="Cambria"/>
               </w:rPr>
               <w:t>Killed</w:t>
             </w:r>
+            <w:proofErr w:type="spellEnd"/>
             <w:r>
               <w:rPr>
                 <w:rFonts w:ascii="Cambria" w:hAnsi="Cambria"/>
@@ -5590,12 +6117,14 @@
                 <w:rFonts w:ascii="Cambria" w:hAnsi="Cambria"/>
               </w:rPr>
             </w:pPr>
+            <w:proofErr w:type="spellStart"/>
             <w:r>
               <w:rPr>
                 <w:rFonts w:ascii="Cambria" w:hAnsi="Cambria"/>
               </w:rPr>
               <w:t>hADD</w:t>
             </w:r>
+            <w:proofErr w:type="spellEnd"/>
           </w:p>
         </w:tc>
         <w:tc>
@@ -5670,12 +6199,14 @@
                 <w:rFonts w:ascii="Cambria" w:hAnsi="Cambria"/>
               </w:rPr>
             </w:pPr>
+            <w:proofErr w:type="spellStart"/>
             <w:r>
               <w:rPr>
                 <w:rFonts w:ascii="Cambria" w:hAnsi="Cambria"/>
               </w:rPr>
               <w:t>hFF</w:t>
             </w:r>
+            <w:proofErr w:type="spellEnd"/>
           </w:p>
         </w:tc>
         <w:tc>
@@ -5825,7 +6356,49 @@
         <w:rPr>
           <w:rFonts w:ascii="Cambria" w:hAnsi="Cambria"/>
         </w:rPr>
-        <w:t>En este apartado se ha evaluado el comportamiento de los algoritmos GBFS y EHC combinados con distintas heurísticas (hMAX, hADD, hFF y Landmark) sobre el mayor problema que GBFS era capaz de resolver en menos de un minuto (</w:t>
+        <w:t>En este apartado se ha evaluado el comportamiento de los algoritmos GBFS y EHC combinados con distintas heurísticas (</w:t>
+      </w:r>
+      <w:proofErr w:type="spellStart"/>
+      <w:r>
+        <w:rPr>
+          <w:rFonts w:ascii="Cambria" w:hAnsi="Cambria"/>
+        </w:rPr>
+        <w:t>hMAX</w:t>
+      </w:r>
+      <w:proofErr w:type="spellEnd"/>
+      <w:r>
+        <w:rPr>
+          <w:rFonts w:ascii="Cambria" w:hAnsi="Cambria"/>
+        </w:rPr>
+        <w:t xml:space="preserve">, </w:t>
+      </w:r>
+      <w:proofErr w:type="spellStart"/>
+      <w:r>
+        <w:rPr>
+          <w:rFonts w:ascii="Cambria" w:hAnsi="Cambria"/>
+        </w:rPr>
+        <w:t>hADD</w:t>
+      </w:r>
+      <w:proofErr w:type="spellEnd"/>
+      <w:r>
+        <w:rPr>
+          <w:rFonts w:ascii="Cambria" w:hAnsi="Cambria"/>
+        </w:rPr>
+        <w:t xml:space="preserve">, </w:t>
+      </w:r>
+      <w:proofErr w:type="spellStart"/>
+      <w:r>
+        <w:rPr>
+          <w:rFonts w:ascii="Cambria" w:hAnsi="Cambria"/>
+        </w:rPr>
+        <w:t>hFF</w:t>
+      </w:r>
+      <w:proofErr w:type="spellEnd"/>
+      <w:r>
+        <w:rPr>
+          <w:rFonts w:ascii="Cambria" w:hAnsi="Cambria"/>
+        </w:rPr>
+        <w:t xml:space="preserve"> y Landmark) sobre el mayor problema que GBFS era capaz de resolver en menos de un minuto (</w:t>
       </w:r>
       <w:r>
         <w:rPr>
@@ -5887,7 +6460,21 @@
         <w:rPr>
           <w:rFonts w:ascii="Cambria" w:hAnsi="Cambria"/>
         </w:rPr>
-        <w:t xml:space="preserve"> de los planes generados. En general, se observa que la elección de la heurística tiene un impacto mucho mayor en el rendimiento que la elección del algoritmo de búsqueda, especialmente cuando se emplea una heurística poco informativa como hMAX.</w:t>
+        <w:t xml:space="preserve"> de los planes generados. En general, se observa que la elección de la heurística tiene un impacto mucho mayor en el rendimiento que la elección del algoritmo de búsqueda, especialmente cuando se emplea una heurística poco informativa como </w:t>
+      </w:r>
+      <w:proofErr w:type="spellStart"/>
+      <w:r>
+        <w:rPr>
+          <w:rFonts w:ascii="Cambria" w:hAnsi="Cambria"/>
+        </w:rPr>
+        <w:t>hMAX</w:t>
+      </w:r>
+      <w:proofErr w:type="spellEnd"/>
+      <w:r>
+        <w:rPr>
+          <w:rFonts w:ascii="Cambria" w:hAnsi="Cambria"/>
+        </w:rPr>
+        <w:t>.</w:t>
       </w:r>
     </w:p>
     <w:p>
@@ -5909,8 +6496,18 @@
           <w:b/>
           <w:bCs/>
         </w:rPr>
-        <w:t>heurística hMAX</w:t>
-      </w:r>
+        <w:t xml:space="preserve">heurística </w:t>
+      </w:r>
+      <w:proofErr w:type="spellStart"/>
+      <w:r>
+        <w:rPr>
+          <w:rFonts w:ascii="Cambria" w:hAnsi="Cambria"/>
+          <w:b/>
+          <w:bCs/>
+        </w:rPr>
+        <w:t>hMAX</w:t>
+      </w:r>
+      <w:proofErr w:type="spellEnd"/>
       <w:r>
         <w:rPr>
           <w:rFonts w:ascii="Cambria" w:hAnsi="Cambria"/>
@@ -5929,7 +6526,21 @@
         <w:rPr>
           <w:rFonts w:ascii="Cambria" w:hAnsi="Cambria"/>
         </w:rPr>
-        <w:t xml:space="preserve"> en ambos algoritmos. Con GBFS, el tiempo de ejecución es elevado (52.802s), mientras que con EHC el proceso no llega a completarse y es abortado. Este comportamiento se explica porque hMAX calcula el coste máximo individual de los subobjetivos ignorando efectos negativos, lo que produce estimaciones muy conservadoras y poco informativas. En un dominio como el presente, donde múltiples entregas deben realizarse y los subobjetivos interactúan indirectamente, esta heurística </w:t>
+        <w:t xml:space="preserve"> en ambos algoritmos. Con GBFS, el tiempo de ejecución es elevado (52.802s), mientras que con EHC el proceso no llega a completarse y es abortado. Este comportamiento se explica porque </w:t>
+      </w:r>
+      <w:proofErr w:type="spellStart"/>
+      <w:r>
+        <w:rPr>
+          <w:rFonts w:ascii="Cambria" w:hAnsi="Cambria"/>
+        </w:rPr>
+        <w:t>hMAX</w:t>
+      </w:r>
+      <w:proofErr w:type="spellEnd"/>
+      <w:r>
+        <w:rPr>
+          <w:rFonts w:ascii="Cambria" w:hAnsi="Cambria"/>
+        </w:rPr>
+        <w:t xml:space="preserve"> calcula el coste máximo individual de los subobjetivos ignorando efectos negativos, lo que produce estimaciones muy conservadoras y poco informativas. En un dominio como el presente, donde múltiples entregas deben realizarse y los subobjetivos interactúan indirectamente, esta heurística </w:t>
       </w:r>
       <w:r>
         <w:rPr>
@@ -5959,14 +6570,34 @@
         </w:rPr>
         <w:t xml:space="preserve">Por el contrario, </w:t>
       </w:r>
-      <w:r>
-        <w:rPr>
-          <w:rFonts w:ascii="Cambria" w:hAnsi="Cambria"/>
-          <w:b/>
-          <w:bCs/>
-        </w:rPr>
-        <w:t>hADD y hFF</w:t>
-      </w:r>
+      <w:proofErr w:type="spellStart"/>
+      <w:r>
+        <w:rPr>
+          <w:rFonts w:ascii="Cambria" w:hAnsi="Cambria"/>
+          <w:b/>
+          <w:bCs/>
+        </w:rPr>
+        <w:t>hADD</w:t>
+      </w:r>
+      <w:proofErr w:type="spellEnd"/>
+      <w:r>
+        <w:rPr>
+          <w:rFonts w:ascii="Cambria" w:hAnsi="Cambria"/>
+          <w:b/>
+          <w:bCs/>
+        </w:rPr>
+        <w:t xml:space="preserve"> y </w:t>
+      </w:r>
+      <w:proofErr w:type="spellStart"/>
+      <w:r>
+        <w:rPr>
+          <w:rFonts w:ascii="Cambria" w:hAnsi="Cambria"/>
+          <w:b/>
+          <w:bCs/>
+        </w:rPr>
+        <w:t>hFF</w:t>
+      </w:r>
+      <w:proofErr w:type="spellEnd"/>
       <w:r>
         <w:rPr>
           <w:rFonts w:ascii="Cambria" w:hAnsi="Cambria"/>
@@ -5985,7 +6616,119 @@
         <w:rPr>
           <w:rFonts w:ascii="Cambria" w:hAnsi="Cambria"/>
         </w:rPr>
-        <w:t xml:space="preserve">. Ambas heurísticas son más informativas, ya que consideran de manera más precisa el esfuerzo conjunto necesario para alcanzar múltiples metas. En particular, hADD suma los costes estimados de los subobjetivos, mientras que hFF construye un plan relajado completo para estimar la distancia al objetivo. Esto explica la drástica reducción en los tiempos de ejecución: en GBFS, los tiempos pasan de más de 50 segundos con hMAX a menos de medio segundo con hADD y hFF. En EHC ocurre algo similar, siendo especialmente destacable el buen rendimiento de hFF (0.892s) y hADD (1.236s). Esto confirma que en dominios logísticos con </w:t>
+        <w:t xml:space="preserve">. Ambas heurísticas son más informativas, ya que consideran de manera más precisa el esfuerzo conjunto necesario para alcanzar múltiples metas. En particular, </w:t>
+      </w:r>
+      <w:proofErr w:type="spellStart"/>
+      <w:r>
+        <w:rPr>
+          <w:rFonts w:ascii="Cambria" w:hAnsi="Cambria"/>
+        </w:rPr>
+        <w:t>hADD</w:t>
+      </w:r>
+      <w:proofErr w:type="spellEnd"/>
+      <w:r>
+        <w:rPr>
+          <w:rFonts w:ascii="Cambria" w:hAnsi="Cambria"/>
+        </w:rPr>
+        <w:t xml:space="preserve"> suma los costes estimados de los subobjetivos, mientras que </w:t>
+      </w:r>
+      <w:proofErr w:type="spellStart"/>
+      <w:r>
+        <w:rPr>
+          <w:rFonts w:ascii="Cambria" w:hAnsi="Cambria"/>
+        </w:rPr>
+        <w:t>hFF</w:t>
+      </w:r>
+      <w:proofErr w:type="spellEnd"/>
+      <w:r>
+        <w:rPr>
+          <w:rFonts w:ascii="Cambria" w:hAnsi="Cambria"/>
+        </w:rPr>
+        <w:t xml:space="preserve"> construye un plan relajado completo para estimar la distancia al objetivo. Esto explica la drástica reducción en los tiempos de ejecución: en GBFS, los tiempos pasan de más de 50 segundos con </w:t>
+      </w:r>
+      <w:proofErr w:type="spellStart"/>
+      <w:r>
+        <w:rPr>
+          <w:rFonts w:ascii="Cambria" w:hAnsi="Cambria"/>
+        </w:rPr>
+        <w:t>hMAX</w:t>
+      </w:r>
+      <w:proofErr w:type="spellEnd"/>
+      <w:r>
+        <w:rPr>
+          <w:rFonts w:ascii="Cambria" w:hAnsi="Cambria"/>
+        </w:rPr>
+        <w:t xml:space="preserve"> a menos de medio segundo con </w:t>
+      </w:r>
+      <w:proofErr w:type="spellStart"/>
+      <w:r>
+        <w:rPr>
+          <w:rFonts w:ascii="Cambria" w:hAnsi="Cambria"/>
+        </w:rPr>
+        <w:t>hADD</w:t>
+      </w:r>
+      <w:proofErr w:type="spellEnd"/>
+      <w:r>
+        <w:rPr>
+          <w:rFonts w:ascii="Cambria" w:hAnsi="Cambria"/>
+        </w:rPr>
+        <w:t xml:space="preserve"> y </w:t>
+      </w:r>
+      <w:proofErr w:type="spellStart"/>
+      <w:r>
+        <w:rPr>
+          <w:rFonts w:ascii="Cambria" w:hAnsi="Cambria"/>
+        </w:rPr>
+        <w:t>hFF</w:t>
+      </w:r>
+      <w:proofErr w:type="spellEnd"/>
+      <w:r>
+        <w:rPr>
+          <w:rFonts w:ascii="Cambria" w:hAnsi="Cambria"/>
+        </w:rPr>
+        <w:t xml:space="preserve">. En EHC ocurre algo similar, siendo especialmente destacable el buen rendimiento de </w:t>
+      </w:r>
+      <w:proofErr w:type="spellStart"/>
+      <w:r>
+        <w:rPr>
+          <w:rFonts w:ascii="Cambria" w:hAnsi="Cambria"/>
+        </w:rPr>
+        <w:t>hFF</w:t>
+      </w:r>
+      <w:proofErr w:type="spellEnd"/>
+      <w:r>
+        <w:rPr>
+          <w:rFonts w:ascii="Cambria" w:hAnsi="Cambria"/>
+        </w:rPr>
+        <w:t xml:space="preserve"> (0.892s) y </w:t>
+      </w:r>
+      <w:proofErr w:type="spellStart"/>
+      <w:r>
+        <w:rPr>
+          <w:rFonts w:ascii="Cambria" w:hAnsi="Cambria"/>
+        </w:rPr>
+        <w:t>hADD</w:t>
+      </w:r>
+      <w:proofErr w:type="spellEnd"/>
+      <w:r>
+        <w:rPr>
+          <w:rFonts w:ascii="Cambria" w:hAnsi="Cambria"/>
+        </w:rPr>
+        <w:t xml:space="preserve"> (1.236s). Esto confirma </w:t>
+      </w:r>
+      <w:proofErr w:type="gramStart"/>
+      <w:r>
+        <w:rPr>
+          <w:rFonts w:ascii="Cambria" w:hAnsi="Cambria"/>
+        </w:rPr>
+        <w:t>que</w:t>
+      </w:r>
+      <w:proofErr w:type="gramEnd"/>
+      <w:r>
+        <w:rPr>
+          <w:rFonts w:ascii="Cambria" w:hAnsi="Cambria"/>
+        </w:rPr>
+        <w:t xml:space="preserve"> en dominios logísticos con </w:t>
       </w:r>
       <w:r>
         <w:rPr>
@@ -6196,7 +6939,49 @@
           <w:rFonts w:ascii="Cambria" w:hAnsi="Cambria"/>
         </w:rPr>
         <w:lastRenderedPageBreak/>
-        <w:t>Esta estrategia puede ser extremadamente eficiente cuando la heurística es informativa (como ocurre con hFF), pero puede fallar o volverse muy costosa cuando la heurística es pobre, como se observa con hMAX. El hecho de que EHC con hMAX no complete la ejecución</w:t>
+        <w:t xml:space="preserve">Esta estrategia puede ser extremadamente eficiente cuando la heurística es informativa (como ocurre con </w:t>
+      </w:r>
+      <w:proofErr w:type="spellStart"/>
+      <w:r>
+        <w:rPr>
+          <w:rFonts w:ascii="Cambria" w:hAnsi="Cambria"/>
+        </w:rPr>
+        <w:t>hFF</w:t>
+      </w:r>
+      <w:proofErr w:type="spellEnd"/>
+      <w:r>
+        <w:rPr>
+          <w:rFonts w:ascii="Cambria" w:hAnsi="Cambria"/>
+        </w:rPr>
+        <w:t xml:space="preserve">), pero puede fallar o volverse muy costosa cuando la heurística es pobre, como se observa con </w:t>
+      </w:r>
+      <w:proofErr w:type="spellStart"/>
+      <w:r>
+        <w:rPr>
+          <w:rFonts w:ascii="Cambria" w:hAnsi="Cambria"/>
+        </w:rPr>
+        <w:t>hMAX</w:t>
+      </w:r>
+      <w:proofErr w:type="spellEnd"/>
+      <w:r>
+        <w:rPr>
+          <w:rFonts w:ascii="Cambria" w:hAnsi="Cambria"/>
+        </w:rPr>
+        <w:t xml:space="preserve">. El hecho de que EHC con </w:t>
+      </w:r>
+      <w:proofErr w:type="spellStart"/>
+      <w:r>
+        <w:rPr>
+          <w:rFonts w:ascii="Cambria" w:hAnsi="Cambria"/>
+        </w:rPr>
+        <w:t>hMAX</w:t>
+      </w:r>
+      <w:proofErr w:type="spellEnd"/>
+      <w:r>
+        <w:rPr>
+          <w:rFonts w:ascii="Cambria" w:hAnsi="Cambria"/>
+        </w:rPr>
+        <w:t xml:space="preserve"> no complete la ejecución</w:t>
       </w:r>
       <w:r>
         <w:rPr>
@@ -6278,6 +7063,7 @@
         </w:rPr>
         <w:t xml:space="preserve"> con la heurística </w:t>
       </w:r>
+      <w:proofErr w:type="spellStart"/>
       <w:r>
         <w:rPr>
           <w:rFonts w:ascii="Cambria" w:hAnsi="Cambria"/>
@@ -6286,11 +7072,26 @@
         </w:rPr>
         <w:t>hFF</w:t>
       </w:r>
-      <w:r>
-        <w:rPr>
-          <w:rFonts w:ascii="Cambria" w:hAnsi="Cambria"/>
-        </w:rPr>
-        <w:t xml:space="preserve"> como estrategia principal. FF utiliza EHC para avanzar rápidamente guiado por la heurística del plan relajado y, en caso de fallo, puede recurrir a una búsqueda más sistemática. Los resultados obtenidos en este experimento respaldan esta elección de diseño: la combinación EHC + hFF </w:t>
+      <w:proofErr w:type="spellEnd"/>
+      <w:r>
+        <w:rPr>
+          <w:rFonts w:ascii="Cambria" w:hAnsi="Cambria"/>
+        </w:rPr>
+        <w:t xml:space="preserve"> como estrategia principal. FF utiliza EHC para avanzar rápidamente guiado por la heurística del plan relajado y, en caso de fallo, puede recurrir a una búsqueda más sistemática. Los resultados obtenidos en este experimento respaldan esta elección de diseño: la combinación EHC + </w:t>
+      </w:r>
+      <w:proofErr w:type="spellStart"/>
+      <w:r>
+        <w:rPr>
+          <w:rFonts w:ascii="Cambria" w:hAnsi="Cambria"/>
+        </w:rPr>
+        <w:t>hFF</w:t>
+      </w:r>
+      <w:proofErr w:type="spellEnd"/>
+      <w:r>
+        <w:rPr>
+          <w:rFonts w:ascii="Cambria" w:hAnsi="Cambria"/>
+        </w:rPr>
+        <w:t xml:space="preserve"> </w:t>
       </w:r>
       <w:r>
         <w:rPr>
@@ -6485,8 +7286,18 @@
           <w:b/>
           <w:bCs/>
         </w:rPr>
-        <w:t xml:space="preserve"> qué heurísticas son admisibles en pyperplan</w:t>
-      </w:r>
+        <w:t xml:space="preserve"> qué heurísticas son admisibles en </w:t>
+      </w:r>
+      <w:proofErr w:type="spellStart"/>
+      <w:r>
+        <w:rPr>
+          <w:rFonts w:ascii="Cambria" w:hAnsi="Cambria"/>
+          <w:b/>
+          <w:bCs/>
+        </w:rPr>
+        <w:t>pyperplan</w:t>
+      </w:r>
+      <w:proofErr w:type="spellEnd"/>
     </w:p>
     <w:p>
       <w:pPr>
@@ -6613,7 +7424,21 @@
         <w:rPr>
           <w:rFonts w:ascii="Cambria" w:hAnsi="Cambria"/>
         </w:rPr>
-        <w:t>En pyperplan:</w:t>
+        <w:t xml:space="preserve">En </w:t>
+      </w:r>
+      <w:proofErr w:type="spellStart"/>
+      <w:r>
+        <w:rPr>
+          <w:rFonts w:ascii="Cambria" w:hAnsi="Cambria"/>
+        </w:rPr>
+        <w:t>pyperplan</w:t>
+      </w:r>
+      <w:proofErr w:type="spellEnd"/>
+      <w:r>
+        <w:rPr>
+          <w:rFonts w:ascii="Cambria" w:hAnsi="Cambria"/>
+        </w:rPr>
+        <w:t>:</w:t>
       </w:r>
     </w:p>
     <w:p>
@@ -6629,6 +7454,7 @@
         </w:rPr>
         <w:t xml:space="preserve"> </w:t>
       </w:r>
+      <w:proofErr w:type="spellStart"/>
       <w:r>
         <w:rPr>
           <w:rFonts w:ascii="Cambria" w:hAnsi="Cambria"/>
@@ -6637,6 +7463,7 @@
         </w:rPr>
         <w:t>hMAX</w:t>
       </w:r>
+      <w:proofErr w:type="spellEnd"/>
       <w:r>
         <w:rPr>
           <w:rFonts w:ascii="Cambria" w:hAnsi="Cambria"/>
@@ -6671,6 +7498,7 @@
           <w:rFonts w:ascii="Cambria" w:hAnsi="Cambria"/>
         </w:rPr>
       </w:pPr>
+      <w:proofErr w:type="spellStart"/>
       <w:r>
         <w:rPr>
           <w:rFonts w:ascii="Cambria" w:hAnsi="Cambria"/>
@@ -6679,6 +7507,7 @@
         </w:rPr>
         <w:t>hADD</w:t>
       </w:r>
+      <w:proofErr w:type="spellEnd"/>
       <w:r>
         <w:rPr>
           <w:rFonts w:ascii="Cambria" w:hAnsi="Cambria"/>
@@ -6719,6 +7548,7 @@
           <w:rFonts w:ascii="Cambria" w:hAnsi="Cambria"/>
         </w:rPr>
       </w:pPr>
+      <w:proofErr w:type="spellStart"/>
       <w:r>
         <w:rPr>
           <w:rFonts w:ascii="Cambria" w:hAnsi="Cambria"/>
@@ -6727,6 +7557,7 @@
         </w:rPr>
         <w:t>hSA</w:t>
       </w:r>
+      <w:proofErr w:type="spellEnd"/>
       <w:r>
         <w:rPr>
           <w:rFonts w:ascii="Cambria" w:hAnsi="Cambria"/>
@@ -6766,6 +7597,7 @@
         </w:rPr>
         <w:t xml:space="preserve"> </w:t>
       </w:r>
+      <w:proofErr w:type="spellStart"/>
       <w:r>
         <w:rPr>
           <w:rFonts w:ascii="Cambria" w:hAnsi="Cambria"/>
@@ -6774,6 +7606,7 @@
         </w:rPr>
         <w:t>hFF</w:t>
       </w:r>
+      <w:proofErr w:type="spellEnd"/>
       <w:r>
         <w:rPr>
           <w:rFonts w:ascii="Cambria" w:hAnsi="Cambria"/>
@@ -6859,7 +7692,21 @@
         <w:rPr>
           <w:rFonts w:ascii="Cambria" w:hAnsi="Cambria"/>
         </w:rPr>
-        <w:t xml:space="preserve"> Basada en contar hechos obligatorios (landmarks). No garantiza no sobreestimar. No está diseñada para optimalidad.</w:t>
+        <w:t xml:space="preserve"> Basada en contar hechos obligatorios (</w:t>
+      </w:r>
+      <w:proofErr w:type="spellStart"/>
+      <w:r>
+        <w:rPr>
+          <w:rFonts w:ascii="Cambria" w:hAnsi="Cambria"/>
+        </w:rPr>
+        <w:t>landmarks</w:t>
+      </w:r>
+      <w:proofErr w:type="spellEnd"/>
+      <w:r>
+        <w:rPr>
+          <w:rFonts w:ascii="Cambria" w:hAnsi="Cambria"/>
+        </w:rPr>
+        <w:t>). No garantiza no sobreestimar. No está diseñada para optimalidad.</w:t>
       </w:r>
     </w:p>
     <w:p>
@@ -6869,6 +7716,7 @@
           <w:rFonts w:ascii="Cambria" w:hAnsi="Cambria"/>
         </w:rPr>
       </w:pPr>
+      <w:proofErr w:type="spellStart"/>
       <w:r>
         <w:rPr>
           <w:rFonts w:ascii="Cambria" w:hAnsi="Cambria"/>
@@ -6877,6 +7725,7 @@
         </w:rPr>
         <w:t>lmcut</w:t>
       </w:r>
+      <w:proofErr w:type="spellEnd"/>
       <w:r>
         <w:rPr>
           <w:rFonts w:ascii="Cambria" w:hAnsi="Cambria"/>
@@ -6900,7 +7749,21 @@
         <w:rPr>
           <w:rFonts w:ascii="Cambria" w:hAnsi="Cambria"/>
         </w:rPr>
-        <w:t xml:space="preserve"> Es una heurística basada en cortes (landmark-cut). Está diseñada específicamente para ser admisible.</w:t>
+        <w:t xml:space="preserve"> Es una heurística basada en cortes (</w:t>
+      </w:r>
+      <w:proofErr w:type="spellStart"/>
+      <w:r>
+        <w:rPr>
+          <w:rFonts w:ascii="Cambria" w:hAnsi="Cambria"/>
+        </w:rPr>
+        <w:t>landmark-cut</w:t>
+      </w:r>
+      <w:proofErr w:type="spellEnd"/>
+      <w:r>
+        <w:rPr>
+          <w:rFonts w:ascii="Cambria" w:hAnsi="Cambria"/>
+        </w:rPr>
+        <w:t>). Está diseñada específicamente para ser admisible.</w:t>
       </w:r>
       <w:r>
         <w:rPr>
@@ -6932,7 +7795,35 @@
         <w:rPr>
           <w:rFonts w:ascii="Cambria" w:hAnsi="Cambria"/>
         </w:rPr>
-        <w:t>las heurísticas admisibles son hMAX y lmcut.</w:t>
+        <w:t xml:space="preserve">las heurísticas admisibles son </w:t>
+      </w:r>
+      <w:proofErr w:type="spellStart"/>
+      <w:r>
+        <w:rPr>
+          <w:rFonts w:ascii="Cambria" w:hAnsi="Cambria"/>
+        </w:rPr>
+        <w:t>hMAX</w:t>
+      </w:r>
+      <w:proofErr w:type="spellEnd"/>
+      <w:r>
+        <w:rPr>
+          <w:rFonts w:ascii="Cambria" w:hAnsi="Cambria"/>
+        </w:rPr>
+        <w:t xml:space="preserve"> y </w:t>
+      </w:r>
+      <w:proofErr w:type="spellStart"/>
+      <w:r>
+        <w:rPr>
+          <w:rFonts w:ascii="Cambria" w:hAnsi="Cambria"/>
+        </w:rPr>
+        <w:t>lmcut</w:t>
+      </w:r>
+      <w:proofErr w:type="spellEnd"/>
+      <w:r>
+        <w:rPr>
+          <w:rFonts w:ascii="Cambria" w:hAnsi="Cambria"/>
+        </w:rPr>
+        <w:t>.</w:t>
       </w:r>
       <w:r>
         <w:rPr>
@@ -6956,8 +7847,16 @@
         <w:rPr>
           <w:rFonts w:ascii="Cambria" w:hAnsi="Cambria"/>
         </w:rPr>
-        <w:t>mayor tamaño que puede resolver el algoritmo A* con heurística hMAX</w:t>
-      </w:r>
+        <w:t xml:space="preserve">mayor tamaño que puede resolver el algoritmo A* con heurística </w:t>
+      </w:r>
+      <w:proofErr w:type="spellStart"/>
+      <w:r>
+        <w:rPr>
+          <w:rFonts w:ascii="Cambria" w:hAnsi="Cambria"/>
+        </w:rPr>
+        <w:t>hMAX</w:t>
+      </w:r>
+      <w:proofErr w:type="spellEnd"/>
       <w:r>
         <w:rPr>
           <w:rFonts w:ascii="Cambria" w:hAnsi="Cambria"/>
@@ -7191,11 +8090,19 @@
                 <w:rFonts w:ascii="Cambria" w:hAnsi="Cambria"/>
               </w:rPr>
             </w:pPr>
-            <w:r>
-              <w:rPr>
-                <w:rFonts w:ascii="Cambria" w:hAnsi="Cambria"/>
-              </w:rPr>
-              <w:t>Killed (no se ha llegado a completar)</w:t>
+            <w:proofErr w:type="spellStart"/>
+            <w:r>
+              <w:rPr>
+                <w:rFonts w:ascii="Cambria" w:hAnsi="Cambria"/>
+              </w:rPr>
+              <w:t>Killed</w:t>
+            </w:r>
+            <w:proofErr w:type="spellEnd"/>
+            <w:r>
+              <w:rPr>
+                <w:rFonts w:ascii="Cambria" w:hAnsi="Cambria"/>
+              </w:rPr>
+              <w:t xml:space="preserve"> (no se ha llegado a completar)</w:t>
             </w:r>
           </w:p>
         </w:tc>
@@ -7215,8 +8122,16 @@
               <w:rPr>
                 <w:rFonts w:ascii="Cambria" w:hAnsi="Cambria"/>
               </w:rPr>
-              <w:t>A* + hMAX</w:t>
-            </w:r>
+              <w:t xml:space="preserve">A* + </w:t>
+            </w:r>
+            <w:proofErr w:type="spellStart"/>
+            <w:r>
+              <w:rPr>
+                <w:rFonts w:ascii="Cambria" w:hAnsi="Cambria"/>
+              </w:rPr>
+              <w:t>hMAX</w:t>
+            </w:r>
+            <w:proofErr w:type="spellEnd"/>
           </w:p>
         </w:tc>
         <w:tc>
@@ -7273,12 +8188,14 @@
               </w:rPr>
               <w:t xml:space="preserve">A* + </w:t>
             </w:r>
+            <w:proofErr w:type="spellStart"/>
             <w:r>
               <w:rPr>
                 <w:rFonts w:ascii="Cambria" w:hAnsi="Cambria"/>
               </w:rPr>
               <w:t>lmcut</w:t>
             </w:r>
+            <w:proofErr w:type="spellEnd"/>
           </w:p>
         </w:tc>
         <w:tc>
@@ -7344,7 +8261,49 @@
         <w:rPr>
           <w:rFonts w:ascii="Cambria" w:hAnsi="Cambria"/>
         </w:rPr>
-        <w:t xml:space="preserve"> se ha evaluado el rendimiento de los algoritmos óptimos sobre el mayor problema que A* con hMAX era capaz de resolver en menos de un minuto (tamaño 5). Se han comparado BFS, IDS y A* con las heurísticas admisibles hMAX y lmcut. En todos los casos en los que se obtuvo solución, la longitud del plan fue de 17 acciones, lo que confirma que los algoritmos utilizados (BFS y A* con heurísticas admisibles) garantizan optimalidad y que el coste óptimo del problema es efectivamente 17.</w:t>
+        <w:t xml:space="preserve"> se ha evaluado el rendimiento de los algoritmos óptimos sobre el mayor problema que A* con </w:t>
+      </w:r>
+      <w:proofErr w:type="spellStart"/>
+      <w:r>
+        <w:rPr>
+          <w:rFonts w:ascii="Cambria" w:hAnsi="Cambria"/>
+        </w:rPr>
+        <w:t>hMAX</w:t>
+      </w:r>
+      <w:proofErr w:type="spellEnd"/>
+      <w:r>
+        <w:rPr>
+          <w:rFonts w:ascii="Cambria" w:hAnsi="Cambria"/>
+        </w:rPr>
+        <w:t xml:space="preserve"> era capaz de resolver en menos de un minuto (tamaño 5). Se han comparado BFS, IDS y A* con las heurísticas admisibles </w:t>
+      </w:r>
+      <w:proofErr w:type="spellStart"/>
+      <w:r>
+        <w:rPr>
+          <w:rFonts w:ascii="Cambria" w:hAnsi="Cambria"/>
+        </w:rPr>
+        <w:t>hMAX</w:t>
+      </w:r>
+      <w:proofErr w:type="spellEnd"/>
+      <w:r>
+        <w:rPr>
+          <w:rFonts w:ascii="Cambria" w:hAnsi="Cambria"/>
+        </w:rPr>
+        <w:t xml:space="preserve"> y </w:t>
+      </w:r>
+      <w:proofErr w:type="spellStart"/>
+      <w:r>
+        <w:rPr>
+          <w:rFonts w:ascii="Cambria" w:hAnsi="Cambria"/>
+        </w:rPr>
+        <w:t>lmcut</w:t>
+      </w:r>
+      <w:proofErr w:type="spellEnd"/>
+      <w:r>
+        <w:rPr>
+          <w:rFonts w:ascii="Cambria" w:hAnsi="Cambria"/>
+        </w:rPr>
+        <w:t>. En todos los casos en los que se obtuvo solución, la longitud del plan fue de 17 acciones, lo que confirma que los algoritmos utilizados (BFS y A* con heurísticas admisibles) garantizan optimalidad y que el coste óptimo del problema es efectivamente 17.</w:t>
       </w:r>
     </w:p>
     <w:p>
@@ -7386,7 +8345,91 @@
         <w:rPr>
           <w:rFonts w:ascii="Cambria" w:hAnsi="Cambria"/>
         </w:rPr>
-        <w:t>En cuanto a A*, se observa que con hMAX el tiempo de ejecución es de 8.672 segundos, mientras que con lmcut asciende a 35.282 segundos. Aunque ambas heurísticas son admisibles y producen planes óptimos, su comportamiento práctico difiere. La heurística hMAX es menos informativa, ya que solo considera el coste máximo individual de los subobjetivos en el problema relajado, lo que puede conducir a una exploración relativamente amplia del espacio de estados. Por su parte, lmcut es una heurística más sofisticada y generalmente más informativa, pero su cálculo es computacionalmente más costoso. En problemas de tamaño reducido, el coste adicional de computar lmcut puede superar el ahorro en nodos explorados, lo que explica que en este caso concreto resulte más lenta que hMAX.</w:t>
+        <w:t xml:space="preserve">En cuanto a A*, se observa que con </w:t>
+      </w:r>
+      <w:proofErr w:type="spellStart"/>
+      <w:r>
+        <w:rPr>
+          <w:rFonts w:ascii="Cambria" w:hAnsi="Cambria"/>
+        </w:rPr>
+        <w:t>hMAX</w:t>
+      </w:r>
+      <w:proofErr w:type="spellEnd"/>
+      <w:r>
+        <w:rPr>
+          <w:rFonts w:ascii="Cambria" w:hAnsi="Cambria"/>
+        </w:rPr>
+        <w:t xml:space="preserve"> el tiempo de ejecución es de 8.672 segundos, mientras que con </w:t>
+      </w:r>
+      <w:proofErr w:type="spellStart"/>
+      <w:r>
+        <w:rPr>
+          <w:rFonts w:ascii="Cambria" w:hAnsi="Cambria"/>
+        </w:rPr>
+        <w:t>lmcut</w:t>
+      </w:r>
+      <w:proofErr w:type="spellEnd"/>
+      <w:r>
+        <w:rPr>
+          <w:rFonts w:ascii="Cambria" w:hAnsi="Cambria"/>
+        </w:rPr>
+        <w:t xml:space="preserve"> asciende a 35.282 segundos. Aunque ambas heurísticas son admisibles y producen planes óptimos, su comportamiento práctico difiere. La heurística </w:t>
+      </w:r>
+      <w:proofErr w:type="spellStart"/>
+      <w:r>
+        <w:rPr>
+          <w:rFonts w:ascii="Cambria" w:hAnsi="Cambria"/>
+        </w:rPr>
+        <w:t>hMAX</w:t>
+      </w:r>
+      <w:proofErr w:type="spellEnd"/>
+      <w:r>
+        <w:rPr>
+          <w:rFonts w:ascii="Cambria" w:hAnsi="Cambria"/>
+        </w:rPr>
+        <w:t xml:space="preserve"> es menos informativa, ya que solo considera el coste máximo individual de los subobjetivos en el problema relajado, lo que puede conducir a una exploración relativamente amplia del espacio de estados. Por su parte, </w:t>
+      </w:r>
+      <w:proofErr w:type="spellStart"/>
+      <w:r>
+        <w:rPr>
+          <w:rFonts w:ascii="Cambria" w:hAnsi="Cambria"/>
+        </w:rPr>
+        <w:t>lmcut</w:t>
+      </w:r>
+      <w:proofErr w:type="spellEnd"/>
+      <w:r>
+        <w:rPr>
+          <w:rFonts w:ascii="Cambria" w:hAnsi="Cambria"/>
+        </w:rPr>
+        <w:t xml:space="preserve"> es una heurística más sofisticada y generalmente más informativa, pero su cálculo es computacionalmente más costoso. En problemas de tamaño reducido, el coste adicional de computar </w:t>
+      </w:r>
+      <w:proofErr w:type="spellStart"/>
+      <w:r>
+        <w:rPr>
+          <w:rFonts w:ascii="Cambria" w:hAnsi="Cambria"/>
+        </w:rPr>
+        <w:t>lmcut</w:t>
+      </w:r>
+      <w:proofErr w:type="spellEnd"/>
+      <w:r>
+        <w:rPr>
+          <w:rFonts w:ascii="Cambria" w:hAnsi="Cambria"/>
+        </w:rPr>
+        <w:t xml:space="preserve"> puede superar el ahorro en nodos explorados, lo que explica que en este caso concreto resulte más lenta que </w:t>
+      </w:r>
+      <w:proofErr w:type="spellStart"/>
+      <w:r>
+        <w:rPr>
+          <w:rFonts w:ascii="Cambria" w:hAnsi="Cambria"/>
+        </w:rPr>
+        <w:t>hMAX</w:t>
+      </w:r>
+      <w:proofErr w:type="spellEnd"/>
+      <w:r>
+        <w:rPr>
+          <w:rFonts w:ascii="Cambria" w:hAnsi="Cambria"/>
+        </w:rPr>
+        <w:t>.</w:t>
       </w:r>
     </w:p>
     <w:p>
@@ -7526,7 +8569,21 @@
         <w:rPr>
           <w:rFonts w:ascii="Cambria" w:hAnsi="Cambria"/>
         </w:rPr>
-        <w:t xml:space="preserve"> (carriers). En la versión anterior, el dron disponía de dos brazos y el planificador debía considerar explícitamente qué caja estaba en cada brazo. Esta representación </w:t>
+        <w:t xml:space="preserve"> (</w:t>
+      </w:r>
+      <w:proofErr w:type="spellStart"/>
+      <w:r>
+        <w:rPr>
+          <w:rFonts w:ascii="Cambria" w:hAnsi="Cambria"/>
+        </w:rPr>
+        <w:t>carriers</w:t>
+      </w:r>
+      <w:proofErr w:type="spellEnd"/>
+      <w:r>
+        <w:rPr>
+          <w:rFonts w:ascii="Cambria" w:hAnsi="Cambria"/>
+        </w:rPr>
+        <w:t xml:space="preserve">). En la versión anterior, el dron disponía de dos brazos y el planificador debía considerar explícitamente qué caja estaba en cada brazo. Esta representación </w:t>
       </w:r>
       <w:r>
         <w:rPr>
@@ -7606,6 +8663,7 @@
         </w:rPr>
         <w:t xml:space="preserve">, en el nuevo dominio se ha eliminado completamente el tipo </w:t>
       </w:r>
+      <w:proofErr w:type="spellStart"/>
       <w:r>
         <w:rPr>
           <w:rFonts w:ascii="Cambria" w:hAnsi="Cambria"/>
@@ -7614,6 +8672,7 @@
         </w:rPr>
         <w:t>arm</w:t>
       </w:r>
+      <w:proofErr w:type="spellEnd"/>
       <w:r>
         <w:rPr>
           <w:rFonts w:ascii="Cambria" w:hAnsi="Cambria"/>
@@ -7658,7 +8717,43 @@
         <w:rPr>
           <w:rFonts w:ascii="Cambria" w:hAnsi="Cambria"/>
         </w:rPr>
-        <w:t xml:space="preserve">(holding ?d ?c) junto con el predicado auxiliar (drone-free ?d). De esta forma se </w:t>
+        <w:t>(</w:t>
+      </w:r>
+      <w:proofErr w:type="gramStart"/>
+      <w:r>
+        <w:rPr>
+          <w:rFonts w:ascii="Cambria" w:hAnsi="Cambria"/>
+        </w:rPr>
+        <w:t>holding ?</w:t>
+      </w:r>
+      <w:proofErr w:type="gramEnd"/>
+      <w:r>
+        <w:rPr>
+          <w:rFonts w:ascii="Cambria" w:hAnsi="Cambria"/>
+        </w:rPr>
+        <w:t>d ?c) junto con el predicado auxiliar (</w:t>
+      </w:r>
+      <w:proofErr w:type="spellStart"/>
+      <w:proofErr w:type="gramStart"/>
+      <w:r>
+        <w:rPr>
+          <w:rFonts w:ascii="Cambria" w:hAnsi="Cambria"/>
+        </w:rPr>
+        <w:t>drone</w:t>
+      </w:r>
+      <w:proofErr w:type="spellEnd"/>
+      <w:r>
+        <w:rPr>
+          <w:rFonts w:ascii="Cambria" w:hAnsi="Cambria"/>
+        </w:rPr>
+        <w:t>-free ?</w:t>
+      </w:r>
+      <w:proofErr w:type="gramEnd"/>
+      <w:r>
+        <w:rPr>
+          <w:rFonts w:ascii="Cambria" w:hAnsi="Cambria"/>
+        </w:rPr>
+        <w:t xml:space="preserve">d). De esta forma se </w:t>
       </w:r>
       <w:r>
         <w:rPr>
@@ -7700,7 +8795,21 @@
         <w:rPr>
           <w:rFonts w:ascii="Cambria" w:hAnsi="Cambria"/>
         </w:rPr>
-        <w:t xml:space="preserve"> simultáneamente, manteniendo la compatibilidad con planificadores basados en STRIPS, como pyperplan, y evitando el uso de cuantificadores o ADL.</w:t>
+        <w:t xml:space="preserve"> simultáneamente, manteniendo la compatibilidad con planificadores basados en STRIPS, como </w:t>
+      </w:r>
+      <w:proofErr w:type="spellStart"/>
+      <w:r>
+        <w:rPr>
+          <w:rFonts w:ascii="Cambria" w:hAnsi="Cambria"/>
+        </w:rPr>
+        <w:t>pyperplan</w:t>
+      </w:r>
+      <w:proofErr w:type="spellEnd"/>
+      <w:r>
+        <w:rPr>
+          <w:rFonts w:ascii="Cambria" w:hAnsi="Cambria"/>
+        </w:rPr>
+        <w:t>, y evitando el uso de cuantificadores o ADL.</w:t>
       </w:r>
     </w:p>
     <w:p>
@@ -7736,8 +8845,18 @@
           <w:b/>
           <w:bCs/>
         </w:rPr>
-        <w:t>tipo carrier</w:t>
-      </w:r>
+        <w:t xml:space="preserve">tipo </w:t>
+      </w:r>
+      <w:proofErr w:type="spellStart"/>
+      <w:r>
+        <w:rPr>
+          <w:rFonts w:ascii="Cambria" w:hAnsi="Cambria"/>
+          <w:b/>
+          <w:bCs/>
+        </w:rPr>
+        <w:t>carrier</w:t>
+      </w:r>
+      <w:proofErr w:type="spellEnd"/>
       <w:r>
         <w:rPr>
           <w:rFonts w:ascii="Cambria" w:hAnsi="Cambria"/>
@@ -7770,7 +8889,21 @@
         <w:rPr>
           <w:rFonts w:ascii="Cambria" w:hAnsi="Cambria"/>
         </w:rPr>
-        <w:t xml:space="preserve"> del transportador mediante el predicado (in ?c ?ca), y se controla el número total de cajas almacenadas mediante un mecanismo numérico abstracto.</w:t>
+        <w:t xml:space="preserve"> del transportador mediante el predicado (</w:t>
+      </w:r>
+      <w:proofErr w:type="gramStart"/>
+      <w:r>
+        <w:rPr>
+          <w:rFonts w:ascii="Cambria" w:hAnsi="Cambria"/>
+        </w:rPr>
+        <w:t>in ?</w:t>
+      </w:r>
+      <w:proofErr w:type="gramEnd"/>
+      <w:r>
+        <w:rPr>
+          <w:rFonts w:ascii="Cambria" w:hAnsi="Cambria"/>
+        </w:rPr>
+        <w:t>c ?ca), y se controla el número total de cajas almacenadas mediante un mecanismo numérico abstracto.</w:t>
       </w:r>
     </w:p>
     <w:p>
@@ -7790,7 +8923,35 @@
         <w:rPr>
           <w:rFonts w:ascii="Cambria" w:hAnsi="Cambria"/>
         </w:rPr>
-        <w:t xml:space="preserve">uchos planificadores no soportan fluentes numéricos, la capacidad del transportador se ha modelado utilizando objetos de tipo num y el predicado (siguiente ?n1 ?n2) para representar relaciones sucesivas entre números enteros. Así, el número de </w:t>
+        <w:t xml:space="preserve">uchos planificadores no soportan fluentes numéricos, la capacidad del transportador se ha modelado utilizando objetos de tipo </w:t>
+      </w:r>
+      <w:proofErr w:type="spellStart"/>
+      <w:r>
+        <w:rPr>
+          <w:rFonts w:ascii="Cambria" w:hAnsi="Cambria"/>
+        </w:rPr>
+        <w:t>num</w:t>
+      </w:r>
+      <w:proofErr w:type="spellEnd"/>
+      <w:r>
+        <w:rPr>
+          <w:rFonts w:ascii="Cambria" w:hAnsi="Cambria"/>
+        </w:rPr>
+        <w:t xml:space="preserve"> y el predicado (</w:t>
+      </w:r>
+      <w:proofErr w:type="gramStart"/>
+      <w:r>
+        <w:rPr>
+          <w:rFonts w:ascii="Cambria" w:hAnsi="Cambria"/>
+        </w:rPr>
+        <w:t>siguiente ?</w:t>
+      </w:r>
+      <w:proofErr w:type="gramEnd"/>
+      <w:r>
+        <w:rPr>
+          <w:rFonts w:ascii="Cambria" w:hAnsi="Cambria"/>
+        </w:rPr>
+        <w:t xml:space="preserve">n1 ?n2) para representar relaciones sucesivas entre números enteros. Así, el número de </w:t>
       </w:r>
       <w:r>
         <w:rPr>
@@ -7804,7 +8965,29 @@
         <w:rPr>
           <w:rFonts w:ascii="Cambria" w:hAnsi="Cambria"/>
         </w:rPr>
-        <w:t xml:space="preserve"> se representa mediante (carrier-load ?ca ?n), mientras que la </w:t>
+        <w:t xml:space="preserve"> se representa mediante (</w:t>
+      </w:r>
+      <w:proofErr w:type="spellStart"/>
+      <w:proofErr w:type="gramStart"/>
+      <w:r>
+        <w:rPr>
+          <w:rFonts w:ascii="Cambria" w:hAnsi="Cambria"/>
+        </w:rPr>
+        <w:t>carrier</w:t>
+      </w:r>
+      <w:proofErr w:type="spellEnd"/>
+      <w:r>
+        <w:rPr>
+          <w:rFonts w:ascii="Cambria" w:hAnsi="Cambria"/>
+        </w:rPr>
+        <w:t>-load ?</w:t>
+      </w:r>
+      <w:proofErr w:type="gramEnd"/>
+      <w:r>
+        <w:rPr>
+          <w:rFonts w:ascii="Cambria" w:hAnsi="Cambria"/>
+        </w:rPr>
+        <w:t xml:space="preserve">ca ?n), mientras que la </w:t>
       </w:r>
       <w:r>
         <w:rPr>
@@ -7818,7 +9001,29 @@
         <w:rPr>
           <w:rFonts w:ascii="Cambria" w:hAnsi="Cambria"/>
         </w:rPr>
-        <w:t xml:space="preserve"> se define con (carrier-capacity ?ca ?n). Al </w:t>
+        <w:t xml:space="preserve"> se define con (</w:t>
+      </w:r>
+      <w:proofErr w:type="spellStart"/>
+      <w:proofErr w:type="gramStart"/>
+      <w:r>
+        <w:rPr>
+          <w:rFonts w:ascii="Cambria" w:hAnsi="Cambria"/>
+        </w:rPr>
+        <w:t>carrier-capacity</w:t>
+      </w:r>
+      <w:proofErr w:type="spellEnd"/>
+      <w:r>
+        <w:rPr>
+          <w:rFonts w:ascii="Cambria" w:hAnsi="Cambria"/>
+        </w:rPr>
+        <w:t xml:space="preserve"> ?</w:t>
+      </w:r>
+      <w:proofErr w:type="gramEnd"/>
+      <w:r>
+        <w:rPr>
+          <w:rFonts w:ascii="Cambria" w:hAnsi="Cambria"/>
+        </w:rPr>
+        <w:t xml:space="preserve">ca ?n). Al </w:t>
       </w:r>
       <w:r>
         <w:rPr>
@@ -7876,14 +9081,34 @@
           <w:rFonts w:ascii="Cambria" w:hAnsi="Cambria"/>
         </w:rPr>
       </w:pPr>
-      <w:r>
-        <w:rPr>
-          <w:rFonts w:ascii="Cambria" w:hAnsi="Cambria"/>
-          <w:b/>
-          <w:bCs/>
-        </w:rPr>
-        <w:t>put-in-carrier</w:t>
-      </w:r>
+      <w:proofErr w:type="spellStart"/>
+      <w:r>
+        <w:rPr>
+          <w:rFonts w:ascii="Cambria" w:hAnsi="Cambria"/>
+          <w:b/>
+          <w:bCs/>
+        </w:rPr>
+        <w:t>put</w:t>
+      </w:r>
+      <w:proofErr w:type="spellEnd"/>
+      <w:r>
+        <w:rPr>
+          <w:rFonts w:ascii="Cambria" w:hAnsi="Cambria"/>
+          <w:b/>
+          <w:bCs/>
+        </w:rPr>
+        <w:t>-</w:t>
+      </w:r>
+      <w:proofErr w:type="spellStart"/>
+      <w:r>
+        <w:rPr>
+          <w:rFonts w:ascii="Cambria" w:hAnsi="Cambria"/>
+          <w:b/>
+          <w:bCs/>
+        </w:rPr>
+        <w:t>in-carrier</w:t>
+      </w:r>
+      <w:proofErr w:type="spellEnd"/>
       <w:r>
         <w:rPr>
           <w:rFonts w:ascii="Cambria" w:hAnsi="Cambria"/>
@@ -7896,6 +9121,7 @@
         </w:rPr>
         <w:t xml:space="preserve"> </w:t>
       </w:r>
+      <w:proofErr w:type="spellStart"/>
       <w:r>
         <w:rPr>
           <w:rFonts w:ascii="Cambria" w:hAnsi="Cambria"/>
@@ -7904,6 +9130,7 @@
         </w:rPr>
         <w:t>take-from-carrier</w:t>
       </w:r>
+      <w:proofErr w:type="spellEnd"/>
       <w:r>
         <w:rPr>
           <w:rFonts w:ascii="Cambria" w:hAnsi="Cambria"/>
@@ -7922,8 +9149,18 @@
           <w:b/>
           <w:bCs/>
         </w:rPr>
-        <w:t>pick-up-carrier</w:t>
-      </w:r>
+        <w:t>pick-up-</w:t>
+      </w:r>
+      <w:proofErr w:type="spellStart"/>
+      <w:r>
+        <w:rPr>
+          <w:rFonts w:ascii="Cambria" w:hAnsi="Cambria"/>
+          <w:b/>
+          <w:bCs/>
+        </w:rPr>
+        <w:t>carrier</w:t>
+      </w:r>
+      <w:proofErr w:type="spellEnd"/>
       <w:r>
         <w:rPr>
           <w:rFonts w:ascii="Cambria" w:hAnsi="Cambria"/>
@@ -7956,13 +9193,23 @@
         </w:rPr>
         <w:t xml:space="preserve"> </w:t>
       </w:r>
-      <w:r>
-        <w:rPr>
-          <w:rFonts w:ascii="Cambria" w:hAnsi="Cambria"/>
-          <w:b/>
-          <w:bCs/>
-        </w:rPr>
-        <w:t xml:space="preserve">drop-carrier, </w:t>
+      <w:proofErr w:type="spellStart"/>
+      <w:r>
+        <w:rPr>
+          <w:rFonts w:ascii="Cambria" w:hAnsi="Cambria"/>
+          <w:b/>
+          <w:bCs/>
+        </w:rPr>
+        <w:t>drop-carrier</w:t>
+      </w:r>
+      <w:proofErr w:type="spellEnd"/>
+      <w:r>
+        <w:rPr>
+          <w:rFonts w:ascii="Cambria" w:hAnsi="Cambria"/>
+          <w:b/>
+          <w:bCs/>
+        </w:rPr>
+        <w:t xml:space="preserve">, </w:t>
       </w:r>
       <w:r>
         <w:rPr>
@@ -7982,13 +9229,59 @@
           <w:rFonts w:ascii="Cambria" w:hAnsi="Cambria"/>
           <w:b/>
         </w:rPr>
-        <w:t xml:space="preserve">Fly-and-move-carrier, </w:t>
-      </w:r>
-      <w:r>
-        <w:rPr>
-          <w:rFonts w:ascii="Cambria" w:hAnsi="Cambria"/>
-        </w:rPr>
-        <w:t>acción alternativa a fly para mover el transportador a la</w:t>
+        <w:t>Fly-and-</w:t>
+      </w:r>
+      <w:proofErr w:type="spellStart"/>
+      <w:r>
+        <w:rPr>
+          <w:rFonts w:ascii="Cambria" w:hAnsi="Cambria"/>
+          <w:b/>
+        </w:rPr>
+        <w:t>move</w:t>
+      </w:r>
+      <w:proofErr w:type="spellEnd"/>
+      <w:r>
+        <w:rPr>
+          <w:rFonts w:ascii="Cambria" w:hAnsi="Cambria"/>
+          <w:b/>
+        </w:rPr>
+        <w:t>-</w:t>
+      </w:r>
+      <w:proofErr w:type="spellStart"/>
+      <w:r>
+        <w:rPr>
+          <w:rFonts w:ascii="Cambria" w:hAnsi="Cambria"/>
+          <w:b/>
+        </w:rPr>
+        <w:t>carrier</w:t>
+      </w:r>
+      <w:proofErr w:type="spellEnd"/>
+      <w:r>
+        <w:rPr>
+          <w:rFonts w:ascii="Cambria" w:hAnsi="Cambria"/>
+          <w:b/>
+        </w:rPr>
+        <w:t xml:space="preserve">, </w:t>
+      </w:r>
+      <w:r>
+        <w:rPr>
+          <w:rFonts w:ascii="Cambria" w:hAnsi="Cambria"/>
+        </w:rPr>
+        <w:t xml:space="preserve">acción alternativa a </w:t>
+      </w:r>
+      <w:proofErr w:type="spellStart"/>
+      <w:r>
+        <w:rPr>
+          <w:rFonts w:ascii="Cambria" w:hAnsi="Cambria"/>
+        </w:rPr>
+        <w:t>fly</w:t>
+      </w:r>
+      <w:proofErr w:type="spellEnd"/>
+      <w:r>
+        <w:rPr>
+          <w:rFonts w:ascii="Cambria" w:hAnsi="Cambria"/>
+        </w:rPr>
+        <w:t xml:space="preserve"> para mover el transportador a la</w:t>
       </w:r>
       <w:r>
         <w:rPr>
@@ -8256,6 +9549,7 @@
         </w:rPr>
         <w:t xml:space="preserve"> la generación de objetos de tipo </w:t>
       </w:r>
+      <w:proofErr w:type="spellStart"/>
       <w:r>
         <w:rPr>
           <w:rFonts w:ascii="Cambria" w:hAnsi="Cambria"/>
@@ -8266,6 +9560,7 @@
         </w:rPr>
         <w:t>arm</w:t>
       </w:r>
+      <w:proofErr w:type="spellEnd"/>
       <w:r>
         <w:rPr>
           <w:rFonts w:ascii="Cambria" w:hAnsi="Cambria"/>
@@ -8286,19 +9581,37 @@
         </w:rPr>
         <w:t xml:space="preserve"> el predicado (</w:t>
       </w:r>
-      <w:r>
-        <w:rPr>
-          <w:rFonts w:ascii="Cambria" w:hAnsi="Cambria"/>
-          <w:b/>
-          <w:bCs/>
-        </w:rPr>
-        <w:t>drone-free</w:t>
-      </w:r>
-      <w:r>
-        <w:rPr>
-          <w:rFonts w:ascii="Cambria" w:hAnsi="Cambria"/>
-        </w:rPr>
-        <w:t xml:space="preserve"> ?d) para cada dron, indicando que inicialmente no está sosteniendo ninguna caja. Esto permite modelar de forma sencilla que el dron solo puede transportar una caja directamente en cada momento.</w:t>
+      <w:proofErr w:type="spellStart"/>
+      <w:proofErr w:type="gramStart"/>
+      <w:r>
+        <w:rPr>
+          <w:rFonts w:ascii="Cambria" w:hAnsi="Cambria"/>
+          <w:b/>
+          <w:bCs/>
+        </w:rPr>
+        <w:t>drone</w:t>
+      </w:r>
+      <w:proofErr w:type="spellEnd"/>
+      <w:r>
+        <w:rPr>
+          <w:rFonts w:ascii="Cambria" w:hAnsi="Cambria"/>
+          <w:b/>
+          <w:bCs/>
+        </w:rPr>
+        <w:t>-free</w:t>
+      </w:r>
+      <w:r>
+        <w:rPr>
+          <w:rFonts w:ascii="Cambria" w:hAnsi="Cambria"/>
+        </w:rPr>
+        <w:t xml:space="preserve"> ?</w:t>
+      </w:r>
+      <w:proofErr w:type="gramEnd"/>
+      <w:r>
+        <w:rPr>
+          <w:rFonts w:ascii="Cambria" w:hAnsi="Cambria"/>
+        </w:rPr>
+        <w:t>d) para cada dron, indicando que inicialmente no está sosteniendo ninguna caja. Esto permite modelar de forma sencilla que el dron solo puede transportar una caja directamente en cada momento.</w:t>
       </w:r>
     </w:p>
     <w:p>
@@ -8342,6 +9655,7 @@
         </w:rPr>
         <w:t xml:space="preserve"> de tipo </w:t>
       </w:r>
+      <w:proofErr w:type="spellStart"/>
       <w:r>
         <w:rPr>
           <w:rFonts w:ascii="Cambria" w:hAnsi="Cambria"/>
@@ -8350,11 +9664,40 @@
         </w:rPr>
         <w:t>carrier</w:t>
       </w:r>
-      <w:r>
-        <w:rPr>
-          <w:rFonts w:ascii="Cambria" w:hAnsi="Cambria"/>
-        </w:rPr>
-        <w:t xml:space="preserve">, correspondientes a los transportadores. Estos objetos se crean según el parámetro --carriers introducido por línea de comandos. Todos los transportadores se inicializan en la localización depot, tal como establece el enunciado. Además, se </w:t>
+      <w:proofErr w:type="spellEnd"/>
+      <w:r>
+        <w:rPr>
+          <w:rFonts w:ascii="Cambria" w:hAnsi="Cambria"/>
+        </w:rPr>
+        <w:t>, correspondientes a los transportadores. Estos objetos se crean según el parámetro --</w:t>
+      </w:r>
+      <w:proofErr w:type="spellStart"/>
+      <w:r>
+        <w:rPr>
+          <w:rFonts w:ascii="Cambria" w:hAnsi="Cambria"/>
+        </w:rPr>
+        <w:t>carriers</w:t>
+      </w:r>
+      <w:proofErr w:type="spellEnd"/>
+      <w:r>
+        <w:rPr>
+          <w:rFonts w:ascii="Cambria" w:hAnsi="Cambria"/>
+        </w:rPr>
+        <w:t xml:space="preserve"> introducido por línea de comandos. Todos los transportadores se inicializan en la localización </w:t>
+      </w:r>
+      <w:proofErr w:type="spellStart"/>
+      <w:r>
+        <w:rPr>
+          <w:rFonts w:ascii="Cambria" w:hAnsi="Cambria"/>
+        </w:rPr>
+        <w:t>depot</w:t>
+      </w:r>
+      <w:proofErr w:type="spellEnd"/>
+      <w:r>
+        <w:rPr>
+          <w:rFonts w:ascii="Cambria" w:hAnsi="Cambria"/>
+        </w:rPr>
+        <w:t xml:space="preserve">, tal como establece el enunciado. Además, se </w:t>
       </w:r>
       <w:r>
         <w:rPr>
@@ -8368,7 +9711,35 @@
         <w:rPr>
           <w:rFonts w:ascii="Cambria" w:hAnsi="Cambria"/>
         </w:rPr>
-        <w:t xml:space="preserve"> su carga mediante el predicado (carrier-load carrierX n0) y su </w:t>
+        <w:t xml:space="preserve"> su carga mediante el predicado (</w:t>
+      </w:r>
+      <w:proofErr w:type="spellStart"/>
+      <w:r>
+        <w:rPr>
+          <w:rFonts w:ascii="Cambria" w:hAnsi="Cambria"/>
+        </w:rPr>
+        <w:t>carrier</w:t>
+      </w:r>
+      <w:proofErr w:type="spellEnd"/>
+      <w:r>
+        <w:rPr>
+          <w:rFonts w:ascii="Cambria" w:hAnsi="Cambria"/>
+        </w:rPr>
+        <w:t xml:space="preserve">-load </w:t>
+      </w:r>
+      <w:proofErr w:type="spellStart"/>
+      <w:r>
+        <w:rPr>
+          <w:rFonts w:ascii="Cambria" w:hAnsi="Cambria"/>
+        </w:rPr>
+        <w:t>carrierX</w:t>
+      </w:r>
+      <w:proofErr w:type="spellEnd"/>
+      <w:r>
+        <w:rPr>
+          <w:rFonts w:ascii="Cambria" w:hAnsi="Cambria"/>
+        </w:rPr>
+        <w:t xml:space="preserve"> n0) y su </w:t>
       </w:r>
       <w:r>
         <w:rPr>
@@ -8382,7 +9753,35 @@
         <w:rPr>
           <w:rFonts w:ascii="Cambria" w:hAnsi="Cambria"/>
         </w:rPr>
-        <w:t xml:space="preserve"> mediante (carrier-capacity carrierX n4), lo que permite controlar que no se superen las cuatro cajas permitidas.</w:t>
+        <w:t xml:space="preserve"> mediante (</w:t>
+      </w:r>
+      <w:proofErr w:type="spellStart"/>
+      <w:r>
+        <w:rPr>
+          <w:rFonts w:ascii="Cambria" w:hAnsi="Cambria"/>
+        </w:rPr>
+        <w:t>carrier-capacity</w:t>
+      </w:r>
+      <w:proofErr w:type="spellEnd"/>
+      <w:r>
+        <w:rPr>
+          <w:rFonts w:ascii="Cambria" w:hAnsi="Cambria"/>
+        </w:rPr>
+        <w:t xml:space="preserve"> </w:t>
+      </w:r>
+      <w:proofErr w:type="spellStart"/>
+      <w:r>
+        <w:rPr>
+          <w:rFonts w:ascii="Cambria" w:hAnsi="Cambria"/>
+        </w:rPr>
+        <w:t>carrierX</w:t>
+      </w:r>
+      <w:proofErr w:type="spellEnd"/>
+      <w:r>
+        <w:rPr>
+          <w:rFonts w:ascii="Cambria" w:hAnsi="Cambria"/>
+        </w:rPr>
+        <w:t xml:space="preserve"> n4), lo que permite controlar que no se superen las cuatro cajas permitidas.</w:t>
       </w:r>
     </w:p>
     <w:p>
@@ -8432,8 +9831,18 @@
           <w:b/>
           <w:bCs/>
         </w:rPr>
-        <w:t>tipo num</w:t>
-      </w:r>
+        <w:t xml:space="preserve">tipo </w:t>
+      </w:r>
+      <w:proofErr w:type="spellStart"/>
+      <w:r>
+        <w:rPr>
+          <w:rFonts w:ascii="Cambria" w:hAnsi="Cambria"/>
+          <w:b/>
+          <w:bCs/>
+        </w:rPr>
+        <w:t>num</w:t>
+      </w:r>
+      <w:proofErr w:type="spellEnd"/>
       <w:r>
         <w:rPr>
           <w:rFonts w:ascii="Cambria" w:hAnsi="Cambria"/>
@@ -8480,7 +9889,21 @@
         <w:rPr>
           <w:rFonts w:ascii="Cambria" w:hAnsi="Cambria"/>
         </w:rPr>
-        <w:t xml:space="preserve"> y en estado libre (drone-free).</w:t>
+        <w:t xml:space="preserve"> y en estado libre (</w:t>
+      </w:r>
+      <w:proofErr w:type="spellStart"/>
+      <w:r>
+        <w:rPr>
+          <w:rFonts w:ascii="Cambria" w:hAnsi="Cambria"/>
+        </w:rPr>
+        <w:t>drone</w:t>
+      </w:r>
+      <w:proofErr w:type="spellEnd"/>
+      <w:r>
+        <w:rPr>
+          <w:rFonts w:ascii="Cambria" w:hAnsi="Cambria"/>
+        </w:rPr>
+        <w:t>-free).</w:t>
       </w:r>
       <w:r>
         <w:rPr>
@@ -8520,6 +9943,7 @@
         </w:rPr>
         <w:t>La capacidad máxima se fija mediante el predicado (</w:t>
       </w:r>
+      <w:proofErr w:type="spellStart"/>
       <w:r>
         <w:rPr>
           <w:rFonts w:ascii="Cambria" w:hAnsi="Cambria"/>
@@ -8528,18 +9952,33 @@
         </w:rPr>
         <w:t>carrier-capacity</w:t>
       </w:r>
-      <w:r>
-        <w:rPr>
-          <w:rFonts w:ascii="Cambria" w:hAnsi="Cambria"/>
-        </w:rPr>
-        <w:t xml:space="preserve"> carrierX n4).</w:t>
-      </w:r>
+      <w:proofErr w:type="spellEnd"/>
       <w:r>
         <w:rPr>
           <w:rFonts w:ascii="Cambria" w:hAnsi="Cambria"/>
         </w:rPr>
         <w:t xml:space="preserve"> </w:t>
       </w:r>
+      <w:proofErr w:type="spellStart"/>
+      <w:r>
+        <w:rPr>
+          <w:rFonts w:ascii="Cambria" w:hAnsi="Cambria"/>
+        </w:rPr>
+        <w:t>carrierX</w:t>
+      </w:r>
+      <w:proofErr w:type="spellEnd"/>
+      <w:r>
+        <w:rPr>
+          <w:rFonts w:ascii="Cambria" w:hAnsi="Cambria"/>
+        </w:rPr>
+        <w:t xml:space="preserve"> n4).</w:t>
+      </w:r>
+      <w:r>
+        <w:rPr>
+          <w:rFonts w:ascii="Cambria" w:hAnsi="Cambria"/>
+        </w:rPr>
+        <w:t xml:space="preserve"> </w:t>
+      </w:r>
       <w:r>
         <w:rPr>
           <w:rFonts w:ascii="Cambria" w:hAnsi="Cambria"/>
@@ -8734,7 +10173,21 @@
         <w:rPr>
           <w:rFonts w:ascii="Cambria" w:hAnsi="Cambria"/>
         </w:rPr>
-        <w:t>, lo que permite cumplir el requisito del enunciado de poder transportar hasta cuatro cajas por carrier. Esta elección simplifica la generación de problemas y evita inconsistencias en la cadena numérica.</w:t>
+        <w:t xml:space="preserve">, lo que permite cumplir el requisito del enunciado de poder transportar hasta cuatro cajas por </w:t>
+      </w:r>
+      <w:proofErr w:type="spellStart"/>
+      <w:r>
+        <w:rPr>
+          <w:rFonts w:ascii="Cambria" w:hAnsi="Cambria"/>
+        </w:rPr>
+        <w:t>carrier</w:t>
+      </w:r>
+      <w:proofErr w:type="spellEnd"/>
+      <w:r>
+        <w:rPr>
+          <w:rFonts w:ascii="Cambria" w:hAnsi="Cambria"/>
+        </w:rPr>
+        <w:t>. Esta elección simplifica la generación de problemas y evita inconsistencias en la cadena numérica.</w:t>
       </w:r>
     </w:p>
     <w:p>
@@ -8799,19 +10252,49 @@
         <w:rPr>
           <w:rFonts w:ascii="Cambria" w:hAnsi="Cambria"/>
         </w:rPr>
-        <w:t>Una vez implementado el nuevo dominio y adaptado el generador de problemas, se procedió a verificar su correcto funcionamiento utilizando pyperplan</w:t>
-      </w:r>
-      <w:r>
-        <w:rPr>
-          <w:rFonts w:ascii="Cambria" w:hAnsi="Cambria"/>
-        </w:rPr>
-        <w:t xml:space="preserve"> o ff</w:t>
-      </w:r>
-      <w:r>
-        <w:rPr>
-          <w:rFonts w:ascii="Cambria" w:hAnsi="Cambria"/>
-        </w:rPr>
-        <w:t>. En primer lugar, se comprobó que tanto el dominio como los problemas generados eran sintácticamente válidos y podían ser procesados por el planificador sin errores de parsing ni de tipado.</w:t>
+        <w:t xml:space="preserve">Una vez implementado el nuevo dominio y adaptado el generador de problemas, se procedió a verificar su correcto funcionamiento utilizando </w:t>
+      </w:r>
+      <w:proofErr w:type="spellStart"/>
+      <w:r>
+        <w:rPr>
+          <w:rFonts w:ascii="Cambria" w:hAnsi="Cambria"/>
+        </w:rPr>
+        <w:t>pyperplan</w:t>
+      </w:r>
+      <w:proofErr w:type="spellEnd"/>
+      <w:r>
+        <w:rPr>
+          <w:rFonts w:ascii="Cambria" w:hAnsi="Cambria"/>
+        </w:rPr>
+        <w:t xml:space="preserve"> o </w:t>
+      </w:r>
+      <w:proofErr w:type="spellStart"/>
+      <w:r>
+        <w:rPr>
+          <w:rFonts w:ascii="Cambria" w:hAnsi="Cambria"/>
+        </w:rPr>
+        <w:t>ff</w:t>
+      </w:r>
+      <w:proofErr w:type="spellEnd"/>
+      <w:r>
+        <w:rPr>
+          <w:rFonts w:ascii="Cambria" w:hAnsi="Cambria"/>
+        </w:rPr>
+        <w:t xml:space="preserve">. En primer lugar, se comprobó que tanto el dominio como los problemas generados eran sintácticamente válidos y podían ser procesados por el planificador sin errores de </w:t>
+      </w:r>
+      <w:proofErr w:type="spellStart"/>
+      <w:r>
+        <w:rPr>
+          <w:rFonts w:ascii="Cambria" w:hAnsi="Cambria"/>
+        </w:rPr>
+        <w:t>parsing</w:t>
+      </w:r>
+      <w:proofErr w:type="spellEnd"/>
+      <w:r>
+        <w:rPr>
+          <w:rFonts w:ascii="Cambria" w:hAnsi="Cambria"/>
+        </w:rPr>
+        <w:t xml:space="preserve"> ni de tipado.</w:t>
       </w:r>
     </w:p>
     <w:p>
@@ -8863,14 +10346,58 @@
         <w:rPr>
           <w:rFonts w:ascii="Cambria" w:hAnsi="Cambria"/>
         </w:rPr>
-        <w:t xml:space="preserve"> Para forzar que utilice las acciones propias del Carrier hemos eliminado solo para esta prueba la acción fly obligando al planificador a utilizar la acción </w:t>
-      </w:r>
-      <w:r>
-        <w:rPr>
-          <w:rFonts w:ascii="Cambria" w:hAnsi="Cambria"/>
-        </w:rPr>
-        <w:t>fly-and-move-carrier</w:t>
-      </w:r>
+        <w:t xml:space="preserve"> Para forzar que utilice las acciones propias del Carrier hemos eliminado solo para esta prueba la acción </w:t>
+      </w:r>
+      <w:proofErr w:type="spellStart"/>
+      <w:r>
+        <w:rPr>
+          <w:rFonts w:ascii="Cambria" w:hAnsi="Cambria"/>
+        </w:rPr>
+        <w:t>fly</w:t>
+      </w:r>
+      <w:proofErr w:type="spellEnd"/>
+      <w:r>
+        <w:rPr>
+          <w:rFonts w:ascii="Cambria" w:hAnsi="Cambria"/>
+        </w:rPr>
+        <w:t xml:space="preserve"> obligando al planificador a utilizar la acción </w:t>
+      </w:r>
+      <w:proofErr w:type="spellStart"/>
+      <w:r>
+        <w:rPr>
+          <w:rFonts w:ascii="Cambria" w:hAnsi="Cambria"/>
+        </w:rPr>
+        <w:t>fly</w:t>
+      </w:r>
+      <w:proofErr w:type="spellEnd"/>
+      <w:r>
+        <w:rPr>
+          <w:rFonts w:ascii="Cambria" w:hAnsi="Cambria"/>
+        </w:rPr>
+        <w:t>-and-</w:t>
+      </w:r>
+      <w:proofErr w:type="spellStart"/>
+      <w:r>
+        <w:rPr>
+          <w:rFonts w:ascii="Cambria" w:hAnsi="Cambria"/>
+        </w:rPr>
+        <w:t>move</w:t>
+      </w:r>
+      <w:proofErr w:type="spellEnd"/>
+      <w:r>
+        <w:rPr>
+          <w:rFonts w:ascii="Cambria" w:hAnsi="Cambria"/>
+        </w:rPr>
+        <w:t>-</w:t>
+      </w:r>
+      <w:proofErr w:type="spellStart"/>
+      <w:r>
+        <w:rPr>
+          <w:rFonts w:ascii="Cambria" w:hAnsi="Cambria"/>
+        </w:rPr>
+        <w:t>carrier</w:t>
+      </w:r>
+      <w:proofErr w:type="spellEnd"/>
       <w:r>
         <w:rPr>
           <w:rFonts w:ascii="Cambria" w:hAnsi="Cambria"/>
@@ -8919,7 +10446,14 @@
         <w:rPr>
           <w:rFonts w:ascii="Cambria" w:hAnsi="Cambria"/>
         </w:rPr>
-        <w:t xml:space="preserve"> -c 4 -g 4</w:t>
+        <w:t xml:space="preserve"> -c 4 -g </w:t>
+      </w:r>
+      <w:proofErr w:type="gramStart"/>
+      <w:r>
+        <w:rPr>
+          <w:rFonts w:ascii="Cambria" w:hAnsi="Cambria"/>
+        </w:rPr>
+        <w:t>4</w:t>
       </w:r>
       <w:r>
         <w:rPr>
@@ -8931,7 +10465,28 @@
         <w:rPr>
           <w:rFonts w:ascii="Cambria" w:hAnsi="Cambria"/>
         </w:rPr>
-        <w:t xml:space="preserve"> el cuál nos da un problema con los siguientes objetivos: </w:t>
+        <w:t xml:space="preserve"> el</w:t>
+      </w:r>
+      <w:proofErr w:type="gramEnd"/>
+      <w:r>
+        <w:rPr>
+          <w:rFonts w:ascii="Cambria" w:hAnsi="Cambria"/>
+        </w:rPr>
+        <w:t xml:space="preserve"> </w:t>
+      </w:r>
+      <w:proofErr w:type="spellStart"/>
+      <w:r>
+        <w:rPr>
+          <w:rFonts w:ascii="Cambria" w:hAnsi="Cambria"/>
+        </w:rPr>
+        <w:t>cuál</w:t>
+      </w:r>
+      <w:proofErr w:type="spellEnd"/>
+      <w:r>
+        <w:rPr>
+          <w:rFonts w:ascii="Cambria" w:hAnsi="Cambria"/>
+        </w:rPr>
+        <w:t xml:space="preserve"> nos da un problema con los siguientes objetivos: </w:t>
       </w:r>
       <w:r>
         <w:rPr>
@@ -8992,7 +10547,35 @@
         <w:rPr>
           <w:rFonts w:ascii="Cambria" w:hAnsi="Cambria"/>
         </w:rPr>
-        <w:t>y ejecutándolo de la siguiente forma: planutils run ff domain2.pddl emergency_carrier_d1_r1_l</w:t>
+        <w:t xml:space="preserve">y ejecutándolo de la siguiente forma: </w:t>
+      </w:r>
+      <w:proofErr w:type="spellStart"/>
+      <w:r>
+        <w:rPr>
+          <w:rFonts w:ascii="Cambria" w:hAnsi="Cambria"/>
+        </w:rPr>
+        <w:t>planutils</w:t>
+      </w:r>
+      <w:proofErr w:type="spellEnd"/>
+      <w:r>
+        <w:rPr>
+          <w:rFonts w:ascii="Cambria" w:hAnsi="Cambria"/>
+        </w:rPr>
+        <w:t xml:space="preserve"> run </w:t>
+      </w:r>
+      <w:proofErr w:type="spellStart"/>
+      <w:r>
+        <w:rPr>
+          <w:rFonts w:ascii="Cambria" w:hAnsi="Cambria"/>
+        </w:rPr>
+        <w:t>ff</w:t>
+      </w:r>
+      <w:proofErr w:type="spellEnd"/>
+      <w:r>
+        <w:rPr>
+          <w:rFonts w:ascii="Cambria" w:hAnsi="Cambria"/>
+        </w:rPr>
+        <w:t xml:space="preserve"> domain2.pddl emergency_carrier_d1_r1_l</w:t>
       </w:r>
       <w:r>
         <w:rPr>
@@ -9282,7 +10865,23 @@
         <w:t>C</w:t>
       </w:r>
       <w:r>
-        <w:t>ompararemos con los apartados de la parte 1 los resultados ya que podemos observar que aunque no se utilicen las acciones del Carrier por los motivos explicados anteriormente si que será diferente debido a que ya no tendrá dos brazos el dron.</w:t>
+        <w:t xml:space="preserve">ompararemos con los apartados de la parte 1 los resultados ya que podemos observar </w:t>
+      </w:r>
+      <w:proofErr w:type="gramStart"/>
+      <w:r>
+        <w:t>que</w:t>
+      </w:r>
+      <w:proofErr w:type="gramEnd"/>
+      <w:r>
+        <w:t xml:space="preserve"> aunque no se utilicen las acciones del Carrier por los motivos explicados anteriormente </w:t>
+      </w:r>
+      <w:proofErr w:type="spellStart"/>
+      <w:r>
+        <w:t>si</w:t>
+      </w:r>
+      <w:proofErr w:type="spellEnd"/>
+      <w:r>
+        <w:t xml:space="preserve"> que será diferente debido a que ya no tendrá dos brazos el dron.</w:t>
       </w:r>
     </w:p>
     <w:p>
@@ -9453,12 +11052,14 @@
                 <w:rFonts w:ascii="Cambria" w:hAnsi="Cambria"/>
               </w:rPr>
             </w:pPr>
+            <w:proofErr w:type="spellStart"/>
             <w:r>
               <w:rPr>
                 <w:rFonts w:ascii="Cambria" w:hAnsi="Cambria"/>
               </w:rPr>
               <w:t>hMAX</w:t>
             </w:r>
+            <w:proofErr w:type="spellEnd"/>
           </w:p>
         </w:tc>
         <w:tc>
@@ -9537,12 +11138,14 @@
                 <w:rFonts w:ascii="Cambria" w:hAnsi="Cambria"/>
               </w:rPr>
             </w:pPr>
+            <w:proofErr w:type="spellStart"/>
             <w:r>
               <w:rPr>
                 <w:rFonts w:ascii="Cambria" w:hAnsi="Cambria"/>
               </w:rPr>
               <w:t>hADD</w:t>
             </w:r>
+            <w:proofErr w:type="spellEnd"/>
           </w:p>
         </w:tc>
         <w:tc>
@@ -9617,12 +11220,14 @@
                 <w:rFonts w:ascii="Cambria" w:hAnsi="Cambria"/>
               </w:rPr>
             </w:pPr>
+            <w:proofErr w:type="spellStart"/>
             <w:r>
               <w:rPr>
                 <w:rFonts w:ascii="Cambria" w:hAnsi="Cambria"/>
               </w:rPr>
               <w:t>hFF</w:t>
             </w:r>
+            <w:proofErr w:type="spellEnd"/>
           </w:p>
         </w:tc>
         <w:tc>
@@ -9777,12 +11382,14 @@
                 <w:rFonts w:ascii="Cambria" w:hAnsi="Cambria"/>
               </w:rPr>
             </w:pPr>
+            <w:proofErr w:type="spellStart"/>
             <w:r>
               <w:rPr>
                 <w:rFonts w:ascii="Cambria" w:hAnsi="Cambria"/>
               </w:rPr>
               <w:t>hMAX</w:t>
             </w:r>
+            <w:proofErr w:type="spellEnd"/>
           </w:p>
         </w:tc>
         <w:tc>
@@ -9816,11 +11423,19 @@
                 <w:rFonts w:ascii="Cambria" w:hAnsi="Cambria"/>
               </w:rPr>
             </w:pPr>
-            <w:r>
-              <w:rPr>
-                <w:rFonts w:ascii="Cambria" w:hAnsi="Cambria"/>
-              </w:rPr>
-              <w:t>Killed (no se ha llegado a completar)</w:t>
+            <w:proofErr w:type="spellStart"/>
+            <w:r>
+              <w:rPr>
+                <w:rFonts w:ascii="Cambria" w:hAnsi="Cambria"/>
+              </w:rPr>
+              <w:t>Killed</w:t>
+            </w:r>
+            <w:proofErr w:type="spellEnd"/>
+            <w:r>
+              <w:rPr>
+                <w:rFonts w:ascii="Cambria" w:hAnsi="Cambria"/>
+              </w:rPr>
+              <w:t xml:space="preserve"> (no se ha llegado a completar)</w:t>
             </w:r>
           </w:p>
         </w:tc>
@@ -9857,12 +11472,14 @@
                 <w:rFonts w:ascii="Cambria" w:hAnsi="Cambria"/>
               </w:rPr>
             </w:pPr>
+            <w:proofErr w:type="spellStart"/>
             <w:r>
               <w:rPr>
                 <w:rFonts w:ascii="Cambria" w:hAnsi="Cambria"/>
               </w:rPr>
               <w:t>hADD</w:t>
             </w:r>
+            <w:proofErr w:type="spellEnd"/>
           </w:p>
         </w:tc>
         <w:tc>
@@ -9937,12 +11554,14 @@
                 <w:rFonts w:ascii="Cambria" w:hAnsi="Cambria"/>
               </w:rPr>
             </w:pPr>
+            <w:proofErr w:type="spellStart"/>
             <w:r>
               <w:rPr>
                 <w:rFonts w:ascii="Cambria" w:hAnsi="Cambria"/>
               </w:rPr>
               <w:t>hFF</w:t>
             </w:r>
+            <w:proofErr w:type="spellEnd"/>
           </w:p>
         </w:tc>
         <w:tc>
@@ -10323,11 +11942,19 @@
                 <w:rFonts w:ascii="Cambria" w:hAnsi="Cambria"/>
               </w:rPr>
             </w:pPr>
-            <w:r>
-              <w:rPr>
-                <w:rFonts w:ascii="Cambria" w:hAnsi="Cambria"/>
-              </w:rPr>
-              <w:t>Killed (no se ha llegado a completar)</w:t>
+            <w:proofErr w:type="spellStart"/>
+            <w:r>
+              <w:rPr>
+                <w:rFonts w:ascii="Cambria" w:hAnsi="Cambria"/>
+              </w:rPr>
+              <w:t>Killed</w:t>
+            </w:r>
+            <w:proofErr w:type="spellEnd"/>
+            <w:r>
+              <w:rPr>
+                <w:rFonts w:ascii="Cambria" w:hAnsi="Cambria"/>
+              </w:rPr>
+              <w:t xml:space="preserve"> (no se ha llegado a completar)</w:t>
             </w:r>
           </w:p>
         </w:tc>
@@ -10347,8 +11974,16 @@
               <w:rPr>
                 <w:rFonts w:ascii="Cambria" w:hAnsi="Cambria"/>
               </w:rPr>
-              <w:t>A* + hMAX</w:t>
-            </w:r>
+              <w:t xml:space="preserve">A* + </w:t>
+            </w:r>
+            <w:proofErr w:type="spellStart"/>
+            <w:r>
+              <w:rPr>
+                <w:rFonts w:ascii="Cambria" w:hAnsi="Cambria"/>
+              </w:rPr>
+              <w:t>hMAX</w:t>
+            </w:r>
+            <w:proofErr w:type="spellEnd"/>
           </w:p>
         </w:tc>
         <w:tc>
@@ -10403,8 +12038,16 @@
               <w:rPr>
                 <w:rFonts w:ascii="Cambria" w:hAnsi="Cambria"/>
               </w:rPr>
-              <w:t>A* + lmcut</w:t>
-            </w:r>
+              <w:t xml:space="preserve">A* + </w:t>
+            </w:r>
+            <w:proofErr w:type="spellStart"/>
+            <w:r>
+              <w:rPr>
+                <w:rFonts w:ascii="Cambria" w:hAnsi="Cambria"/>
+              </w:rPr>
+              <w:t>lmcut</w:t>
+            </w:r>
+            <w:proofErr w:type="spellEnd"/>
           </w:p>
         </w:tc>
         <w:tc>
@@ -10498,8 +12141,18 @@
           <w:b/>
           <w:bCs/>
         </w:rPr>
-        <w:t>heurística hMAX</w:t>
-      </w:r>
+        <w:t xml:space="preserve">heurística </w:t>
+      </w:r>
+      <w:proofErr w:type="spellStart"/>
+      <w:r>
+        <w:rPr>
+          <w:rFonts w:ascii="Cambria" w:hAnsi="Cambria"/>
+          <w:b/>
+          <w:bCs/>
+        </w:rPr>
+        <w:t>hMAX</w:t>
+      </w:r>
+      <w:proofErr w:type="spellEnd"/>
       <w:r>
         <w:rPr>
           <w:rFonts w:ascii="Cambria" w:hAnsi="Cambria"/>
@@ -10580,7 +12233,35 @@
         <w:rPr>
           <w:rFonts w:ascii="Cambria" w:hAnsi="Cambria"/>
         </w:rPr>
-        <w:t xml:space="preserve">. Por el contrario, heurísticas como hADD, hFF y especialmente Landmark mostraron un rendimiento considerablemente mejor, obteniendo planes en tiempos muy reducidos. En todos los casos en los que se obtuvo solución, la </w:t>
+        <w:t xml:space="preserve">. Por el contrario, heurísticas como </w:t>
+      </w:r>
+      <w:proofErr w:type="spellStart"/>
+      <w:r>
+        <w:rPr>
+          <w:rFonts w:ascii="Cambria" w:hAnsi="Cambria"/>
+        </w:rPr>
+        <w:t>hADD</w:t>
+      </w:r>
+      <w:proofErr w:type="spellEnd"/>
+      <w:r>
+        <w:rPr>
+          <w:rFonts w:ascii="Cambria" w:hAnsi="Cambria"/>
+        </w:rPr>
+        <w:t xml:space="preserve">, </w:t>
+      </w:r>
+      <w:proofErr w:type="spellStart"/>
+      <w:r>
+        <w:rPr>
+          <w:rFonts w:ascii="Cambria" w:hAnsi="Cambria"/>
+        </w:rPr>
+        <w:t>hFF</w:t>
+      </w:r>
+      <w:proofErr w:type="spellEnd"/>
+      <w:r>
+        <w:rPr>
+          <w:rFonts w:ascii="Cambria" w:hAnsi="Cambria"/>
+        </w:rPr>
+        <w:t xml:space="preserve"> y especialmente Landmark mostraron un rendimiento considerablemente mejor, obteniendo planes en tiempos muy reducidos. En todos los casos en los que se obtuvo solución, la </w:t>
       </w:r>
       <w:r>
         <w:rPr>
@@ -10771,6 +12452,7 @@
         </w:rPr>
         <w:t xml:space="preserve"> completar la búsqueda dentro del límite de tiempo. Por su parte, A* con heurística </w:t>
       </w:r>
+      <w:proofErr w:type="spellStart"/>
       <w:r>
         <w:rPr>
           <w:rFonts w:ascii="Cambria" w:hAnsi="Cambria"/>
@@ -10779,12 +12461,14 @@
         </w:rPr>
         <w:t>hMAX</w:t>
       </w:r>
+      <w:proofErr w:type="spellEnd"/>
       <w:r>
         <w:rPr>
           <w:rFonts w:ascii="Cambria" w:hAnsi="Cambria"/>
         </w:rPr>
         <w:t xml:space="preserve"> encontró una solución </w:t>
       </w:r>
+      <w:proofErr w:type="gramStart"/>
       <w:r>
         <w:rPr>
           <w:rFonts w:ascii="Cambria" w:hAnsi="Cambria"/>
@@ -10793,6 +12477,7 @@
         </w:rPr>
         <w:t>correcta</w:t>
       </w:r>
+      <w:proofErr w:type="gramEnd"/>
       <w:r>
         <w:rPr>
           <w:rFonts w:ascii="Cambria" w:hAnsi="Cambria"/>
@@ -10841,6 +12526,7 @@
         </w:rPr>
         <w:t xml:space="preserve"> con </w:t>
       </w:r>
+      <w:proofErr w:type="spellStart"/>
       <w:r>
         <w:rPr>
           <w:rFonts w:ascii="Cambria" w:hAnsi="Cambria"/>
@@ -10849,6 +12535,7 @@
         </w:rPr>
         <w:t>lmcut</w:t>
       </w:r>
+      <w:proofErr w:type="spellEnd"/>
       <w:r>
         <w:rPr>
           <w:rFonts w:ascii="Cambria" w:hAnsi="Cambria"/>
@@ -10967,13 +12654,23 @@
         </w:rPr>
         <w:t xml:space="preserve">. Esto se debe a que el uso del </w:t>
       </w:r>
-      <w:r>
-        <w:rPr>
-          <w:rFonts w:ascii="Cambria" w:hAnsi="Cambria"/>
-          <w:b/>
-          <w:bCs/>
-        </w:rPr>
-        <w:t>carrier introduce</w:t>
+      <w:proofErr w:type="spellStart"/>
+      <w:r>
+        <w:rPr>
+          <w:rFonts w:ascii="Cambria" w:hAnsi="Cambria"/>
+          <w:b/>
+          <w:bCs/>
+        </w:rPr>
+        <w:t>carrier</w:t>
+      </w:r>
+      <w:proofErr w:type="spellEnd"/>
+      <w:r>
+        <w:rPr>
+          <w:rFonts w:ascii="Cambria" w:hAnsi="Cambria"/>
+          <w:b/>
+          <w:bCs/>
+        </w:rPr>
+        <w:t xml:space="preserve"> introduce</w:t>
       </w:r>
       <w:r>
         <w:rPr>
@@ -11021,7 +12718,21 @@
         <w:rPr>
           <w:rFonts w:ascii="Cambria" w:hAnsi="Cambria"/>
         </w:rPr>
-        <w:t xml:space="preserve"> total del plan. Dado que el planificador empleado no considera costes de acción diferenciados y se limita a minimizar el número de pasos, resulta más eficiente transportar las cajas directamente sin utilizar el transportador. Por tanto, aunque el dominio permite el uso de carriers, el </w:t>
+        <w:t xml:space="preserve"> total del plan. Dado que el planificador empleado no considera costes de acción diferenciados y se limita a minimizar el número de pasos, resulta más eficiente transportar las cajas directamente sin utilizar el transportador. Por tanto, aunque el dominio permite el uso de </w:t>
+      </w:r>
+      <w:proofErr w:type="spellStart"/>
+      <w:r>
+        <w:rPr>
+          <w:rFonts w:ascii="Cambria" w:hAnsi="Cambria"/>
+        </w:rPr>
+        <w:t>carriers</w:t>
+      </w:r>
+      <w:proofErr w:type="spellEnd"/>
+      <w:r>
+        <w:rPr>
+          <w:rFonts w:ascii="Cambria" w:hAnsi="Cambria"/>
+        </w:rPr>
+        <w:t xml:space="preserve">, el </w:t>
       </w:r>
       <w:r>
         <w:rPr>
@@ -11049,7 +12760,21 @@
         <w:rPr>
           <w:rFonts w:ascii="Cambria" w:hAnsi="Cambria"/>
         </w:rPr>
-        <w:t xml:space="preserve">En el nuevo modelo esta capacidad se sustituye por el uso del carrier, lo que modifica la estructura del espacio de estados y las posibles secuencias de acciones. Como consecuencia, los </w:t>
+        <w:t xml:space="preserve">En el nuevo modelo esta capacidad se sustituye por el uso del </w:t>
+      </w:r>
+      <w:proofErr w:type="spellStart"/>
+      <w:r>
+        <w:rPr>
+          <w:rFonts w:ascii="Cambria" w:hAnsi="Cambria"/>
+        </w:rPr>
+        <w:t>carrier</w:t>
+      </w:r>
+      <w:proofErr w:type="spellEnd"/>
+      <w:r>
+        <w:rPr>
+          <w:rFonts w:ascii="Cambria" w:hAnsi="Cambria"/>
+        </w:rPr>
+        <w:t xml:space="preserve">, lo que modifica la estructura del espacio de estados y las posibles secuencias de acciones. Como consecuencia, los </w:t>
       </w:r>
       <w:r>
         <w:rPr>
@@ -11297,6 +13022,511 @@
         </w:rPr>
       </w:pPr>
     </w:p>
+    <w:p>
+      <w:pPr>
+        <w:pStyle w:val="Ttulo3"/>
+        <w:jc w:val="center"/>
+        <w:rPr>
+          <w:rFonts w:ascii="Cambria" w:hAnsi="Cambria"/>
+        </w:rPr>
+      </w:pPr>
+      <w:r>
+        <w:rPr>
+          <w:rFonts w:ascii="Cambria" w:hAnsi="Cambria"/>
+        </w:rPr>
+        <w:t xml:space="preserve">Punto 1: </w:t>
+      </w:r>
+      <w:r>
+        <w:rPr>
+          <w:rFonts w:ascii="Cambria" w:hAnsi="Cambria"/>
+        </w:rPr>
+        <w:t>Añadir :</w:t>
+      </w:r>
+      <w:proofErr w:type="spellStart"/>
+      <w:r>
+        <w:rPr>
+          <w:rFonts w:ascii="Cambria" w:hAnsi="Cambria"/>
+        </w:rPr>
+        <w:t>action-costs</w:t>
+      </w:r>
+      <w:proofErr w:type="spellEnd"/>
+    </w:p>
+    <w:p>
+      <w:pPr>
+        <w:rPr>
+          <w:rFonts w:ascii="Cambria" w:hAnsi="Cambria"/>
+        </w:rPr>
+      </w:pPr>
+      <w:r>
+        <w:rPr>
+          <w:rFonts w:ascii="Cambria" w:hAnsi="Cambria"/>
+        </w:rPr>
+        <w:t>En este apartado se ha iniciado la extensión del dominio de planificación desarrollado en el ejercicio anterior con el objetivo de incorporar costes de acción, lo que permitirá modelar de forma más realista el problema del servicio de emergencias. Hasta este momento, el planificador únicamente consideraba la longitud del plan (número de acciones), sin distinguir entre acciones más o menos costosas, lo que podía dar lugar a soluciones poco eficientes desde el punto de vista operativo.</w:t>
+      </w:r>
+    </w:p>
+    <w:p>
+      <w:pPr>
+        <w:rPr>
+          <w:rFonts w:ascii="Cambria" w:hAnsi="Cambria"/>
+        </w:rPr>
+      </w:pPr>
+      <w:r>
+        <w:rPr>
+          <w:rFonts w:ascii="Cambria" w:hAnsi="Cambria"/>
+        </w:rPr>
+        <w:t>La primera modificación realizada ha consistido en añadir el requisito :</w:t>
+      </w:r>
+      <w:proofErr w:type="spellStart"/>
+      <w:r>
+        <w:rPr>
+          <w:rFonts w:ascii="Cambria" w:hAnsi="Cambria"/>
+        </w:rPr>
+        <w:t>action-costs</w:t>
+      </w:r>
+      <w:proofErr w:type="spellEnd"/>
+      <w:r>
+        <w:rPr>
+          <w:rFonts w:ascii="Cambria" w:hAnsi="Cambria"/>
+        </w:rPr>
+        <w:t xml:space="preserve"> en la sección :</w:t>
+      </w:r>
+      <w:proofErr w:type="spellStart"/>
+      <w:r>
+        <w:rPr>
+          <w:rFonts w:ascii="Cambria" w:hAnsi="Cambria"/>
+        </w:rPr>
+        <w:t>requirements</w:t>
+      </w:r>
+      <w:proofErr w:type="spellEnd"/>
+      <w:r>
+        <w:rPr>
+          <w:rFonts w:ascii="Cambria" w:hAnsi="Cambria"/>
+        </w:rPr>
+        <w:t xml:space="preserve"> del dominio. Este cambio es fundamental, ya que habilita el uso de planificación métrica en PDDL, permitiendo asociar un coste a cada acción y trabajar con funciones numéricas, en particular con la función especial total-</w:t>
+      </w:r>
+      <w:proofErr w:type="spellStart"/>
+      <w:r>
+        <w:rPr>
+          <w:rFonts w:ascii="Cambria" w:hAnsi="Cambria"/>
+        </w:rPr>
+        <w:t>cost</w:t>
+      </w:r>
+      <w:proofErr w:type="spellEnd"/>
+      <w:r>
+        <w:rPr>
+          <w:rFonts w:ascii="Cambria" w:hAnsi="Cambria"/>
+        </w:rPr>
+        <w:t>, que representa el coste acumulado del plan.</w:t>
+      </w:r>
+    </w:p>
+    <w:p>
+      <w:pPr>
+        <w:rPr>
+          <w:rFonts w:ascii="Cambria" w:hAnsi="Cambria"/>
+        </w:rPr>
+      </w:pPr>
+    </w:p>
+    <w:p>
+      <w:pPr>
+        <w:rPr>
+          <w:rFonts w:ascii="Cambria" w:hAnsi="Cambria"/>
+        </w:rPr>
+      </w:pPr>
+      <w:r>
+        <w:rPr>
+          <w:rFonts w:ascii="Cambria" w:hAnsi="Cambria"/>
+        </w:rPr>
+        <w:lastRenderedPageBreak/>
+        <w:t>Es importante destacar que esta modificación no altera el comportamiento de las acciones existentes ni la estructura del dominio en sí, sino que prepara el modelo para poder incorporar posteriormente efectos que incrementen el coste total. De este modo, se mantiene la compatibilidad con los ejercicios anteriores mientras se añade la capacidad de optimización.</w:t>
+      </w:r>
+    </w:p>
+    <w:p>
+      <w:pPr>
+        <w:rPr>
+          <w:rFonts w:ascii="Cambria" w:hAnsi="Cambria"/>
+        </w:rPr>
+      </w:pPr>
+      <w:r>
+        <w:rPr>
+          <w:rFonts w:ascii="Cambria" w:hAnsi="Cambria"/>
+        </w:rPr>
+        <w:t>La introducción de costes responde a la necesidad de guiar al planificador hacia soluciones más eficientes en términos de recursos, especialmente en lo relativo a los desplazamientos del dron. En el dominio anterior, volar largas distancias tenía el mismo “coste” que realizar acciones locales como coger o entregar cajas, lo que impedía reflejar adecuadamente la ventaja de utilizar transportadores para reducir viajes innecesarios.</w:t>
+      </w:r>
+    </w:p>
+    <w:p>
+      <w:pPr>
+        <w:pStyle w:val="Ttulo3"/>
+        <w:jc w:val="center"/>
+        <w:rPr>
+          <w:rFonts w:ascii="Cambria" w:hAnsi="Cambria"/>
+        </w:rPr>
+      </w:pPr>
+      <w:r>
+        <w:rPr>
+          <w:rFonts w:ascii="Cambria" w:hAnsi="Cambria"/>
+        </w:rPr>
+        <w:t xml:space="preserve">Punto 2: </w:t>
+      </w:r>
+      <w:r>
+        <w:rPr>
+          <w:rFonts w:ascii="Cambria" w:hAnsi="Cambria"/>
+        </w:rPr>
+        <w:t>Definir funciones de coste</w:t>
+      </w:r>
+    </w:p>
+    <w:p>
+      <w:r>
+        <w:t>En este apartado se ha ampliado el dominio mediante la incorporación de funciones numéricas que permiten modelar explícitamente el coste de las acciones. En concreto, se han definido dos funciones: total-</w:t>
+      </w:r>
+      <w:proofErr w:type="spellStart"/>
+      <w:r>
+        <w:t>cost</w:t>
+      </w:r>
+      <w:proofErr w:type="spellEnd"/>
+      <w:r>
+        <w:t xml:space="preserve"> y </w:t>
+      </w:r>
+      <w:proofErr w:type="spellStart"/>
+      <w:r>
+        <w:t>fly-cost</w:t>
+      </w:r>
+      <w:proofErr w:type="spellEnd"/>
+      <w:r>
+        <w:t>.</w:t>
+      </w:r>
+    </w:p>
+    <w:p>
+      <w:r>
+        <w:t>La función total-</w:t>
+      </w:r>
+      <w:proofErr w:type="spellStart"/>
+      <w:r>
+        <w:t>cost</w:t>
+      </w:r>
+      <w:proofErr w:type="spellEnd"/>
+      <w:r>
+        <w:t xml:space="preserve"> representa el coste total acumulado del plan y constituye el elemento central de la planificación con costes en PDDL. Esta función será modificada por las distintas acciones del dominio mediante efectos de incremento, permitiendo así evaluar la calidad de los planes generados en función de su coste total, en lugar de únicamente su longitud.</w:t>
+      </w:r>
+    </w:p>
+    <w:p>
+      <w:r>
+        <w:t xml:space="preserve">Por otro lado, se ha introducido la función </w:t>
+      </w:r>
+      <w:proofErr w:type="spellStart"/>
+      <w:r>
+        <w:t>fly-cost</w:t>
+      </w:r>
+      <w:proofErr w:type="spellEnd"/>
+      <w:r>
+        <w:t>, parametrizada por una localización de origen y otra de destino. Esta función permite asignar un coste específico a cada desplazamiento del dron, en función de la distancia entre ambas ubicaciones. A diferencia de total-</w:t>
+      </w:r>
+      <w:proofErr w:type="spellStart"/>
+      <w:r>
+        <w:t>cost</w:t>
+      </w:r>
+      <w:proofErr w:type="spellEnd"/>
+      <w:r>
+        <w:t xml:space="preserve">, cuyos valores se modifican dinámicamente durante la ejecución del plan, </w:t>
+      </w:r>
+      <w:proofErr w:type="spellStart"/>
+      <w:r>
+        <w:t>fly-cost</w:t>
+      </w:r>
+      <w:proofErr w:type="spellEnd"/>
+      <w:r>
+        <w:t xml:space="preserve"> se inicializa en el fichero de problema, lo que permite generar instancias con distintas distribuciones espaciales y costes asociados.</w:t>
+      </w:r>
+    </w:p>
+    <w:p>
+      <w:r>
+        <w:t xml:space="preserve">La separación entre ambas funciones resulta clave: mientras que </w:t>
+      </w:r>
+      <w:proofErr w:type="spellStart"/>
+      <w:r>
+        <w:t>fly-cost</w:t>
+      </w:r>
+      <w:proofErr w:type="spellEnd"/>
+      <w:r>
+        <w:t xml:space="preserve"> modela el coste individual de una acción concreta (volar entre dos puntos), total-</w:t>
+      </w:r>
+      <w:proofErr w:type="spellStart"/>
+      <w:r>
+        <w:t>cost</w:t>
+      </w:r>
+      <w:proofErr w:type="spellEnd"/>
+      <w:r>
+        <w:t xml:space="preserve"> actúa como acumulador global del coste del plan. Esta estructura facilita la posterior definición de acciones que incrementen el coste en función de la distancia recorrida, permitiendo así que el planificador tenga en cuenta la eficiencia de los desplazamientos.</w:t>
+      </w:r>
+    </w:p>
+    <w:p>
+      <w:pPr>
+        <w:pStyle w:val="Ttulo3"/>
+        <w:jc w:val="center"/>
+        <w:rPr>
+          <w:rFonts w:ascii="Cambria" w:hAnsi="Cambria"/>
+        </w:rPr>
+      </w:pPr>
+      <w:r>
+        <w:rPr>
+          <w:rFonts w:ascii="Cambria" w:hAnsi="Cambria"/>
+        </w:rPr>
+        <w:t xml:space="preserve">Punto </w:t>
+      </w:r>
+      <w:r>
+        <w:rPr>
+          <w:rFonts w:ascii="Cambria" w:hAnsi="Cambria"/>
+        </w:rPr>
+        <w:t>3</w:t>
+      </w:r>
+      <w:r>
+        <w:rPr>
+          <w:rFonts w:ascii="Cambria" w:hAnsi="Cambria"/>
+        </w:rPr>
+        <w:t xml:space="preserve">: </w:t>
+      </w:r>
+      <w:r>
+        <w:rPr>
+          <w:rFonts w:ascii="Cambria" w:hAnsi="Cambria"/>
+        </w:rPr>
+        <w:t>Incrementar el coste total</w:t>
+      </w:r>
+    </w:p>
+    <w:p>
+      <w:r>
+        <w:t>En este apartado se ha procedido a la incorporación de costes constantes a las acciones del dominio, con el objetivo de comenzar a modelar el coste total de los planes generados. En concreto, se han modificado aquellas acciones cuyo coste no depende de factores externos, como la distancia, asignándoles un incremento fijo sobre la función total-</w:t>
+      </w:r>
+      <w:proofErr w:type="spellStart"/>
+      <w:r>
+        <w:t>cost</w:t>
+      </w:r>
+      <w:proofErr w:type="spellEnd"/>
+      <w:r>
+        <w:t>.</w:t>
+      </w:r>
+    </w:p>
+    <w:p>
+      <w:r>
+        <w:t>Las acciones afectadas han sido todas aquellas que representan operaciones locales, como coger y dejar cajas, manipular el transportador o realizar entregas. En todos estos casos, se ha añadido el efecto (</w:t>
+      </w:r>
+      <w:proofErr w:type="spellStart"/>
+      <w:r>
+        <w:t>increase</w:t>
+      </w:r>
+      <w:proofErr w:type="spellEnd"/>
+      <w:r>
+        <w:t xml:space="preserve"> (total-</w:t>
+      </w:r>
+      <w:proofErr w:type="spellStart"/>
+      <w:r>
+        <w:t>cost</w:t>
+      </w:r>
+      <w:proofErr w:type="spellEnd"/>
+      <w:r>
+        <w:t>) 1), lo que implica que cada una de estas acciones contribuye de forma uniforme al coste total del plan. Esta decisión permite diferenciar estas acciones de las de desplazamiento, cuyo coste será tratado de forma específica en el siguiente apartado.</w:t>
+      </w:r>
+    </w:p>
+    <w:p>
+      <w:r>
+        <w:t>Por otro lado, las acciones de movimiento (</w:t>
+      </w:r>
+      <w:proofErr w:type="spellStart"/>
+      <w:r>
+        <w:t>fly</w:t>
+      </w:r>
+      <w:proofErr w:type="spellEnd"/>
+      <w:r>
+        <w:t xml:space="preserve"> y </w:t>
+      </w:r>
+      <w:proofErr w:type="spellStart"/>
+      <w:r>
+        <w:t>fly</w:t>
+      </w:r>
+      <w:proofErr w:type="spellEnd"/>
+      <w:r>
+        <w:t>-and-</w:t>
+      </w:r>
+      <w:proofErr w:type="spellStart"/>
+      <w:r>
+        <w:t>move</w:t>
+      </w:r>
+      <w:proofErr w:type="spellEnd"/>
+      <w:r>
+        <w:t>-</w:t>
+      </w:r>
+      <w:proofErr w:type="spellStart"/>
+      <w:r>
+        <w:t>carrier</w:t>
+      </w:r>
+      <w:proofErr w:type="spellEnd"/>
+      <w:r>
+        <w:t xml:space="preserve">) no han sido modificadas en este punto. Esto se debe a que su coste no es constante, sino que depende de la distancia entre localizaciones, información que se modelará mediante la función </w:t>
+      </w:r>
+      <w:proofErr w:type="spellStart"/>
+      <w:r>
+        <w:t>fly-cost</w:t>
+      </w:r>
+      <w:proofErr w:type="spellEnd"/>
+      <w:r>
+        <w:t xml:space="preserve"> en el siguiente </w:t>
+      </w:r>
+      <w:r>
+        <w:lastRenderedPageBreak/>
+        <w:t>paso. Mantener estas acciones sin coste en este punto permite separar claramente ambas contribuciones al coste total.</w:t>
+      </w:r>
+    </w:p>
+    <w:p>
+      <w:r>
+        <w:t>La introducción de estos costes constantes tiene como efecto inmediato que el planificador ya no solo minimiza el número de acciones, sino que comienza a tener en cuenta el coste acumulado del plan. Aunque en este punto todos los costes son homogéneos, esta base resulta necesaria para poder incorporar posteriormente costes más realistas asociados a los desplazamientos.</w:t>
+      </w:r>
+    </w:p>
+    <w:p>
+      <w:pPr>
+        <w:pStyle w:val="Ttulo3"/>
+        <w:jc w:val="center"/>
+        <w:rPr>
+          <w:rFonts w:ascii="Cambria" w:hAnsi="Cambria"/>
+        </w:rPr>
+      </w:pPr>
+      <w:r>
+        <w:rPr>
+          <w:rFonts w:ascii="Cambria" w:hAnsi="Cambria"/>
+        </w:rPr>
+        <w:t xml:space="preserve">Punto </w:t>
+      </w:r>
+      <w:r>
+        <w:rPr>
+          <w:rFonts w:ascii="Cambria" w:hAnsi="Cambria"/>
+        </w:rPr>
+        <w:t>4</w:t>
+      </w:r>
+      <w:r>
+        <w:rPr>
+          <w:rFonts w:ascii="Cambria" w:hAnsi="Cambria"/>
+        </w:rPr>
+        <w:t xml:space="preserve">: </w:t>
+      </w:r>
+      <w:r>
+        <w:rPr>
+          <w:rFonts w:ascii="Cambria" w:hAnsi="Cambria"/>
+        </w:rPr>
+        <w:t>E</w:t>
+      </w:r>
+      <w:r>
+        <w:rPr>
+          <w:rFonts w:ascii="Cambria" w:hAnsi="Cambria"/>
+        </w:rPr>
+        <w:t>fecto que incremente el coste total</w:t>
+      </w:r>
+      <w:r>
+        <w:rPr>
+          <w:rFonts w:ascii="Cambria" w:hAnsi="Cambria"/>
+        </w:rPr>
+        <w:t xml:space="preserve"> en base a los vuelos.</w:t>
+      </w:r>
+    </w:p>
+    <w:p>
+      <w:r>
+        <w:t xml:space="preserve">En este apartado se ha completado la incorporación de costes al dominio mediante la asignación de costes variables a las acciones de movimiento del dron. A diferencia de las acciones locales, cuyo coste es constante, el coste de volar depende de la distancia entre la localización de origen y la de destino, lo que se ha modelado mediante la función </w:t>
+      </w:r>
+      <w:proofErr w:type="spellStart"/>
+      <w:r>
+        <w:t>fly-cost</w:t>
+      </w:r>
+      <w:proofErr w:type="spellEnd"/>
+      <w:r>
+        <w:t>.</w:t>
+      </w:r>
+    </w:p>
+    <w:p>
+      <w:r>
+        <w:t xml:space="preserve">Para ello, se han modificado las acciones </w:t>
+      </w:r>
+      <w:proofErr w:type="spellStart"/>
+      <w:r>
+        <w:t>fly</w:t>
+      </w:r>
+      <w:proofErr w:type="spellEnd"/>
+      <w:r>
+        <w:t xml:space="preserve"> y </w:t>
+      </w:r>
+      <w:proofErr w:type="spellStart"/>
+      <w:r>
+        <w:t>fly</w:t>
+      </w:r>
+      <w:proofErr w:type="spellEnd"/>
+      <w:r>
+        <w:t>-and-</w:t>
+      </w:r>
+      <w:proofErr w:type="spellStart"/>
+      <w:r>
+        <w:t>move</w:t>
+      </w:r>
+      <w:proofErr w:type="spellEnd"/>
+      <w:r>
+        <w:t>-</w:t>
+      </w:r>
+      <w:proofErr w:type="spellStart"/>
+      <w:r>
+        <w:t>carrier</w:t>
+      </w:r>
+      <w:proofErr w:type="spellEnd"/>
+      <w:r>
+        <w:t>, añadiendo un efecto de incremento del coste total de la forma (</w:t>
+      </w:r>
+      <w:proofErr w:type="spellStart"/>
+      <w:r>
+        <w:t>increase</w:t>
+      </w:r>
+      <w:proofErr w:type="spellEnd"/>
+      <w:r>
+        <w:t xml:space="preserve"> (total-</w:t>
+      </w:r>
+      <w:proofErr w:type="spellStart"/>
+      <w:r>
+        <w:t>cost</w:t>
+      </w:r>
+      <w:proofErr w:type="spellEnd"/>
+      <w:r>
+        <w:t>) (</w:t>
+      </w:r>
+      <w:proofErr w:type="spellStart"/>
+      <w:proofErr w:type="gramStart"/>
+      <w:r>
+        <w:t>fly-cost</w:t>
+      </w:r>
+      <w:proofErr w:type="spellEnd"/>
+      <w:r>
+        <w:t xml:space="preserve"> ?</w:t>
+      </w:r>
+      <w:proofErr w:type="spellStart"/>
+      <w:proofErr w:type="gramEnd"/>
+      <w:r>
+        <w:t>from</w:t>
+      </w:r>
+      <w:proofErr w:type="spellEnd"/>
+      <w:r>
+        <w:t xml:space="preserve"> ?</w:t>
+      </w:r>
+      <w:proofErr w:type="spellStart"/>
+      <w:r>
+        <w:t>to</w:t>
+      </w:r>
+      <w:proofErr w:type="spellEnd"/>
+      <w:r>
+        <w:t>)). De este modo, cada desplazamiento del dron contribuye al coste total del plan en función de la distancia recorrida, información que se define en el fichero de problema.</w:t>
+      </w:r>
+    </w:p>
+    <w:p>
+      <w:r>
+        <w:t>Esta modificación resulta fundamental para reflejar de forma realista el dominio, ya que introduce una diferencia significativa entre acciones locales y acciones de desplazamiento. Mientras que operaciones como recoger, cargar o entregar cajas tienen un coste bajo y constante, los movimientos entre localizaciones pueden resultar mucho más costosos, especialmente cuando se trata de distancias largas.</w:t>
+      </w:r>
+    </w:p>
+    <w:p>
+      <w:r>
+        <w:t>Como consecuencia, el planificador ya no se limita a minimizar el número de acciones, sino que pasa a optimizar el coste total del plan. Esto favorece estrategias más eficientes, como el uso de transportadores para agrupar varias entregas en un único viaje, reduciendo así el número de desplazamientos necesarios. Aunque este tipo de planes puede implicar un mayor número de acciones, su coste total será menor, lo que los convierte en soluciones preferibles desde el punto de vista del modelo.</w:t>
+      </w:r>
+    </w:p>
+    <w:p/>
     <w:sectPr>
       <w:pgSz w:w="11906" w:h="16838"/>
       <w:pgMar w:top="1417" w:right="1701" w:bottom="1417" w:left="1701" w:header="708" w:footer="708" w:gutter="0"/>
@@ -11314,7 +13544,7 @@
 </file>
 
 <file path=word/numbering.xml><?xml version="1.0" encoding="utf-8"?>
-<w:numbering xmlns:wpc="http://schemas.microsoft.com/office/word/2010/wordprocessingCanvas" xmlns:cx="http://schemas.microsoft.com/office/drawing/2014/chartex" xmlns:cx1="http://schemas.microsoft.com/office/drawing/2015/9/8/chartex" xmlns:cx2="http://schemas.microsoft.com/office/drawing/2015/10/21/chartex" xmlns:cx3="http://schemas.microsoft.com/office/drawing/2016/5/9/chartex" xmlns:cx4="http://schemas.microsoft.com/office/drawing/2016/5/10/chartex" xmlns:cx5="http://schemas.microsoft.com/office/drawing/2016/5/11/chartex" xmlns:cx6="http://schemas.microsoft.com/office/drawing/2016/5/12/chartex" xmlns:cx7="http://schemas.microsoft.com/office/drawing/2016/5/13/chartex" xmlns:cx8="http://schemas.microsoft.com/office/drawing/2016/5/14/chartex" xmlns:mc="http://schemas.openxmlformats.org/markup-compatibility/2006" xmlns:aink="http://schemas.microsoft.com/office/drawing/2016/ink" xmlns:am3d="http://schemas.microsoft.com/office/drawing/2017/model3d" xmlns:o="urn:schemas-microsoft-com:office:office" xmlns:oel="http://schemas.microsoft.com/office/2019/extlst" xmlns:r="http://schemas.openxmlformats.org/officeDocument/2006/relationships" xmlns:m="http://schemas.openxmlformats.org/officeDocument/2006/math" xmlns:v="urn:schemas-microsoft-com:vml" xmlns:wp14="http://schemas.microsoft.com/office/word/2010/wordprocessingDrawing" xmlns:wp="http://schemas.openxmlformats.org/drawingml/2006/wordprocessingDrawing" xmlns:w10="urn:schemas-microsoft-com:office:word" xmlns:w="http://schemas.openxmlformats.org/wordprocessingml/2006/main" xmlns:w14="http://schemas.microsoft.com/office/word/2010/wordml" xmlns:w15="http://schemas.microsoft.com/office/word/2012/wordml" xmlns:w16cex="http://schemas.microsoft.com/office/word/2018/wordml/cex" xmlns:w16cid="http://schemas.microsoft.com/office/word/2016/wordml/cid" xmlns:w16="http://schemas.microsoft.com/office/word/2018/wordml" xmlns:w16sdtdh="http://schemas.microsoft.com/office/word/2020/wordml/sdtdatahash" xmlns:w16se="http://schemas.microsoft.com/office/word/2015/wordml/symex" xmlns:wpg="http://schemas.microsoft.com/office/word/2010/wordprocessingGroup" xmlns:wpi="http://schemas.microsoft.com/office/word/2010/wordprocessingInk" xmlns:wne="http://schemas.microsoft.com/office/word/2006/wordml" xmlns:wps="http://schemas.microsoft.com/office/word/2010/wordprocessingShape" mc:Ignorable="w14 w15 w16se w16cid w16 w16cex w16sdtdh wp14">
+<w:numbering xmlns:wpc="http://schemas.microsoft.com/office/word/2010/wordprocessingCanvas" xmlns:cx="http://schemas.microsoft.com/office/drawing/2014/chartex" xmlns:cx1="http://schemas.microsoft.com/office/drawing/2015/9/8/chartex" xmlns:cx2="http://schemas.microsoft.com/office/drawing/2015/10/21/chartex" xmlns:cx3="http://schemas.microsoft.com/office/drawing/2016/5/9/chartex" xmlns:cx4="http://schemas.microsoft.com/office/drawing/2016/5/10/chartex" xmlns:cx5="http://schemas.microsoft.com/office/drawing/2016/5/11/chartex" xmlns:cx6="http://schemas.microsoft.com/office/drawing/2016/5/12/chartex" xmlns:cx7="http://schemas.microsoft.com/office/drawing/2016/5/13/chartex" xmlns:cx8="http://schemas.microsoft.com/office/drawing/2016/5/14/chartex" xmlns:mc="http://schemas.openxmlformats.org/markup-compatibility/2006" xmlns:aink="http://schemas.microsoft.com/office/drawing/2016/ink" xmlns:am3d="http://schemas.microsoft.com/office/drawing/2017/model3d" xmlns:o="urn:schemas-microsoft-com:office:office" xmlns:oel="http://schemas.microsoft.com/office/2019/extlst" xmlns:r="http://schemas.openxmlformats.org/officeDocument/2006/relationships" xmlns:m="http://schemas.openxmlformats.org/officeDocument/2006/math" xmlns:v="urn:schemas-microsoft-com:vml" xmlns:wp14="http://schemas.microsoft.com/office/word/2010/wordprocessingDrawing" xmlns:wp="http://schemas.openxmlformats.org/drawingml/2006/wordprocessingDrawing" xmlns:w10="urn:schemas-microsoft-com:office:word" xmlns:w="http://schemas.openxmlformats.org/wordprocessingml/2006/main" xmlns:w14="http://schemas.microsoft.com/office/word/2010/wordml" xmlns:w15="http://schemas.microsoft.com/office/word/2012/wordml" xmlns:w16cex="http://schemas.microsoft.com/office/word/2018/wordml/cex" xmlns:w16cid="http://schemas.microsoft.com/office/word/2016/wordml/cid" xmlns:w16="http://schemas.microsoft.com/office/word/2018/wordml" xmlns:w16du="http://schemas.microsoft.com/office/word/2023/wordml/word16du" xmlns:w16sdtdh="http://schemas.microsoft.com/office/word/2020/wordml/sdtdatahash" xmlns:w16sdtfl="http://schemas.microsoft.com/office/word/2024/wordml/sdtformatlock" xmlns:w16se="http://schemas.microsoft.com/office/word/2015/wordml/symex" xmlns:wpg="http://schemas.microsoft.com/office/word/2010/wordprocessingGroup" xmlns:wpi="http://schemas.microsoft.com/office/word/2010/wordprocessingInk" xmlns:wne="http://schemas.microsoft.com/office/word/2006/wordml" xmlns:wps="http://schemas.microsoft.com/office/word/2010/wordprocessingShape" mc:Ignorable="w14 w15 w16se w16cid w16 w16cex w16sdtdh w16sdtfl w16du wp14">
   <w:abstractNum w:abstractNumId="0" w15:restartNumberingAfterBreak="0">
     <w:nsid w:val="056B05C5"/>
     <w:multiLevelType w:val="multilevel"/>
@@ -14135,7 +16365,7 @@
 </file>
 
 <file path=word/styles.xml><?xml version="1.0" encoding="utf-8"?>
-<w:styles xmlns:mc="http://schemas.openxmlformats.org/markup-compatibility/2006" xmlns:r="http://schemas.openxmlformats.org/officeDocument/2006/relationships" xmlns:w="http://schemas.openxmlformats.org/wordprocessingml/2006/main" xmlns:w14="http://schemas.microsoft.com/office/word/2010/wordml" xmlns:w15="http://schemas.microsoft.com/office/word/2012/wordml" xmlns:w16cex="http://schemas.microsoft.com/office/word/2018/wordml/cex" xmlns:w16cid="http://schemas.microsoft.com/office/word/2016/wordml/cid" xmlns:w16="http://schemas.microsoft.com/office/word/2018/wordml" xmlns:w16sdtdh="http://schemas.microsoft.com/office/word/2020/wordml/sdtdatahash" xmlns:w16se="http://schemas.microsoft.com/office/word/2015/wordml/symex" mc:Ignorable="w14 w15 w16se w16cid w16 w16cex w16sdtdh">
+<w:styles xmlns:mc="http://schemas.openxmlformats.org/markup-compatibility/2006" xmlns:r="http://schemas.openxmlformats.org/officeDocument/2006/relationships" xmlns:w="http://schemas.openxmlformats.org/wordprocessingml/2006/main" xmlns:w14="http://schemas.microsoft.com/office/word/2010/wordml" xmlns:w15="http://schemas.microsoft.com/office/word/2012/wordml" xmlns:w16cex="http://schemas.microsoft.com/office/word/2018/wordml/cex" xmlns:w16cid="http://schemas.microsoft.com/office/word/2016/wordml/cid" xmlns:w16="http://schemas.microsoft.com/office/word/2018/wordml" xmlns:w16du="http://schemas.microsoft.com/office/word/2023/wordml/word16du" xmlns:w16sdtdh="http://schemas.microsoft.com/office/word/2020/wordml/sdtdatahash" xmlns:w16sdtfl="http://schemas.microsoft.com/office/word/2024/wordml/sdtformatlock" xmlns:w16se="http://schemas.microsoft.com/office/word/2015/wordml/symex" mc:Ignorable="w14 w15 w16se w16cid w16 w16cex w16sdtdh w16sdtfl w16du">
   <w:docDefaults>
     <w:rPrDefault>
       <w:rPr>
@@ -14736,7 +16966,6 @@
   <w:style w:type="character" w:default="1" w:styleId="Fuentedeprrafopredeter">
     <w:name w:val="Default Paragraph Font"/>
     <w:uiPriority w:val="1"/>
-    <w:semiHidden/>
     <w:unhideWhenUsed/>
   </w:style>
   <w:style w:type="table" w:default="1" w:styleId="Tablanormal">

</xml_diff>